<commit_message>
Removing digester fertilizer and manure hauling since it now has a costing function
</commit_message>
<xml_diff>
--- a/_RuFaS Input Files/_Data Dictionary.docx
+++ b/_RuFaS Input Files/_Data Dictionary.docx
@@ -18,7 +18,27 @@
           <w:sz w:val="28"/>
           <w:szCs w:val="28"/>
         </w:rPr>
-        <w:t>Data Dictionary for RuFaS Economic Module Inputs</w:t>
+        <w:t xml:space="preserve">Data Dictionary for </w:t>
+      </w:r>
+      <w:proofErr w:type="spellStart"/>
+      <w:r>
+        <w:rPr>
+          <w:b/>
+          <w:bCs/>
+          <w:sz w:val="28"/>
+          <w:szCs w:val="28"/>
+        </w:rPr>
+        <w:t>RuFaS</w:t>
+      </w:r>
+      <w:proofErr w:type="spellEnd"/>
+      <w:r>
+        <w:rPr>
+          <w:b/>
+          <w:bCs/>
+          <w:sz w:val="28"/>
+          <w:szCs w:val="28"/>
+        </w:rPr>
+        <w:t xml:space="preserve"> Economic Module Inputs</w:t>
       </w:r>
     </w:p>
     <w:p>
@@ -28,12 +48,21 @@
           <w:iCs/>
         </w:rPr>
       </w:pPr>
+      <w:proofErr w:type="spellStart"/>
       <w:r>
         <w:rPr>
           <w:i/>
           <w:iCs/>
         </w:rPr>
-        <w:t xml:space="preserve">RuFaS Units: </w:t>
+        <w:t>RuFaS</w:t>
+      </w:r>
+      <w:proofErr w:type="spellEnd"/>
+      <w:r>
+        <w:rPr>
+          <w:i/>
+          <w:iCs/>
+        </w:rPr>
+        <w:t xml:space="preserve"> Units: </w:t>
       </w:r>
       <w:hyperlink r:id="rId5" w:anchor="L8" w:history="1">
         <w:r>
@@ -43,25 +72,7 @@
             <w:iCs/>
             <w:color w:val="auto"/>
           </w:rPr>
-          <w:t>https://github.co</w:t>
-        </w:r>
-        <w:r>
-          <w:rPr>
-            <w:rStyle w:val="Hyperlink"/>
-            <w:i/>
-            <w:iCs/>
-            <w:color w:val="auto"/>
-          </w:rPr>
-          <w:t>m</w:t>
-        </w:r>
-        <w:r>
-          <w:rPr>
-            <w:rStyle w:val="Hyperlink"/>
-            <w:i/>
-            <w:iCs/>
-            <w:color w:val="auto"/>
-          </w:rPr>
-          <w:t>/RuminantFarmSystems/MASM/blob/c9ad0e33655c3e7429cefbe9fabc551b55b3ee7f/RUFAS/units.py#L8</w:t>
+          <w:t>https://github.com/RuminantFarmSystems/MASM/blob/c9ad0e33655c3e7429cefbe9fabc551b55b3ee7f/RUFAS/units.py#L8</w:t>
         </w:r>
       </w:hyperlink>
       <w:r>
@@ -1175,7 +1186,7 @@
         </w:numPr>
       </w:pPr>
       <w:r>
-        <w:t>commodity_prices.digester_fertilizer_coproduct.dollars_per_kg_nitrogen.csv</w:t>
+        <w:t>commodity_prices.digester_bedding_coproduct.dollars_per_kg_bedding.csv</w:t>
       </w:r>
     </w:p>
     <w:p>
@@ -1187,7 +1198,7 @@
         </w:numPr>
       </w:pPr>
       <w:r>
-        <w:t>commodity_prices.digester_fertilizer_coproduct.dollars_per_kg_phosphorus.csv</w:t>
+        <w:t>commodity_prices.digester_carbon_credits.dollar_per_tonne_CO2e.csv</w:t>
       </w:r>
     </w:p>
     <w:p>
@@ -1199,7 +1210,7 @@
         </w:numPr>
       </w:pPr>
       <w:r>
-        <w:t>commodity_prices.digester_bedding_coproduct.dollars_per_kg_bedding.csv</w:t>
+        <w:t>farm_services.tractor_small.dollar_per_hour.csv</w:t>
       </w:r>
     </w:p>
     <w:p>
@@ -1211,7 +1222,7 @@
         </w:numPr>
       </w:pPr>
       <w:r>
-        <w:t>commodity_prices.digester_carbon_credits.dollar_per_tonne_CO2e.csv</w:t>
+        <w:t>farm_services.tractor_medium.dollar_per_hour.csv</w:t>
       </w:r>
     </w:p>
     <w:p>
@@ -1223,7 +1234,7 @@
         </w:numPr>
       </w:pPr>
       <w:r>
-        <w:t>farm_services.tractor_small.dollar_per_hour.csv</w:t>
+        <w:t>farm_services.tractor_large.dollar_per_hour.csv</w:t>
       </w:r>
     </w:p>
     <w:p>
@@ -1235,7 +1246,7 @@
         </w:numPr>
       </w:pPr>
       <w:r>
-        <w:t>farm_services.tractor_medium.dollar_per_hour.csv</w:t>
+        <w:t>farm_services.land_ha_rent.dollar_per_hectare.csv</w:t>
       </w:r>
     </w:p>
     <w:p>
@@ -1247,7 +1258,7 @@
         </w:numPr>
       </w:pPr>
       <w:r>
-        <w:t>farm_services.tractor_large.dollar_per_hour.csv</w:t>
+        <w:t>farm_services.labor_hours.dollar_per_hour.csv</w:t>
       </w:r>
     </w:p>
     <w:p>
@@ -1259,7 +1270,7 @@
         </w:numPr>
       </w:pPr>
       <w:r>
-        <w:t>farm_services.land_ha_rent.dollar_per_hectare.csv</w:t>
+        <w:t>farm_services.grain_transportation.dollars_per_tonne_km.csv</w:t>
       </w:r>
     </w:p>
     <w:p>
@@ -1271,7 +1282,7 @@
         </w:numPr>
       </w:pPr>
       <w:r>
-        <w:t>farm_services.labor_hours.dollar_per_hour.csv</w:t>
+        <w:t>capital_costs.land_ha.dollar_per_hectare.csv</w:t>
       </w:r>
     </w:p>
     <w:p>
@@ -1283,7 +1294,7 @@
         </w:numPr>
       </w:pPr>
       <w:r>
-        <w:t>farm_services.grain_transportation.dollars_per_tonne_km.csv</w:t>
+        <w:t>farm_services.labor_hours_crop.hours_per_ha_per_year.csv</w:t>
       </w:r>
     </w:p>
     <w:p>
@@ -1295,7 +1306,7 @@
         </w:numPr>
       </w:pPr>
       <w:r>
-        <w:t>farm_services.manure_hauling.dollars_per_tonne_km.csv</w:t>
+        <w:t>farm_services.labor_hours_animal_total.hours_per_head_per_year.csv</w:t>
       </w:r>
     </w:p>
     <w:p>
@@ -1307,7 +1318,7 @@
         </w:numPr>
       </w:pPr>
       <w:r>
-        <w:t>capital_costs.land_ha.dollar_per_hectare.csv</w:t>
+        <w:t>farm_services.labor_hours_animal_manure.hours_per_head_per_year.csv</w:t>
       </w:r>
     </w:p>
     <w:p>
@@ -1320,42 +1331,6 @@
       </w:pPr>
       <w:r>
         <w:lastRenderedPageBreak/>
-        <w:t>farm_services.labor_hours_crop.hours_per_ha_per_year.csv</w:t>
-      </w:r>
-    </w:p>
-    <w:p>
-      <w:pPr>
-        <w:pStyle w:val="ListParagraph"/>
-        <w:numPr>
-          <w:ilvl w:val="0"/>
-          <w:numId w:val="6"/>
-        </w:numPr>
-      </w:pPr>
-      <w:r>
-        <w:t>farm_services.labor_hours_animal_total.hours_per_head_per_year.csv</w:t>
-      </w:r>
-    </w:p>
-    <w:p>
-      <w:pPr>
-        <w:pStyle w:val="ListParagraph"/>
-        <w:numPr>
-          <w:ilvl w:val="0"/>
-          <w:numId w:val="6"/>
-        </w:numPr>
-      </w:pPr>
-      <w:r>
-        <w:t>farm_services.labor_hours_animal_manure.hours_per_head_per_year.csv</w:t>
-      </w:r>
-    </w:p>
-    <w:p>
-      <w:pPr>
-        <w:pStyle w:val="ListParagraph"/>
-        <w:numPr>
-          <w:ilvl w:val="0"/>
-          <w:numId w:val="6"/>
-        </w:numPr>
-      </w:pPr>
-      <w:r>
         <w:t>farm_services.labor_hours_animal_nonmanure.hours_per_head_per_year.csv</w:t>
       </w:r>
     </w:p>
@@ -1369,7 +1344,15 @@
         <w:t xml:space="preserve">The data included in this data dictionary includes the </w:t>
       </w:r>
       <w:r>
-        <w:t xml:space="preserve">input data used for the RuFaS Economic Module developed by Sustainability Science. </w:t>
+        <w:t xml:space="preserve">input data used for the </w:t>
+      </w:r>
+      <w:proofErr w:type="spellStart"/>
+      <w:r>
+        <w:t>RuFaS</w:t>
+      </w:r>
+      <w:proofErr w:type="spellEnd"/>
+      <w:r>
+        <w:t xml:space="preserve"> Economic Module developed by Sustainability Science. </w:t>
       </w:r>
       <w:r>
         <w:t xml:space="preserve"> </w:t>
@@ -1381,25 +1364,109 @@
         <w:t xml:space="preserve"> </w:t>
       </w:r>
       <w:r>
-        <w:t>All csv input files use the following format {data type}</w:t>
+        <w:t>All csv input files use the following format {data type</w:t>
+      </w:r>
+      <w:proofErr w:type="gramStart"/>
+      <w:r>
+        <w:t>}</w:t>
       </w:r>
       <w:r>
         <w:t>.</w:t>
       </w:r>
       <w:r>
+        <w:t>{</w:t>
+      </w:r>
+      <w:proofErr w:type="gramEnd"/>
+      <w:r>
+        <w:t xml:space="preserve">data </w:t>
+      </w:r>
+      <w:r>
+        <w:t>variable</w:t>
+      </w:r>
+      <w:proofErr w:type="gramStart"/>
+      <w:r>
+        <w:t>}</w:t>
+      </w:r>
+      <w:r>
+        <w:t>.</w:t>
+      </w:r>
+      <w:r>
+        <w:t>{</w:t>
+      </w:r>
+      <w:proofErr w:type="gramEnd"/>
+      <w:r>
+        <w:t>units}.csv</w:t>
+      </w:r>
+    </w:p>
+    <w:p>
+      <w:pPr>
+        <w:pStyle w:val="ListParagraph"/>
+        <w:numPr>
+          <w:ilvl w:val="0"/>
+          <w:numId w:val="7"/>
+        </w:numPr>
+      </w:pPr>
+      <w:r>
+        <w:t>{data type} represents the primary data category (</w:t>
+      </w:r>
+      <w:proofErr w:type="spellStart"/>
+      <w:r>
+        <w:t>commodity_prices</w:t>
+      </w:r>
+      <w:proofErr w:type="spellEnd"/>
+      <w:r>
+        <w:t xml:space="preserve">, </w:t>
+      </w:r>
+      <w:proofErr w:type="spellStart"/>
+      <w:r>
+        <w:t>farm_services</w:t>
+      </w:r>
+      <w:proofErr w:type="spellEnd"/>
+      <w:r>
+        <w:t>, etc.)</w:t>
+      </w:r>
+    </w:p>
+    <w:p>
+      <w:pPr>
+        <w:pStyle w:val="ListParagraph"/>
+        <w:numPr>
+          <w:ilvl w:val="0"/>
+          <w:numId w:val="7"/>
+        </w:numPr>
+      </w:pPr>
+      <w:r>
         <w:t xml:space="preserve">{data </w:t>
       </w:r>
+      <w:proofErr w:type="gramStart"/>
+      <w:r>
+        <w:t xml:space="preserve">variable </w:t>
+      </w:r>
+      <w:r>
+        <w:t>}</w:t>
+      </w:r>
+      <w:proofErr w:type="gramEnd"/>
+      <w:r>
+        <w:t xml:space="preserve"> represents the </w:t>
+      </w:r>
       <w:r>
         <w:t>variable</w:t>
       </w:r>
       <w:r>
-        <w:t>}</w:t>
-      </w:r>
-      <w:r>
-        <w:t>.</w:t>
-      </w:r>
-      <w:r>
-        <w:t>{units}.csv</w:t>
+        <w:t xml:space="preserve"> that the data falls into or the specific name of the input represented (</w:t>
+      </w:r>
+      <w:r>
+        <w:t xml:space="preserve">diesel, </w:t>
+      </w:r>
+      <w:proofErr w:type="spellStart"/>
+      <w:r>
+        <w:t>elec_commerical</w:t>
+      </w:r>
+      <w:proofErr w:type="spellEnd"/>
+      <w:r>
+        <w:t>, milk</w:t>
+      </w:r>
+      <w:r>
+        <w:t>, etc.)</w:t>
       </w:r>
     </w:p>
     <w:p>
@@ -1411,61 +1478,29 @@
         </w:numPr>
       </w:pPr>
       <w:r>
-        <w:t>{data type} represents the primary data category (</w:t>
-      </w:r>
-      <w:r>
-        <w:t>commodity_prices, farm_services</w:t>
-      </w:r>
-      <w:r>
-        <w:t>, etc.)</w:t>
-      </w:r>
-    </w:p>
-    <w:p>
-      <w:pPr>
-        <w:pStyle w:val="ListParagraph"/>
-        <w:numPr>
-          <w:ilvl w:val="0"/>
-          <w:numId w:val="7"/>
-        </w:numPr>
-      </w:pPr>
-      <w:r>
-        <w:t xml:space="preserve">{data </w:t>
-      </w:r>
-      <w:r>
-        <w:t xml:space="preserve">variable </w:t>
-      </w:r>
-      <w:r>
-        <w:t xml:space="preserve">} represents the </w:t>
-      </w:r>
-      <w:r>
-        <w:t>variable</w:t>
-      </w:r>
-      <w:r>
-        <w:t xml:space="preserve"> that the data falls into or the specific name of the input represented (</w:t>
-      </w:r>
-      <w:r>
-        <w:t>diesel, elec_commerical, milk</w:t>
-      </w:r>
-      <w:r>
-        <w:t>, etc.)</w:t>
-      </w:r>
-    </w:p>
-    <w:p>
-      <w:pPr>
-        <w:pStyle w:val="ListParagraph"/>
-        <w:numPr>
-          <w:ilvl w:val="0"/>
-          <w:numId w:val="7"/>
-        </w:numPr>
-      </w:pPr>
-      <w:r>
         <w:t>{units} represents the units used for the data. Typically, US dollar per functional unit for the data type.</w:t>
       </w:r>
     </w:p>
     <w:p/>
     <w:p>
       <w:r>
-        <w:t>Each input file follows the same format. The first column “fips” represents the Federal Information Processing Standard code which is a numeric code that uniquely identifies individual counties in the United States. The first row (fips = 01) is used to represent the U.S. mean value. Subsequent columns represent the years which the data represents (“2021” contains the prices for each county in the year 2021)</w:t>
+        <w:t>Each input file follows the same format. The first column “</w:t>
+      </w:r>
+      <w:proofErr w:type="spellStart"/>
+      <w:r>
+        <w:t>fips</w:t>
+      </w:r>
+      <w:proofErr w:type="spellEnd"/>
+      <w:r>
+        <w:t>” represents the Federal Information Processing Standard code which is a numeric code that uniquely identifies individual counties in the United States. The first row (</w:t>
+      </w:r>
+      <w:proofErr w:type="spellStart"/>
+      <w:r>
+        <w:t>fips</w:t>
+      </w:r>
+      <w:proofErr w:type="spellEnd"/>
+      <w:r>
+        <w:t xml:space="preserve"> = 01) is used to represent the U.S. mean value. Subsequent columns represent the years which the data represents (“2021” contains the prices for each county in the year 2021)</w:t>
       </w:r>
       <w:r>
         <w:t>.</w:t>
@@ -1603,7 +1638,23 @@
             <w:rStyle w:val="Hyperlink"/>
             <w:color w:val="auto"/>
           </w:rPr>
-          <w:t>National Agricultural Statistics Service Quickstats web portal</w:t>
+          <w:t xml:space="preserve">National Agricultural Statistics Service </w:t>
+        </w:r>
+        <w:proofErr w:type="spellStart"/>
+        <w:r>
+          <w:rPr>
+            <w:rStyle w:val="Hyperlink"/>
+            <w:color w:val="auto"/>
+          </w:rPr>
+          <w:t>Quickstats</w:t>
+        </w:r>
+        <w:proofErr w:type="spellEnd"/>
+        <w:r>
+          <w:rPr>
+            <w:rStyle w:val="Hyperlink"/>
+            <w:color w:val="auto"/>
+          </w:rPr>
+          <w:t xml:space="preserve"> web portal</w:t>
         </w:r>
       </w:hyperlink>
       <w:r>
@@ -1629,7 +1680,28 @@
         <w:t xml:space="preserve">– </w:t>
       </w:r>
       <w:r>
-        <w:t>USDA provided cattle prices in dollars per CWT (100 lbs), therefore USDA values were divided by 45.3592 (kg/100 lbs) to get prices in $/kg.</w:t>
+        <w:t xml:space="preserve">USDA provided cattle prices in dollars per CWT (100 </w:t>
+      </w:r>
+      <w:proofErr w:type="spellStart"/>
+      <w:r>
+        <w:t>lbs</w:t>
+      </w:r>
+      <w:proofErr w:type="spellEnd"/>
+      <w:proofErr w:type="gramStart"/>
+      <w:r>
+        <w:t>),</w:t>
+      </w:r>
+      <w:proofErr w:type="gramEnd"/>
+      <w:r>
+        <w:t xml:space="preserve"> therefore USDA values were divided by 45.3592 (kg/100 </w:t>
+      </w:r>
+      <w:proofErr w:type="spellStart"/>
+      <w:r>
+        <w:t>lbs</w:t>
+      </w:r>
+      <w:proofErr w:type="spellEnd"/>
+      <w:r>
+        <w:t>) to get prices in $/kg.</w:t>
       </w:r>
     </w:p>
     <w:p/>
@@ -1719,7 +1791,23 @@
             <w:rStyle w:val="Hyperlink"/>
             <w:color w:val="auto"/>
           </w:rPr>
-          <w:t>National Agricultural Statistics Service Quickstats web portal</w:t>
+          <w:t xml:space="preserve">National Agricultural Statistics Service </w:t>
+        </w:r>
+        <w:proofErr w:type="spellStart"/>
+        <w:r>
+          <w:rPr>
+            <w:rStyle w:val="Hyperlink"/>
+            <w:color w:val="auto"/>
+          </w:rPr>
+          <w:t>Quickstats</w:t>
+        </w:r>
+        <w:proofErr w:type="spellEnd"/>
+        <w:r>
+          <w:rPr>
+            <w:rStyle w:val="Hyperlink"/>
+            <w:color w:val="auto"/>
+          </w:rPr>
+          <w:t xml:space="preserve"> web portal</w:t>
         </w:r>
       </w:hyperlink>
       <w:r>
@@ -1742,7 +1830,28 @@
         <w:t xml:space="preserve">Data Conversions </w:t>
       </w:r>
       <w:r>
-        <w:t>– USDA provided cattle prices in dollars per CWT (100 lbs), therefore USDA values were divided by 45.3592 (kg/100 lbs) to get prices in $/kg.</w:t>
+        <w:t xml:space="preserve">– USDA provided cattle prices in dollars per CWT (100 </w:t>
+      </w:r>
+      <w:proofErr w:type="spellStart"/>
+      <w:r>
+        <w:t>lbs</w:t>
+      </w:r>
+      <w:proofErr w:type="spellEnd"/>
+      <w:proofErr w:type="gramStart"/>
+      <w:r>
+        <w:t>),</w:t>
+      </w:r>
+      <w:proofErr w:type="gramEnd"/>
+      <w:r>
+        <w:t xml:space="preserve"> therefore USDA values were divided by 45.3592 (kg/100 </w:t>
+      </w:r>
+      <w:proofErr w:type="spellStart"/>
+      <w:r>
+        <w:t>lbs</w:t>
+      </w:r>
+      <w:proofErr w:type="spellEnd"/>
+      <w:r>
+        <w:t>) to get prices in $/kg.</w:t>
       </w:r>
     </w:p>
     <w:p/>
@@ -1845,7 +1954,23 @@
             <w:rStyle w:val="Hyperlink"/>
             <w:color w:val="auto"/>
           </w:rPr>
-          <w:t>National Agricultural Statistics Service Quickstats web portal</w:t>
+          <w:t xml:space="preserve">National Agricultural Statistics Service </w:t>
+        </w:r>
+        <w:proofErr w:type="spellStart"/>
+        <w:r>
+          <w:rPr>
+            <w:rStyle w:val="Hyperlink"/>
+            <w:color w:val="auto"/>
+          </w:rPr>
+          <w:t>Quickstats</w:t>
+        </w:r>
+        <w:proofErr w:type="spellEnd"/>
+        <w:r>
+          <w:rPr>
+            <w:rStyle w:val="Hyperlink"/>
+            <w:color w:val="auto"/>
+          </w:rPr>
+          <w:t xml:space="preserve"> web portal</w:t>
         </w:r>
       </w:hyperlink>
       <w:r>
@@ -1874,7 +1999,15 @@
         <w:t xml:space="preserve">Data Conversions </w:t>
       </w:r>
       <w:r>
-        <w:t>– No conversions were made to this data from that received from the USDA’s Quickstats web portal.</w:t>
+        <w:t xml:space="preserve">– No conversions were made to this data from that received from the USDA’s </w:t>
+      </w:r>
+      <w:proofErr w:type="spellStart"/>
+      <w:r>
+        <w:t>Quickstats</w:t>
+      </w:r>
+      <w:proofErr w:type="spellEnd"/>
+      <w:r>
+        <w:t xml:space="preserve"> web portal.</w:t>
       </w:r>
     </w:p>
     <w:p/>
@@ -1883,11 +2016,19 @@
         <w:t>File: ‘</w:t>
       </w:r>
       <w:r>
-        <w:t>commodity_prices.</w:t>
+        <w:t>commodity_</w:t>
+      </w:r>
+      <w:proofErr w:type="gramStart"/>
+      <w:r>
+        <w:t>prices.</w:t>
       </w:r>
       <w:commentRangeStart w:id="0"/>
       <w:r>
-        <w:t>cows_ge_500</w:t>
+        <w:t>cows</w:t>
+      </w:r>
+      <w:proofErr w:type="gramEnd"/>
+      <w:r>
+        <w:t>_ge_500</w:t>
       </w:r>
       <w:commentRangeEnd w:id="0"/>
       <w:r>
@@ -1938,8 +2079,13 @@
         <w:t xml:space="preserve">– Price received for </w:t>
       </w:r>
       <w:r>
-        <w:t>cattle greater than or equal to 500 lbs</w:t>
-      </w:r>
+        <w:t xml:space="preserve">cattle greater than or equal to 500 </w:t>
+      </w:r>
+      <w:proofErr w:type="spellStart"/>
+      <w:r>
+        <w:t>lbs</w:t>
+      </w:r>
+      <w:proofErr w:type="spellEnd"/>
     </w:p>
     <w:p>
       <w:pPr>
@@ -1987,7 +2133,23 @@
             <w:rStyle w:val="Hyperlink"/>
             <w:color w:val="auto"/>
           </w:rPr>
-          <w:t>National Agricultural Statistics Service Quickstats web portal</w:t>
+          <w:t xml:space="preserve">National Agricultural Statistics Service </w:t>
+        </w:r>
+        <w:proofErr w:type="spellStart"/>
+        <w:r>
+          <w:rPr>
+            <w:rStyle w:val="Hyperlink"/>
+            <w:color w:val="auto"/>
+          </w:rPr>
+          <w:t>Quickstats</w:t>
+        </w:r>
+        <w:proofErr w:type="spellEnd"/>
+        <w:r>
+          <w:rPr>
+            <w:rStyle w:val="Hyperlink"/>
+            <w:color w:val="auto"/>
+          </w:rPr>
+          <w:t xml:space="preserve"> web portal</w:t>
         </w:r>
       </w:hyperlink>
       <w:r>
@@ -2016,7 +2178,28 @@
         <w:t xml:space="preserve">Data Conversions </w:t>
       </w:r>
       <w:r>
-        <w:t>– USDA provided cattle prices in dollars per CWT (100 lbs), therefore USDA values were divided by 45.3592 (kg/100 lbs) to get prices in $/kg.</w:t>
+        <w:t xml:space="preserve">– USDA provided cattle prices in dollars per CWT (100 </w:t>
+      </w:r>
+      <w:proofErr w:type="spellStart"/>
+      <w:r>
+        <w:t>lbs</w:t>
+      </w:r>
+      <w:proofErr w:type="spellEnd"/>
+      <w:proofErr w:type="gramStart"/>
+      <w:r>
+        <w:t>),</w:t>
+      </w:r>
+      <w:proofErr w:type="gramEnd"/>
+      <w:r>
+        <w:t xml:space="preserve"> therefore USDA values were divided by 45.3592 (kg/100 </w:t>
+      </w:r>
+      <w:proofErr w:type="spellStart"/>
+      <w:r>
+        <w:t>lbs</w:t>
+      </w:r>
+      <w:proofErr w:type="spellEnd"/>
+      <w:r>
+        <w:t>) to get prices in $/kg.</w:t>
       </w:r>
     </w:p>
     <w:p/>
@@ -2066,8 +2249,13 @@
         <w:t xml:space="preserve">Data Subtype </w:t>
       </w:r>
       <w:r>
-        <w:t>– Price received for Steers and Heifers greater than or equal to 500 lbs</w:t>
-      </w:r>
+        <w:t xml:space="preserve">– Price received for Steers and Heifers greater than or equal to 500 </w:t>
+      </w:r>
+      <w:proofErr w:type="spellStart"/>
+      <w:r>
+        <w:t>lbs</w:t>
+      </w:r>
+      <w:proofErr w:type="spellEnd"/>
     </w:p>
     <w:p>
       <w:pPr>
@@ -2115,7 +2303,23 @@
             <w:rStyle w:val="Hyperlink"/>
             <w:color w:val="auto"/>
           </w:rPr>
-          <w:t>National Agricultural Statistics Service Quickstats web portal</w:t>
+          <w:t xml:space="preserve">National Agricultural Statistics Service </w:t>
+        </w:r>
+        <w:proofErr w:type="spellStart"/>
+        <w:r>
+          <w:rPr>
+            <w:rStyle w:val="Hyperlink"/>
+            <w:color w:val="auto"/>
+          </w:rPr>
+          <w:t>Quickstats</w:t>
+        </w:r>
+        <w:proofErr w:type="spellEnd"/>
+        <w:r>
+          <w:rPr>
+            <w:rStyle w:val="Hyperlink"/>
+            <w:color w:val="auto"/>
+          </w:rPr>
+          <w:t xml:space="preserve"> web portal</w:t>
         </w:r>
       </w:hyperlink>
       <w:r>
@@ -2151,7 +2355,28 @@
         <w:t xml:space="preserve">– </w:t>
       </w:r>
       <w:r>
-        <w:t>USDA provided cattle prices in dollars per CWT (100 lbs), therefore USDA values were divided by 45.3592 (kg/100 lbs) to get prices in $/kg.</w:t>
+        <w:t xml:space="preserve">USDA provided cattle prices in dollars per CWT (100 </w:t>
+      </w:r>
+      <w:proofErr w:type="spellStart"/>
+      <w:r>
+        <w:t>lbs</w:t>
+      </w:r>
+      <w:proofErr w:type="spellEnd"/>
+      <w:proofErr w:type="gramStart"/>
+      <w:r>
+        <w:t>),</w:t>
+      </w:r>
+      <w:proofErr w:type="gramEnd"/>
+      <w:r>
+        <w:t xml:space="preserve"> therefore USDA values were divided by 45.3592 (kg/100 </w:t>
+      </w:r>
+      <w:proofErr w:type="spellStart"/>
+      <w:r>
+        <w:t>lbs</w:t>
+      </w:r>
+      <w:proofErr w:type="spellEnd"/>
+      <w:r>
+        <w:t>) to get prices in $/kg.</w:t>
       </w:r>
     </w:p>
     <w:p/>
@@ -2207,8 +2432,13 @@
         <w:t xml:space="preserve"> </w:t>
       </w:r>
       <w:r>
-        <w:t>Fresh Dairy Cow Replacements (recently gave birth and lactating) with weight 1,000-1,600 lbs</w:t>
-      </w:r>
+        <w:t xml:space="preserve">Fresh Dairy Cow Replacements (recently gave birth and lactating) with weight 1,000-1,600 </w:t>
+      </w:r>
+      <w:proofErr w:type="spellStart"/>
+      <w:r>
+        <w:t>lbs</w:t>
+      </w:r>
+      <w:proofErr w:type="spellEnd"/>
     </w:p>
     <w:p>
       <w:pPr>
@@ -2383,8 +2613,13 @@
         <w:t xml:space="preserve"> </w:t>
       </w:r>
       <w:r>
-        <w:t>T3 Bred Dairy Cow (mature and pregnant) with weight 1,000-1,600 lbs</w:t>
-      </w:r>
+        <w:t xml:space="preserve">T3 Bred Dairy Cow (mature and pregnant) with weight 1,000-1,600 </w:t>
+      </w:r>
+      <w:proofErr w:type="spellStart"/>
+      <w:r>
+        <w:t>lbs</w:t>
+      </w:r>
+      <w:proofErr w:type="spellEnd"/>
     </w:p>
     <w:p>
       <w:pPr>
@@ -2560,8 +2795,13 @@
         <w:t xml:space="preserve"> </w:t>
       </w:r>
       <w:r>
-        <w:t>T3 Bred Dairy Heifer (pregnant and never calved before) with weight 800-1,400 lbs</w:t>
-      </w:r>
+        <w:t xml:space="preserve">T3 Bred Dairy Heifer (pregnant and never calved before) with weight 800-1,400 </w:t>
+      </w:r>
+      <w:proofErr w:type="spellStart"/>
+      <w:r>
+        <w:t>lbs</w:t>
+      </w:r>
+      <w:proofErr w:type="spellEnd"/>
     </w:p>
     <w:p>
       <w:pPr>
@@ -2736,8 +2976,13 @@
         <w:t xml:space="preserve"> </w:t>
       </w:r>
       <w:r>
-        <w:t>Open Dairy Heifer (not yet been bred or is not currently pregnant) with weight 600-900 lbs</w:t>
-      </w:r>
+        <w:t xml:space="preserve">Open Dairy Heifer (not yet been bred or is not currently pregnant) with weight 600-900 </w:t>
+      </w:r>
+      <w:proofErr w:type="spellStart"/>
+      <w:r>
+        <w:t>lbs</w:t>
+      </w:r>
+      <w:proofErr w:type="spellEnd"/>
     </w:p>
     <w:p>
       <w:pPr>
@@ -2912,8 +3157,13 @@
         <w:t xml:space="preserve"> </w:t>
       </w:r>
       <w:r>
-        <w:t>No.1 Bull Calves (0-14 days) with weight 90-130 lbs</w:t>
-      </w:r>
+        <w:t xml:space="preserve">No.1 Bull Calves (0-14 days) with weight 90-130 </w:t>
+      </w:r>
+      <w:proofErr w:type="spellStart"/>
+      <w:r>
+        <w:t>lbs</w:t>
+      </w:r>
+      <w:proofErr w:type="spellEnd"/>
     </w:p>
     <w:p>
       <w:pPr>
@@ -3032,7 +3282,28 @@
         <w:t xml:space="preserve">– </w:t>
       </w:r>
       <w:r>
-        <w:t>USDA provided cattle prices in dollars per CWT (100 lbs), therefore USDA values were divided by 45.3592 (kg/100 lbs) to get prices in $/kg.</w:t>
+        <w:t xml:space="preserve">USDA provided cattle prices in dollars per CWT (100 </w:t>
+      </w:r>
+      <w:proofErr w:type="spellStart"/>
+      <w:r>
+        <w:t>lbs</w:t>
+      </w:r>
+      <w:proofErr w:type="spellEnd"/>
+      <w:proofErr w:type="gramStart"/>
+      <w:r>
+        <w:t>),</w:t>
+      </w:r>
+      <w:proofErr w:type="gramEnd"/>
+      <w:r>
+        <w:t xml:space="preserve"> therefore USDA values were divided by 45.3592 (kg/100 </w:t>
+      </w:r>
+      <w:proofErr w:type="spellStart"/>
+      <w:r>
+        <w:t>lbs</w:t>
+      </w:r>
+      <w:proofErr w:type="spellEnd"/>
+      <w:r>
+        <w:t>) to get prices in $/kg.</w:t>
       </w:r>
     </w:p>
     <w:p/>
@@ -3089,8 +3360,13 @@
         <w:t xml:space="preserve"> </w:t>
       </w:r>
       <w:r>
-        <w:t>No.2 Bull Calves (0-14 days) with weight 85-120 lbs</w:t>
-      </w:r>
+        <w:t xml:space="preserve">No.2 Bull Calves (0-14 days) with weight 85-120 </w:t>
+      </w:r>
+      <w:proofErr w:type="spellStart"/>
+      <w:r>
+        <w:t>lbs</w:t>
+      </w:r>
+      <w:proofErr w:type="spellEnd"/>
     </w:p>
     <w:p>
       <w:pPr>
@@ -3209,7 +3485,28 @@
         <w:t xml:space="preserve">– </w:t>
       </w:r>
       <w:r>
-        <w:t>USDA provided cattle prices in dollars per CWT (100 lbs), therefore USDA values were divided by 45.3592 (kg/100 lbs) to get prices in $/kg.</w:t>
+        <w:t xml:space="preserve">USDA provided cattle prices in dollars per CWT (100 </w:t>
+      </w:r>
+      <w:proofErr w:type="spellStart"/>
+      <w:r>
+        <w:t>lbs</w:t>
+      </w:r>
+      <w:proofErr w:type="spellEnd"/>
+      <w:proofErr w:type="gramStart"/>
+      <w:r>
+        <w:t>),</w:t>
+      </w:r>
+      <w:proofErr w:type="gramEnd"/>
+      <w:r>
+        <w:t xml:space="preserve"> therefore USDA values were divided by 45.3592 (kg/100 </w:t>
+      </w:r>
+      <w:proofErr w:type="spellStart"/>
+      <w:r>
+        <w:t>lbs</w:t>
+      </w:r>
+      <w:proofErr w:type="spellEnd"/>
+      <w:r>
+        <w:t>) to get prices in $/kg.</w:t>
       </w:r>
     </w:p>
     <w:p/>
@@ -3265,8 +3562,13 @@
         <w:t xml:space="preserve"> </w:t>
       </w:r>
       <w:r>
-        <w:t>No.1 Heifer Calves (0-14 days) with weight 80-130 lbs</w:t>
-      </w:r>
+        <w:t xml:space="preserve">No.1 Heifer Calves (0-14 days) with weight 80-130 </w:t>
+      </w:r>
+      <w:proofErr w:type="spellStart"/>
+      <w:r>
+        <w:t>lbs</w:t>
+      </w:r>
+      <w:proofErr w:type="spellEnd"/>
     </w:p>
     <w:p>
       <w:pPr>
@@ -3385,7 +3687,28 @@
         <w:t xml:space="preserve">– </w:t>
       </w:r>
       <w:r>
-        <w:t>USDA provided cattle prices in dollars per CWT (100 lbs), therefore USDA values were divided by 45.3592 (kg/100 lbs) to get prices in $/kg.</w:t>
+        <w:t xml:space="preserve">USDA provided cattle prices in dollars per CWT (100 </w:t>
+      </w:r>
+      <w:proofErr w:type="spellStart"/>
+      <w:r>
+        <w:t>lbs</w:t>
+      </w:r>
+      <w:proofErr w:type="spellEnd"/>
+      <w:proofErr w:type="gramStart"/>
+      <w:r>
+        <w:t>),</w:t>
+      </w:r>
+      <w:proofErr w:type="gramEnd"/>
+      <w:r>
+        <w:t xml:space="preserve"> therefore USDA values were divided by 45.3592 (kg/100 </w:t>
+      </w:r>
+      <w:proofErr w:type="spellStart"/>
+      <w:r>
+        <w:t>lbs</w:t>
+      </w:r>
+      <w:proofErr w:type="spellEnd"/>
+      <w:r>
+        <w:t>) to get prices in $/kg.</w:t>
       </w:r>
     </w:p>
     <w:p/>
@@ -3441,8 +3764,13 @@
         <w:t xml:space="preserve"> </w:t>
       </w:r>
       <w:r>
-        <w:t>No.2 Heifer Calves (0-14 days) with weight 85-120 lbs</w:t>
-      </w:r>
+        <w:t xml:space="preserve">No.2 Heifer Calves (0-14 days) with weight 85-120 </w:t>
+      </w:r>
+      <w:proofErr w:type="spellStart"/>
+      <w:r>
+        <w:t>lbs</w:t>
+      </w:r>
+      <w:proofErr w:type="spellEnd"/>
     </w:p>
     <w:p>
       <w:pPr>
@@ -3562,7 +3890,28 @@
         <w:t xml:space="preserve">– </w:t>
       </w:r>
       <w:r>
-        <w:t>USDA provided cattle prices in dollars per CWT (100 lbs), therefore USDA values were divided by 45.3592 (kg/100 lbs) to get prices in $/kg.</w:t>
+        <w:t xml:space="preserve">USDA provided cattle prices in dollars per CWT (100 </w:t>
+      </w:r>
+      <w:proofErr w:type="spellStart"/>
+      <w:r>
+        <w:t>lbs</w:t>
+      </w:r>
+      <w:proofErr w:type="spellEnd"/>
+      <w:proofErr w:type="gramStart"/>
+      <w:r>
+        <w:t>),</w:t>
+      </w:r>
+      <w:proofErr w:type="gramEnd"/>
+      <w:r>
+        <w:t xml:space="preserve"> therefore USDA values were divided by 45.3592 (kg/100 </w:t>
+      </w:r>
+      <w:proofErr w:type="spellStart"/>
+      <w:r>
+        <w:t>lbs</w:t>
+      </w:r>
+      <w:proofErr w:type="spellEnd"/>
+      <w:r>
+        <w:t>) to get prices in $/kg.</w:t>
       </w:r>
     </w:p>
     <w:p/>
@@ -3618,7 +3967,15 @@
         <w:t xml:space="preserve"> </w:t>
       </w:r>
       <w:r>
-        <w:t>Feeder Holstein Steers (300-500 lbs)</w:t>
+        <w:t xml:space="preserve">Feeder Holstein Steers (300-500 </w:t>
+      </w:r>
+      <w:proofErr w:type="spellStart"/>
+      <w:r>
+        <w:t>lbs</w:t>
+      </w:r>
+      <w:proofErr w:type="spellEnd"/>
+      <w:r>
+        <w:t>)</w:t>
       </w:r>
     </w:p>
     <w:p>
@@ -3738,7 +4095,28 @@
         <w:t xml:space="preserve">– </w:t>
       </w:r>
       <w:r>
-        <w:t>USDA provided cattle prices in dollars per CWT (100 lbs), therefore USDA values were divided by 45.3592 (kg/100 lbs) to get prices in $/kg.</w:t>
+        <w:t xml:space="preserve">USDA provided cattle prices in dollars per CWT (100 </w:t>
+      </w:r>
+      <w:proofErr w:type="spellStart"/>
+      <w:r>
+        <w:t>lbs</w:t>
+      </w:r>
+      <w:proofErr w:type="spellEnd"/>
+      <w:proofErr w:type="gramStart"/>
+      <w:r>
+        <w:t>),</w:t>
+      </w:r>
+      <w:proofErr w:type="gramEnd"/>
+      <w:r>
+        <w:t xml:space="preserve"> therefore USDA values were divided by 45.3592 (kg/100 </w:t>
+      </w:r>
+      <w:proofErr w:type="spellStart"/>
+      <w:r>
+        <w:t>lbs</w:t>
+      </w:r>
+      <w:proofErr w:type="spellEnd"/>
+      <w:r>
+        <w:t>) to get prices in $/kg.</w:t>
       </w:r>
     </w:p>
     <w:p/>
@@ -3803,8 +4181,13 @@
         <w:t>Feeder Holstein Steers (</w:t>
       </w:r>
       <w:r>
-        <w:t>500-700 lbs</w:t>
-      </w:r>
+        <w:t xml:space="preserve">500-700 </w:t>
+      </w:r>
+      <w:proofErr w:type="spellStart"/>
+      <w:r>
+        <w:t>lbs</w:t>
+      </w:r>
+      <w:proofErr w:type="spellEnd"/>
       <w:r>
         <w:t>)</w:t>
       </w:r>
@@ -3926,7 +4309,28 @@
         <w:t xml:space="preserve">– </w:t>
       </w:r>
       <w:r>
-        <w:t>USDA provided cattle prices in dollars per CWT (100 lbs), therefore USDA values were divided by 45.3592 (kg/100 lbs) to get prices in $/kg.</w:t>
+        <w:t xml:space="preserve">USDA provided cattle prices in dollars per CWT (100 </w:t>
+      </w:r>
+      <w:proofErr w:type="spellStart"/>
+      <w:r>
+        <w:t>lbs</w:t>
+      </w:r>
+      <w:proofErr w:type="spellEnd"/>
+      <w:proofErr w:type="gramStart"/>
+      <w:r>
+        <w:t>),</w:t>
+      </w:r>
+      <w:proofErr w:type="gramEnd"/>
+      <w:r>
+        <w:t xml:space="preserve"> therefore USDA values were divided by 45.3592 (kg/100 </w:t>
+      </w:r>
+      <w:proofErr w:type="spellStart"/>
+      <w:r>
+        <w:t>lbs</w:t>
+      </w:r>
+      <w:proofErr w:type="spellEnd"/>
+      <w:r>
+        <w:t>) to get prices in $/kg.</w:t>
       </w:r>
     </w:p>
     <w:p/>
@@ -3991,8 +4395,13 @@
         <w:t>Feeder Holstein Steers (</w:t>
       </w:r>
       <w:r>
-        <w:t>700-1,000 lbs</w:t>
-      </w:r>
+        <w:t xml:space="preserve">700-1,000 </w:t>
+      </w:r>
+      <w:proofErr w:type="spellStart"/>
+      <w:r>
+        <w:t>lbs</w:t>
+      </w:r>
+      <w:proofErr w:type="spellEnd"/>
       <w:r>
         <w:t>)</w:t>
       </w:r>
@@ -4122,7 +4531,28 @@
         <w:t xml:space="preserve">– </w:t>
       </w:r>
       <w:r>
-        <w:t>USDA provided cattle prices in dollars per CWT (100 lbs), therefore USDA values were divided by 45.3592 (kg/100 lbs) to get prices in $/kg.</w:t>
+        <w:t xml:space="preserve">USDA provided cattle prices in dollars per CWT (100 </w:t>
+      </w:r>
+      <w:proofErr w:type="spellStart"/>
+      <w:r>
+        <w:t>lbs</w:t>
+      </w:r>
+      <w:proofErr w:type="spellEnd"/>
+      <w:proofErr w:type="gramStart"/>
+      <w:r>
+        <w:t>),</w:t>
+      </w:r>
+      <w:proofErr w:type="gramEnd"/>
+      <w:r>
+        <w:t xml:space="preserve"> therefore USDA values were divided by 45.3592 (kg/100 </w:t>
+      </w:r>
+      <w:proofErr w:type="spellStart"/>
+      <w:r>
+        <w:t>lbs</w:t>
+      </w:r>
+      <w:proofErr w:type="spellEnd"/>
+      <w:r>
+        <w:t>) to get prices in $/kg.</w:t>
       </w:r>
     </w:p>
     <w:p/>
@@ -4230,7 +4660,23 @@
             <w:rStyle w:val="Hyperlink"/>
             <w:color w:val="auto"/>
           </w:rPr>
-          <w:t>National Agricultural Statistics Service Quickstats web portal</w:t>
+          <w:t xml:space="preserve">National Agricultural Statistics Service </w:t>
+        </w:r>
+        <w:proofErr w:type="spellStart"/>
+        <w:r>
+          <w:rPr>
+            <w:rStyle w:val="Hyperlink"/>
+            <w:color w:val="auto"/>
+          </w:rPr>
+          <w:t>Quickstats</w:t>
+        </w:r>
+        <w:proofErr w:type="spellEnd"/>
+        <w:r>
+          <w:rPr>
+            <w:rStyle w:val="Hyperlink"/>
+            <w:color w:val="auto"/>
+          </w:rPr>
+          <w:t xml:space="preserve"> web portal</w:t>
         </w:r>
       </w:hyperlink>
       <w:r>
@@ -5309,7 +5755,15 @@
         <w:t xml:space="preserve">Data Conversions </w:t>
       </w:r>
       <w:r>
-        <w:t>– Values received from FRED were received in dollars per gallon so values were divided by 3.78541 (liters per gallon) to get prices in $/liter.</w:t>
+        <w:t xml:space="preserve">– Values received from FRED were received in dollars per </w:t>
+      </w:r>
+      <w:proofErr w:type="gramStart"/>
+      <w:r>
+        <w:t>gallon</w:t>
+      </w:r>
+      <w:proofErr w:type="gramEnd"/>
+      <w:r>
+        <w:t xml:space="preserve"> so values were divided by 3.78541 (liters per gallon) to get prices in $/liter.</w:t>
       </w:r>
     </w:p>
     <w:p>
@@ -6769,7 +7223,23 @@
             <w:rStyle w:val="Hyperlink"/>
             <w:color w:val="auto"/>
           </w:rPr>
-          <w:t>National Agricultural Statistics Service Quickstats web portal</w:t>
+          <w:t xml:space="preserve">National Agricultural Statistics Service </w:t>
+        </w:r>
+        <w:proofErr w:type="spellStart"/>
+        <w:r>
+          <w:rPr>
+            <w:rStyle w:val="Hyperlink"/>
+            <w:color w:val="auto"/>
+          </w:rPr>
+          <w:t>Quickstats</w:t>
+        </w:r>
+        <w:proofErr w:type="spellEnd"/>
+        <w:r>
+          <w:rPr>
+            <w:rStyle w:val="Hyperlink"/>
+            <w:color w:val="auto"/>
+          </w:rPr>
+          <w:t xml:space="preserve"> web portal</w:t>
         </w:r>
       </w:hyperlink>
       <w:r>
@@ -7003,7 +7473,15 @@
         </w:r>
       </w:hyperlink>
       <w:r>
-        <w:t xml:space="preserve">. Data is provided weekly using the parameters for “Commodities” as “Almond Hulls” and “Report” as “National Mill-Feeds and Miscellaneous Feedstuff Report” then selecting the appropriate date. Reported weekly data is provided for multiple locations in California. As such, the mean of the individual weekly prices was taken to get an overall mean for the week. The annual mean almond hull price was then taken as the average of the calculated weekly prices. Since data was only provided for locations in California, these values were assumed to be representative of the nation average. </w:t>
+        <w:t xml:space="preserve">. Data is provided weekly using the parameters for “Commodities” as “Almond Hulls” and “Report” as “National </w:t>
+      </w:r>
+      <w:proofErr w:type="gramStart"/>
+      <w:r>
+        <w:t>Mill-Feeds</w:t>
+      </w:r>
+      <w:proofErr w:type="gramEnd"/>
+      <w:r>
+        <w:t xml:space="preserve"> and Miscellaneous Feedstuff Report” then selecting the appropriate date. Reported weekly data is provided for multiple locations in California. As such, the mean of the individual weekly prices was taken to get an overall mean for the week. The annual mean almond hull price was then taken as the average of the calculated weekly prices. Since data was only provided for locations in California, these values were assumed to be representative of the nation average. </w:t>
       </w:r>
     </w:p>
     <w:p>
@@ -7786,7 +8264,23 @@
             <w:rStyle w:val="Hyperlink"/>
             <w:color w:val="auto"/>
           </w:rPr>
-          <w:t>National Agricultural Statistics Service Quickstats web portal</w:t>
+          <w:t xml:space="preserve">National Agricultural Statistics Service </w:t>
+        </w:r>
+        <w:proofErr w:type="spellStart"/>
+        <w:r>
+          <w:rPr>
+            <w:rStyle w:val="Hyperlink"/>
+            <w:color w:val="auto"/>
+          </w:rPr>
+          <w:t>Quickstats</w:t>
+        </w:r>
+        <w:proofErr w:type="spellEnd"/>
+        <w:r>
+          <w:rPr>
+            <w:rStyle w:val="Hyperlink"/>
+            <w:color w:val="auto"/>
+          </w:rPr>
+          <w:t xml:space="preserve"> web portal</w:t>
         </w:r>
       </w:hyperlink>
       <w:r>
@@ -7815,7 +8309,15 @@
         <w:t xml:space="preserve">– </w:t>
       </w:r>
       <w:r>
-        <w:t xml:space="preserve">USDA data was provided in units of U.S. dollars per bushel of corn grain, therefore the USDA </w:t>
+        <w:t xml:space="preserve">USDA data was provided in units of U.S. dollars per bushel of corn </w:t>
+      </w:r>
+      <w:proofErr w:type="gramStart"/>
+      <w:r>
+        <w:t>grain,</w:t>
+      </w:r>
+      <w:proofErr w:type="gramEnd"/>
+      <w:r>
+        <w:t xml:space="preserve"> therefore the USDA </w:t>
       </w:r>
       <w:r>
         <w:t xml:space="preserve">data </w:t>
@@ -7933,7 +8435,15 @@
         </w:r>
       </w:hyperlink>
       <w:r>
-        <w:t xml:space="preserve">. They state “Corn silage that has already been harvested and stored is worth more, naturally, typically 10-12 times the price of a bushel of corn.” Therefore, a scaling factor of 11 was used to estimate corn silage pricing. </w:t>
+        <w:t xml:space="preserve">. They </w:t>
+      </w:r>
+      <w:proofErr w:type="gramStart"/>
+      <w:r>
+        <w:t>state</w:t>
+      </w:r>
+      <w:proofErr w:type="gramEnd"/>
+      <w:r>
+        <w:t xml:space="preserve"> “Corn silage that has already been harvested and stored is worth more, naturally, typically 10-12 times the price of a bushel of corn.” Therefore, a scaling factor of 11 was used to estimate corn silage pricing. </w:t>
       </w:r>
       <w:r>
         <w:t xml:space="preserve">The results of this scaling are in line with estimates by </w:t>
@@ -8626,7 +9136,23 @@
             <w:rStyle w:val="Hyperlink"/>
             <w:color w:val="auto"/>
           </w:rPr>
-          <w:t>National Agricultural Statistics Service Quickstats web portal</w:t>
+          <w:t xml:space="preserve">National Agricultural Statistics Service </w:t>
+        </w:r>
+        <w:proofErr w:type="spellStart"/>
+        <w:r>
+          <w:rPr>
+            <w:rStyle w:val="Hyperlink"/>
+            <w:color w:val="auto"/>
+          </w:rPr>
+          <w:t>Quickstats</w:t>
+        </w:r>
+        <w:proofErr w:type="spellEnd"/>
+        <w:r>
+          <w:rPr>
+            <w:rStyle w:val="Hyperlink"/>
+            <w:color w:val="auto"/>
+          </w:rPr>
+          <w:t xml:space="preserve"> web portal</w:t>
         </w:r>
       </w:hyperlink>
       <w:r>
@@ -8757,7 +9283,23 @@
             <w:rStyle w:val="Hyperlink"/>
             <w:color w:val="auto"/>
           </w:rPr>
-          <w:t>National Agricultural Statistics Service Quickstats web portal</w:t>
+          <w:t xml:space="preserve">National Agricultural Statistics Service </w:t>
+        </w:r>
+        <w:proofErr w:type="spellStart"/>
+        <w:r>
+          <w:rPr>
+            <w:rStyle w:val="Hyperlink"/>
+            <w:color w:val="auto"/>
+          </w:rPr>
+          <w:t>Quickstats</w:t>
+        </w:r>
+        <w:proofErr w:type="spellEnd"/>
+        <w:r>
+          <w:rPr>
+            <w:rStyle w:val="Hyperlink"/>
+            <w:color w:val="auto"/>
+          </w:rPr>
+          <w:t xml:space="preserve"> web portal</w:t>
         </w:r>
       </w:hyperlink>
       <w:r>
@@ -8897,7 +9439,23 @@
             <w:rStyle w:val="Hyperlink"/>
             <w:color w:val="auto"/>
           </w:rPr>
-          <w:t>National Agricultural Statistics Service Quickstats web portal</w:t>
+          <w:t xml:space="preserve">National Agricultural Statistics Service </w:t>
+        </w:r>
+        <w:proofErr w:type="spellStart"/>
+        <w:r>
+          <w:rPr>
+            <w:rStyle w:val="Hyperlink"/>
+            <w:color w:val="auto"/>
+          </w:rPr>
+          <w:t>Quickstats</w:t>
+        </w:r>
+        <w:proofErr w:type="spellEnd"/>
+        <w:r>
+          <w:rPr>
+            <w:rStyle w:val="Hyperlink"/>
+            <w:color w:val="auto"/>
+          </w:rPr>
+          <w:t xml:space="preserve"> web portal</w:t>
         </w:r>
       </w:hyperlink>
       <w:r>
@@ -8941,7 +9499,15 @@
         <w:t xml:space="preserve">– </w:t>
       </w:r>
       <w:r>
-        <w:t>USDA data was provided in units of U.S. dollars per bushel of rye grain, therefore the USDA data was divided by 25.401 (kg rye/bushel) to get prices in $/kg. Note: This is the same conversion factor as bushel of corn grain to kilogram.</w:t>
+        <w:t xml:space="preserve">USDA data was provided in units of U.S. dollars per bushel of rye </w:t>
+      </w:r>
+      <w:proofErr w:type="gramStart"/>
+      <w:r>
+        <w:t>grain,</w:t>
+      </w:r>
+      <w:proofErr w:type="gramEnd"/>
+      <w:r>
+        <w:t xml:space="preserve"> therefore the USDA data was divided by 25.401 (kg rye/bushel) to get prices in $/kg. Note: This is the same conversion factor as bushel of corn grain to kilogram.</w:t>
       </w:r>
     </w:p>
     <w:p/>
@@ -9040,7 +9606,23 @@
             <w:rStyle w:val="Hyperlink"/>
             <w:color w:val="auto"/>
           </w:rPr>
-          <w:t>National Agricultural Statistics Service Quickstats web portal</w:t>
+          <w:t xml:space="preserve">National Agricultural Statistics Service </w:t>
+        </w:r>
+        <w:proofErr w:type="spellStart"/>
+        <w:r>
+          <w:rPr>
+            <w:rStyle w:val="Hyperlink"/>
+            <w:color w:val="auto"/>
+          </w:rPr>
+          <w:t>Quickstats</w:t>
+        </w:r>
+        <w:proofErr w:type="spellEnd"/>
+        <w:r>
+          <w:rPr>
+            <w:rStyle w:val="Hyperlink"/>
+            <w:color w:val="auto"/>
+          </w:rPr>
+          <w:t xml:space="preserve"> web portal</w:t>
         </w:r>
       </w:hyperlink>
       <w:r>
@@ -9066,7 +9648,15 @@
         <w:t xml:space="preserve">– </w:t>
       </w:r>
       <w:r>
-        <w:t>USDA data was provided in units of U.S. dollars per bushel of soybean grain, therefore the USDA data was divided by 27.2155 (kg soybeans/bushel) to get prices in $/kg.</w:t>
+        <w:t xml:space="preserve">USDA data was provided in units of U.S. dollars per bushel of soybean </w:t>
+      </w:r>
+      <w:proofErr w:type="gramStart"/>
+      <w:r>
+        <w:t>grain,</w:t>
+      </w:r>
+      <w:proofErr w:type="gramEnd"/>
+      <w:r>
+        <w:t xml:space="preserve"> therefore the USDA data was divided by 27.2155 (kg soybeans/bushel) to get prices in $/kg.</w:t>
       </w:r>
     </w:p>
     <w:p/>
@@ -9421,7 +10011,15 @@
         <w:t xml:space="preserve">Data Subtype </w:t>
       </w:r>
       <w:r>
-        <w:t>– Sudangrass Silage</w:t>
+        <w:t xml:space="preserve">– </w:t>
+      </w:r>
+      <w:proofErr w:type="spellStart"/>
+      <w:r>
+        <w:t>Sudangrass</w:t>
+      </w:r>
+      <w:proofErr w:type="spellEnd"/>
+      <w:r>
+        <w:t xml:space="preserve"> Silage</w:t>
       </w:r>
     </w:p>
     <w:p>
@@ -9440,7 +10038,15 @@
         <w:t xml:space="preserve">Units </w:t>
       </w:r>
       <w:r>
-        <w:t>– U.S. dollars per kilogram of sudangrass silage</w:t>
+        <w:t xml:space="preserve">– U.S. dollars per kilogram of </w:t>
+      </w:r>
+      <w:proofErr w:type="spellStart"/>
+      <w:r>
+        <w:t>sudangrass</w:t>
+      </w:r>
+      <w:proofErr w:type="spellEnd"/>
+      <w:r>
+        <w:t xml:space="preserve"> silage</w:t>
       </w:r>
     </w:p>
     <w:p>
@@ -9459,7 +10065,23 @@
         <w:t xml:space="preserve">Data source </w:t>
       </w:r>
       <w:r>
-        <w:t xml:space="preserve">– Historical prices for sudangrass silage was not found. The only sudangrass silage estimate that could be find was provided by </w:t>
+        <w:t xml:space="preserve">– Historical prices for </w:t>
+      </w:r>
+      <w:proofErr w:type="spellStart"/>
+      <w:r>
+        <w:t>sudangrass</w:t>
+      </w:r>
+      <w:proofErr w:type="spellEnd"/>
+      <w:r>
+        <w:t xml:space="preserve"> silage was not found. The only </w:t>
+      </w:r>
+      <w:proofErr w:type="spellStart"/>
+      <w:r>
+        <w:t>sudangrass</w:t>
+      </w:r>
+      <w:proofErr w:type="spellEnd"/>
+      <w:r>
+        <w:t xml:space="preserve"> silage estimate that could be find was provided by </w:t>
       </w:r>
       <w:hyperlink r:id="rId61" w:history="1">
         <w:r>
@@ -9471,11 +10093,59 @@
         </w:r>
       </w:hyperlink>
       <w:r>
-        <w:t xml:space="preserve">. They estimate the cost of sudangrass silage for sudangrass yields between 9.5 to 18.5 tons per acre. For the purposes of this data, the cost of $53/ton sudangrass silage was used for all counties which is associated with the middle sudangrass yield of 14 tons per acre. Since the report was produced in 2009, a </w:t>
+        <w:t xml:space="preserve">. They estimate the cost of </w:t>
+      </w:r>
+      <w:proofErr w:type="spellStart"/>
+      <w:r>
+        <w:t>sudangrass</w:t>
+      </w:r>
+      <w:proofErr w:type="spellEnd"/>
+      <w:r>
+        <w:t xml:space="preserve"> silage for </w:t>
+      </w:r>
+      <w:proofErr w:type="spellStart"/>
+      <w:r>
+        <w:t>sudangrass</w:t>
+      </w:r>
+      <w:proofErr w:type="spellEnd"/>
+      <w:r>
+        <w:t xml:space="preserve"> yields between 9.5 to 18.5 tons per acre. For the purposes of this data, the cost of $53/ton </w:t>
+      </w:r>
+      <w:proofErr w:type="spellStart"/>
+      <w:r>
+        <w:t>sudangrass</w:t>
+      </w:r>
+      <w:proofErr w:type="spellEnd"/>
+      <w:r>
+        <w:t xml:space="preserve"> silage was used for all counties which is associated with the middle </w:t>
+      </w:r>
+      <w:proofErr w:type="spellStart"/>
+      <w:r>
+        <w:t>sudangrass</w:t>
+      </w:r>
+      <w:proofErr w:type="spellEnd"/>
+      <w:r>
+        <w:t xml:space="preserve"> yield of 14 tons per acre. Since the report was produced in 2009, a </w:t>
       </w:r>
       <w:r>
         <w:lastRenderedPageBreak/>
-        <w:t>scaling factor of 1.4614 was used to convert from 2009 dollars to 2024 dollars. Therefore a final value of $77.45 per ton of sudangrass silage was used for all counties.</w:t>
+        <w:t xml:space="preserve">scaling factor of 1.4614 was used to convert from 2009 dollars to 2024 dollars. </w:t>
+      </w:r>
+      <w:proofErr w:type="gramStart"/>
+      <w:r>
+        <w:t>Therefore</w:t>
+      </w:r>
+      <w:proofErr w:type="gramEnd"/>
+      <w:r>
+        <w:t xml:space="preserve"> a final value of $77.45 per ton of </w:t>
+      </w:r>
+      <w:proofErr w:type="spellStart"/>
+      <w:r>
+        <w:t>sudangrass</w:t>
+      </w:r>
+      <w:proofErr w:type="spellEnd"/>
+      <w:r>
+        <w:t xml:space="preserve"> silage was used for all counties.</w:t>
       </w:r>
     </w:p>
     <w:p>
@@ -9617,153 +10287,186 @@
             <w:rStyle w:val="Hyperlink"/>
             <w:color w:val="auto"/>
           </w:rPr>
-          <w:t>National Agricultural Statistics Service Quickstats web portal</w:t>
+          <w:t xml:space="preserve">National Agricultural Statistics Service </w:t>
         </w:r>
-      </w:hyperlink>
-      <w:r>
-        <w:t xml:space="preserve">. This data can be obtained by selecting Group: Field Crops, Commodity: </w:t>
-      </w:r>
-      <w:r>
-        <w:t>Wheat</w:t>
-      </w:r>
-      <w:r>
-        <w:t xml:space="preserve">, Category: Price Received, Data Item: </w:t>
-      </w:r>
-      <w:r>
-        <w:t>Wheat, Winter</w:t>
-      </w:r>
-      <w:r>
-        <w:t xml:space="preserve"> – Price Received, Measured in $ / BU, Geographic Level: National + State, Year: All, Period Type: Annual, Period: Marketing Year. State level values were then assigned uniformly to each county within the state. When state or data was unavailable, the U.S. mean value was used.</w:t>
-      </w:r>
-    </w:p>
-    <w:p>
-      <w:pPr>
-        <w:pStyle w:val="ListParagraph"/>
-        <w:numPr>
-          <w:ilvl w:val="0"/>
-          <w:numId w:val="1"/>
-        </w:numPr>
-      </w:pPr>
-      <w:r>
-        <w:rPr>
-          <w:b/>
-          <w:bCs/>
-        </w:rPr>
-        <w:t xml:space="preserve">Data Conversions </w:t>
-      </w:r>
-      <w:r>
-        <w:t xml:space="preserve">– </w:t>
-      </w:r>
-      <w:r>
-        <w:t xml:space="preserve">USDA data was provided in units of U.S. dollars per bushel of </w:t>
-      </w:r>
-      <w:r>
-        <w:t>winter wheat</w:t>
-      </w:r>
-      <w:r>
-        <w:t xml:space="preserve"> grain, therefore the USDA data was divided by 27.2155 (kg </w:t>
-      </w:r>
-      <w:r>
-        <w:t>winter wheat</w:t>
-      </w:r>
-      <w:r>
-        <w:t>/bushel) to get prices in $/kg.</w:t>
-      </w:r>
-      <w:r>
-        <w:t xml:space="preserve"> Note: This is the same conversion factor as bushel of soybeans to kilogram.</w:t>
-      </w:r>
-    </w:p>
-    <w:p/>
-    <w:p>
-      <w:r>
-        <w:t>File: ‘commodity_prices.calcium_phosphate_di.dollar_per_kilogram.csv’</w:t>
-      </w:r>
-    </w:p>
-    <w:p>
-      <w:pPr>
-        <w:pStyle w:val="ListParagraph"/>
-        <w:numPr>
-          <w:ilvl w:val="0"/>
-          <w:numId w:val="8"/>
-        </w:numPr>
-      </w:pPr>
-      <w:r>
-        <w:rPr>
-          <w:b/>
-          <w:bCs/>
-        </w:rPr>
-        <w:t xml:space="preserve">Primary Data Type </w:t>
-      </w:r>
-      <w:r>
-        <w:t>– Feed prices</w:t>
-      </w:r>
-    </w:p>
-    <w:p>
-      <w:pPr>
-        <w:pStyle w:val="ListParagraph"/>
-        <w:numPr>
-          <w:ilvl w:val="0"/>
-          <w:numId w:val="1"/>
-        </w:numPr>
-      </w:pPr>
-      <w:r>
-        <w:rPr>
-          <w:b/>
-          <w:bCs/>
-        </w:rPr>
-        <w:t xml:space="preserve">Data Subtype </w:t>
-      </w:r>
-      <w:r>
-        <w:t>– Calcium Phosphate (di)</w:t>
-      </w:r>
-    </w:p>
-    <w:p>
-      <w:pPr>
-        <w:pStyle w:val="ListParagraph"/>
-        <w:numPr>
-          <w:ilvl w:val="0"/>
-          <w:numId w:val="1"/>
-        </w:numPr>
-      </w:pPr>
-      <w:r>
-        <w:rPr>
-          <w:b/>
-          <w:bCs/>
-        </w:rPr>
-        <w:t xml:space="preserve">Units </w:t>
-      </w:r>
-      <w:r>
-        <w:t>– U.S. dollars per kilogram of Calcium Phosphate (di)</w:t>
-      </w:r>
-    </w:p>
-    <w:p>
-      <w:pPr>
-        <w:pStyle w:val="ListParagraph"/>
-        <w:numPr>
-          <w:ilvl w:val="0"/>
-          <w:numId w:val="1"/>
-        </w:numPr>
-      </w:pPr>
-      <w:r>
-        <w:rPr>
-          <w:b/>
-          <w:bCs/>
-        </w:rPr>
-        <w:t xml:space="preserve">Data source </w:t>
-      </w:r>
-      <w:r>
-        <w:t xml:space="preserve">– No historical prices could be found for calcium phosphate. Therefore, this file only features one economic price for calcium phosphate in 2024. The cost was gathered from </w:t>
-      </w:r>
-      <w:hyperlink r:id="rId64" w:history="1">
+        <w:proofErr w:type="spellStart"/>
         <w:r>
           <w:rPr>
             <w:rStyle w:val="Hyperlink"/>
             <w:color w:val="auto"/>
           </w:rPr>
-          <w:t>AgCare Product, Inc.</w:t>
+          <w:t>Quickstats</w:t>
+        </w:r>
+        <w:proofErr w:type="spellEnd"/>
+        <w:r>
+          <w:rPr>
+            <w:rStyle w:val="Hyperlink"/>
+            <w:color w:val="auto"/>
+          </w:rPr>
+          <w:t xml:space="preserve"> web portal</w:t>
         </w:r>
       </w:hyperlink>
       <w:r>
+        <w:t xml:space="preserve">. This data can be obtained by selecting Group: Field Crops, Commodity: </w:t>
+      </w:r>
+      <w:r>
+        <w:t>Wheat</w:t>
+      </w:r>
+      <w:r>
+        <w:t xml:space="preserve">, Category: Price Received, Data Item: </w:t>
+      </w:r>
+      <w:r>
+        <w:t>Wheat, Winter</w:t>
+      </w:r>
+      <w:r>
+        <w:t xml:space="preserve"> – Price Received, Measured in $ / BU, Geographic Level: National + State, Year: All, Period Type: Annual, Period: Marketing Year. State level values were then assigned uniformly to each county within the state. When state or data was unavailable, the U.S. mean value was used.</w:t>
+      </w:r>
+    </w:p>
+    <w:p>
+      <w:pPr>
+        <w:pStyle w:val="ListParagraph"/>
+        <w:numPr>
+          <w:ilvl w:val="0"/>
+          <w:numId w:val="1"/>
+        </w:numPr>
+      </w:pPr>
+      <w:r>
+        <w:rPr>
+          <w:b/>
+          <w:bCs/>
+        </w:rPr>
+        <w:t xml:space="preserve">Data Conversions </w:t>
+      </w:r>
+      <w:r>
+        <w:t xml:space="preserve">– </w:t>
+      </w:r>
+      <w:r>
+        <w:t xml:space="preserve">USDA data was provided in units of U.S. dollars per bushel of </w:t>
+      </w:r>
+      <w:r>
+        <w:t>winter wheat</w:t>
+      </w:r>
+      <w:r>
+        <w:t xml:space="preserve"> </w:t>
+      </w:r>
+      <w:proofErr w:type="gramStart"/>
+      <w:r>
+        <w:t>grain,</w:t>
+      </w:r>
+      <w:proofErr w:type="gramEnd"/>
+      <w:r>
+        <w:t xml:space="preserve"> therefore the USDA data was divided by 27.2155 (kg </w:t>
+      </w:r>
+      <w:r>
+        <w:t>winter wheat</w:t>
+      </w:r>
+      <w:r>
+        <w:t>/bushel) to get prices in $/kg.</w:t>
+      </w:r>
+      <w:r>
+        <w:t xml:space="preserve"> Note: This is the same conversion factor as bushel of soybeans to kilogram.</w:t>
+      </w:r>
+    </w:p>
+    <w:p/>
+    <w:p>
+      <w:r>
+        <w:t>File: ‘commodity_prices.calcium_phosphate_di.dollar_per_kilogram.csv’</w:t>
+      </w:r>
+    </w:p>
+    <w:p>
+      <w:pPr>
+        <w:pStyle w:val="ListParagraph"/>
+        <w:numPr>
+          <w:ilvl w:val="0"/>
+          <w:numId w:val="8"/>
+        </w:numPr>
+      </w:pPr>
+      <w:r>
+        <w:rPr>
+          <w:b/>
+          <w:bCs/>
+        </w:rPr>
+        <w:t xml:space="preserve">Primary Data Type </w:t>
+      </w:r>
+      <w:r>
+        <w:t>– Feed prices</w:t>
+      </w:r>
+    </w:p>
+    <w:p>
+      <w:pPr>
+        <w:pStyle w:val="ListParagraph"/>
+        <w:numPr>
+          <w:ilvl w:val="0"/>
+          <w:numId w:val="1"/>
+        </w:numPr>
+      </w:pPr>
+      <w:r>
+        <w:rPr>
+          <w:b/>
+          <w:bCs/>
+        </w:rPr>
+        <w:t xml:space="preserve">Data Subtype </w:t>
+      </w:r>
+      <w:r>
+        <w:t>– Calcium Phosphate (di)</w:t>
+      </w:r>
+    </w:p>
+    <w:p>
+      <w:pPr>
+        <w:pStyle w:val="ListParagraph"/>
+        <w:numPr>
+          <w:ilvl w:val="0"/>
+          <w:numId w:val="1"/>
+        </w:numPr>
+      </w:pPr>
+      <w:r>
+        <w:rPr>
+          <w:b/>
+          <w:bCs/>
+        </w:rPr>
+        <w:t xml:space="preserve">Units </w:t>
+      </w:r>
+      <w:r>
+        <w:t>– U.S. dollars per kilogram of Calcium Phosphate (di)</w:t>
+      </w:r>
+    </w:p>
+    <w:p>
+      <w:pPr>
+        <w:pStyle w:val="ListParagraph"/>
+        <w:numPr>
+          <w:ilvl w:val="0"/>
+          <w:numId w:val="1"/>
+        </w:numPr>
+      </w:pPr>
+      <w:r>
+        <w:rPr>
+          <w:b/>
+          <w:bCs/>
+        </w:rPr>
+        <w:t xml:space="preserve">Data source </w:t>
+      </w:r>
+      <w:r>
+        <w:t xml:space="preserve">– No historical prices could be found for calcium phosphate. Therefore, this file only features one economic price for calcium phosphate in 2024. The cost was gathered from </w:t>
+      </w:r>
+      <w:hyperlink r:id="rId64" w:history="1">
+        <w:proofErr w:type="spellStart"/>
+        <w:r>
+          <w:rPr>
+            <w:rStyle w:val="Hyperlink"/>
+            <w:color w:val="auto"/>
+          </w:rPr>
+          <w:t>AgCare</w:t>
+        </w:r>
+        <w:proofErr w:type="spellEnd"/>
+        <w:r>
+          <w:rPr>
+            <w:rStyle w:val="Hyperlink"/>
+            <w:color w:val="auto"/>
+          </w:rPr>
+          <w:t xml:space="preserve"> Product, Inc.</w:t>
+        </w:r>
+      </w:hyperlink>
+      <w:r>
         <w:t xml:space="preserve"> for a 50 pound (22.68 kilogram) feed grade bag of Dicalcium Phosphate plus shipping to Utah.</w:t>
       </w:r>
     </w:p>
@@ -9783,7 +10486,15 @@
         <w:t xml:space="preserve">Data Conversions </w:t>
       </w:r>
       <w:r>
-        <w:t>– Current price of $41.00 for the 50 lb bag plus $136.24 for shipping was divided by 22.68 kilograms to get the per kilogram price of $7.81.</w:t>
+        <w:t xml:space="preserve">– Current price of $41.00 for the 50 </w:t>
+      </w:r>
+      <w:proofErr w:type="spellStart"/>
+      <w:r>
+        <w:t>lb</w:t>
+      </w:r>
+      <w:proofErr w:type="spellEnd"/>
+      <w:r>
+        <w:t xml:space="preserve"> bag plus $136.24 for shipping was divided by 22.68 kilograms to get the per kilogram price of $7.81.</w:t>
       </w:r>
     </w:p>
     <w:p/>
@@ -9897,7 +10608,15 @@
         <w:t xml:space="preserve">Data Conversions </w:t>
       </w:r>
       <w:r>
-        <w:t>– Current price of $17.65 for the 50 lb bag plus $89.23 for shipping was divided by 22.68 kilograms to get the per kilogram price of $4.71.</w:t>
+        <w:t xml:space="preserve">– Current price of $17.65 for the 50 </w:t>
+      </w:r>
+      <w:proofErr w:type="spellStart"/>
+      <w:r>
+        <w:t>lb</w:t>
+      </w:r>
+      <w:proofErr w:type="spellEnd"/>
+      <w:r>
+        <w:t xml:space="preserve"> bag plus $89.23 for shipping was divided by 22.68 kilograms to get the per kilogram price of $4.71.</w:t>
       </w:r>
     </w:p>
     <w:p/>
@@ -10010,7 +10729,15 @@
         <w:t xml:space="preserve">Data Conversions </w:t>
       </w:r>
       <w:r>
-        <w:t>– Current price of $7.95 for the 50 lb bag plus $89.23 for shipping was divided by 22.68 kilograms to get the per kilogram price of $4.28.</w:t>
+        <w:t xml:space="preserve">– Current price of $7.95 for the 50 </w:t>
+      </w:r>
+      <w:proofErr w:type="spellStart"/>
+      <w:r>
+        <w:t>lb</w:t>
+      </w:r>
+      <w:proofErr w:type="spellEnd"/>
+      <w:r>
+        <w:t xml:space="preserve"> bag plus $89.23 for shipping was divided by 22.68 kilograms to get the per kilogram price of $4.28.</w:t>
       </w:r>
     </w:p>
     <w:p/>
@@ -10174,10 +10901,18 @@
         <w:t xml:space="preserve">USDA provided </w:t>
       </w:r>
       <w:r>
-        <w:t>seed prices in dollars per planted acre</w:t>
-      </w:r>
-      <w:r>
-        <w:t xml:space="preserve">, therefore USDA values were divided by </w:t>
+        <w:t xml:space="preserve">seed prices in dollars per planted </w:t>
+      </w:r>
+      <w:proofErr w:type="gramStart"/>
+      <w:r>
+        <w:t>acre</w:t>
+      </w:r>
+      <w:r>
+        <w:t>,</w:t>
+      </w:r>
+      <w:proofErr w:type="gramEnd"/>
+      <w:r>
+        <w:t xml:space="preserve"> therefore USDA values were divided by </w:t>
       </w:r>
       <w:r>
         <w:t>4</w:t>
@@ -10370,10 +11105,18 @@
         <w:t xml:space="preserve">USDA provided </w:t>
       </w:r>
       <w:r>
-        <w:t>seed prices in dollars per planted acre</w:t>
-      </w:r>
-      <w:r>
-        <w:t xml:space="preserve">, therefore USDA values were divided by </w:t>
+        <w:t xml:space="preserve">seed prices in dollars per planted </w:t>
+      </w:r>
+      <w:proofErr w:type="gramStart"/>
+      <w:r>
+        <w:t>acre</w:t>
+      </w:r>
+      <w:r>
+        <w:t>,</w:t>
+      </w:r>
+      <w:proofErr w:type="gramEnd"/>
+      <w:r>
+        <w:t xml:space="preserve"> therefore USDA values were divided by </w:t>
       </w:r>
       <w:r>
         <w:t>4</w:t>
@@ -10566,10 +11309,18 @@
         <w:t xml:space="preserve">USDA provided </w:t>
       </w:r>
       <w:r>
-        <w:t>seed prices in dollars per planted acre</w:t>
-      </w:r>
-      <w:r>
-        <w:t xml:space="preserve">, therefore USDA values were divided by </w:t>
+        <w:t xml:space="preserve">seed prices in dollars per planted </w:t>
+      </w:r>
+      <w:proofErr w:type="gramStart"/>
+      <w:r>
+        <w:t>acre</w:t>
+      </w:r>
+      <w:r>
+        <w:t>,</w:t>
+      </w:r>
+      <w:proofErr w:type="gramEnd"/>
+      <w:r>
+        <w:t xml:space="preserve"> therefore USDA values were divided by </w:t>
       </w:r>
       <w:r>
         <w:t>4</w:t>
@@ -10763,10 +11514,18 @@
         <w:t xml:space="preserve">USDA provided </w:t>
       </w:r>
       <w:r>
-        <w:t>seed prices in dollars per planted acre</w:t>
-      </w:r>
-      <w:r>
-        <w:t xml:space="preserve">, therefore USDA values were divided by </w:t>
+        <w:t xml:space="preserve">seed prices in dollars per planted </w:t>
+      </w:r>
+      <w:proofErr w:type="gramStart"/>
+      <w:r>
+        <w:t>acre</w:t>
+      </w:r>
+      <w:r>
+        <w:t>,</w:t>
+      </w:r>
+      <w:proofErr w:type="gramEnd"/>
+      <w:r>
+        <w:t xml:space="preserve"> therefore USDA values were divided by </w:t>
       </w:r>
       <w:r>
         <w:t>4</w:t>
@@ -10959,10 +11718,18 @@
         <w:t xml:space="preserve">USDA provided </w:t>
       </w:r>
       <w:r>
-        <w:t>seed prices in dollars per planted acre</w:t>
-      </w:r>
-      <w:r>
-        <w:t xml:space="preserve">, therefore USDA values were divided by </w:t>
+        <w:t xml:space="preserve">seed prices in dollars per planted </w:t>
+      </w:r>
+      <w:proofErr w:type="gramStart"/>
+      <w:r>
+        <w:t>acre</w:t>
+      </w:r>
+      <w:r>
+        <w:t>,</w:t>
+      </w:r>
+      <w:proofErr w:type="gramEnd"/>
+      <w:r>
+        <w:t xml:space="preserve"> therefore USDA values were divided by </w:t>
       </w:r>
       <w:r>
         <w:t>4</w:t>
@@ -11159,10 +11926,18 @@
         <w:t xml:space="preserve">USDA provided </w:t>
       </w:r>
       <w:r>
-        <w:t>seed prices in dollars per planted acre</w:t>
-      </w:r>
-      <w:r>
-        <w:t xml:space="preserve">, therefore USDA values were divided by </w:t>
+        <w:t xml:space="preserve">seed prices in dollars per planted </w:t>
+      </w:r>
+      <w:proofErr w:type="gramStart"/>
+      <w:r>
+        <w:t>acre</w:t>
+      </w:r>
+      <w:r>
+        <w:t>,</w:t>
+      </w:r>
+      <w:proofErr w:type="gramEnd"/>
+      <w:r>
+        <w:t xml:space="preserve"> therefore USDA values were divided by </w:t>
       </w:r>
       <w:r>
         <w:t>4</w:t>
@@ -11355,10 +12130,18 @@
         <w:t xml:space="preserve">USDA provided </w:t>
       </w:r>
       <w:r>
-        <w:t>seed prices in dollars per planted acre</w:t>
-      </w:r>
-      <w:r>
-        <w:t xml:space="preserve">, therefore USDA values were divided by </w:t>
+        <w:t xml:space="preserve">seed prices in dollars per planted </w:t>
+      </w:r>
+      <w:proofErr w:type="gramStart"/>
+      <w:r>
+        <w:t>acre</w:t>
+      </w:r>
+      <w:r>
+        <w:t>,</w:t>
+      </w:r>
+      <w:proofErr w:type="gramEnd"/>
+      <w:r>
+        <w:t xml:space="preserve"> therefore USDA values were divided by </w:t>
       </w:r>
       <w:r>
         <w:t>4</w:t>
@@ -11554,10 +12337,18 @@
         <w:t xml:space="preserve">USDA provided </w:t>
       </w:r>
       <w:r>
-        <w:t>seed prices in dollars per planted acre</w:t>
-      </w:r>
-      <w:r>
-        <w:t xml:space="preserve">, therefore USDA values were divided by </w:t>
+        <w:t xml:space="preserve">seed prices in dollars per planted </w:t>
+      </w:r>
+      <w:proofErr w:type="gramStart"/>
+      <w:r>
+        <w:t>acre</w:t>
+      </w:r>
+      <w:r>
+        <w:t>,</w:t>
+      </w:r>
+      <w:proofErr w:type="gramEnd"/>
+      <w:r>
+        <w:t xml:space="preserve"> therefore USDA values were divided by </w:t>
       </w:r>
       <w:r>
         <w:t>4</w:t>
@@ -11751,10 +12542,18 @@
         <w:t xml:space="preserve">USDA provided </w:t>
       </w:r>
       <w:r>
-        <w:t>seed prices in dollars per planted acre</w:t>
-      </w:r>
-      <w:r>
-        <w:t xml:space="preserve">, therefore USDA values were divided by </w:t>
+        <w:t xml:space="preserve">seed prices in dollars per planted </w:t>
+      </w:r>
+      <w:proofErr w:type="gramStart"/>
+      <w:r>
+        <w:t>acre</w:t>
+      </w:r>
+      <w:r>
+        <w:t>,</w:t>
+      </w:r>
+      <w:proofErr w:type="gramEnd"/>
+      <w:r>
+        <w:t xml:space="preserve"> therefore USDA values were divided by </w:t>
       </w:r>
       <w:r>
         <w:t>4</w:t>
@@ -11915,7 +12714,15 @@
         <w:t xml:space="preserve">Data Conversions </w:t>
       </w:r>
       <w:r>
-        <w:t>– Prices received from USDA-ERS were received in units of U.S. dollars per short ton of fertilizer, therefore they were divided by 907.185 (kilograms/short-ton) to get prices in units of U.S. dollars per kilogram of fertilizer.</w:t>
+        <w:t xml:space="preserve">– Prices received from USDA-ERS were received in units of U.S. dollars per short ton of </w:t>
+      </w:r>
+      <w:proofErr w:type="gramStart"/>
+      <w:r>
+        <w:t>fertilizer,</w:t>
+      </w:r>
+      <w:proofErr w:type="gramEnd"/>
+      <w:r>
+        <w:t xml:space="preserve"> therefore they were divided by 907.185 (kilograms/short-ton) to get prices in units of U.S. dollars per kilogram of fertilizer.</w:t>
       </w:r>
     </w:p>
     <w:p/>
@@ -12049,7 +12856,15 @@
         <w:t xml:space="preserve">Data Conversions </w:t>
       </w:r>
       <w:r>
-        <w:t>– Prices received from USDA-ERS were received in units of U.S. dollars per short ton of fertilizer, therefore they were divided by 907.185 (kilograms/short-ton) to get prices in units of U.S. dollars per kilogram of fertilizer.</w:t>
+        <w:t xml:space="preserve">– Prices received from USDA-ERS were received in units of U.S. dollars per short ton of </w:t>
+      </w:r>
+      <w:proofErr w:type="gramStart"/>
+      <w:r>
+        <w:t>fertilizer,</w:t>
+      </w:r>
+      <w:proofErr w:type="gramEnd"/>
+      <w:r>
+        <w:t xml:space="preserve"> therefore they were divided by 907.185 (kilograms/short-ton) to get prices in units of U.S. dollars per kilogram of fertilizer.</w:t>
       </w:r>
     </w:p>
     <w:p/>
@@ -12174,7 +12989,15 @@
         <w:t xml:space="preserve">Data Conversions </w:t>
       </w:r>
       <w:r>
-        <w:t>– Prices received from USDA-ERS were received in units of U.S. dollars per short ton of fertilizer, therefore they were divided by 907.185 (kilograms/short-ton) to get prices in units of U.S. dollars per kilogram of fertilizer.</w:t>
+        <w:t xml:space="preserve">– Prices received from USDA-ERS were received in units of U.S. dollars per short ton of </w:t>
+      </w:r>
+      <w:proofErr w:type="gramStart"/>
+      <w:r>
+        <w:t>fertilizer,</w:t>
+      </w:r>
+      <w:proofErr w:type="gramEnd"/>
+      <w:r>
+        <w:t xml:space="preserve"> therefore they were divided by 907.185 (kilograms/short-ton) to get prices in units of U.S. dollars per kilogram of fertilizer.</w:t>
       </w:r>
     </w:p>
     <w:p/>
@@ -12300,7 +13123,15 @@
         <w:t xml:space="preserve">Data Conversions </w:t>
       </w:r>
       <w:r>
-        <w:t>– Prices received from USDA-ERS were received in units of U.S. dollars per short ton of fertilizer, therefore they were divided by 907.185 (kilograms/short-ton) to get prices in units of U.S. dollars per kilogram of fertilizer.</w:t>
+        <w:t xml:space="preserve">– Prices received from USDA-ERS were received in units of U.S. dollars per short ton of </w:t>
+      </w:r>
+      <w:proofErr w:type="gramStart"/>
+      <w:r>
+        <w:t>fertilizer,</w:t>
+      </w:r>
+      <w:proofErr w:type="gramEnd"/>
+      <w:r>
+        <w:t xml:space="preserve"> therefore they were divided by 907.185 (kilograms/short-ton) to get prices in units of U.S. dollars per kilogram of fertilizer.</w:t>
       </w:r>
     </w:p>
     <w:p/>
@@ -12425,7 +13256,15 @@
         <w:t xml:space="preserve">Data Conversions </w:t>
       </w:r>
       <w:r>
-        <w:t>– Prices received from USDA-ERS were received in units of U.S. dollars per short ton of fertilizer, therefore they were divided by 907.185 (kilograms/short-ton) to get prices in units of U.S. dollars per kilogram of fertilizer.</w:t>
+        <w:t xml:space="preserve">– Prices received from USDA-ERS were received in units of U.S. dollars per short ton of </w:t>
+      </w:r>
+      <w:proofErr w:type="gramStart"/>
+      <w:r>
+        <w:t>fertilizer,</w:t>
+      </w:r>
+      <w:proofErr w:type="gramEnd"/>
+      <w:r>
+        <w:t xml:space="preserve"> therefore they were divided by 907.185 (kilograms/short-ton) to get prices in units of U.S. dollars per kilogram of fertilizer.</w:t>
       </w:r>
     </w:p>
     <w:p>
@@ -12555,7 +13394,15 @@
         <w:t xml:space="preserve">Data Conversions </w:t>
       </w:r>
       <w:r>
-        <w:t>– Prices received from USDA-ERS were received in units of U.S. dollars per short ton of fertilizer, therefore they were divided by 907.185 (kilograms/short-ton) to get prices in units of U.S. dollars per kilogram of fertilizer.</w:t>
+        <w:t xml:space="preserve">– Prices received from USDA-ERS were received in units of U.S. dollars per short ton of </w:t>
+      </w:r>
+      <w:proofErr w:type="gramStart"/>
+      <w:r>
+        <w:t>fertilizer,</w:t>
+      </w:r>
+      <w:proofErr w:type="gramEnd"/>
+      <w:r>
+        <w:t xml:space="preserve"> therefore they were divided by 907.185 (kilograms/short-ton) to get prices in units of U.S. dollars per kilogram of fertilizer.</w:t>
       </w:r>
     </w:p>
     <w:p/>
@@ -12680,7 +13527,15 @@
         <w:t xml:space="preserve">Data Conversions </w:t>
       </w:r>
       <w:r>
-        <w:t>– Prices received from USDA-ERS were received in units of U.S. dollars per short ton of fertilizer, therefore they were divided by 907.185 (kilograms/short-ton) to get prices in units of U.S. dollars per kilogram of fertilizer.</w:t>
+        <w:t xml:space="preserve">– Prices received from USDA-ERS were received in units of U.S. dollars per short ton of </w:t>
+      </w:r>
+      <w:proofErr w:type="gramStart"/>
+      <w:r>
+        <w:t>fertilizer,</w:t>
+      </w:r>
+      <w:proofErr w:type="gramEnd"/>
+      <w:r>
+        <w:t xml:space="preserve"> therefore they were divided by 907.185 (kilograms/short-ton) to get prices in units of U.S. dollars per kilogram of fertilizer.</w:t>
       </w:r>
     </w:p>
     <w:p/>
@@ -12806,7 +13661,15 @@
         <w:t xml:space="preserve">Data Conversions </w:t>
       </w:r>
       <w:r>
-        <w:t>– Prices received from USDA-ERS were received in units of U.S. dollars per short ton of fertilizer, therefore they were divided by 907.185 (kilograms/short-ton) to get prices in units of U.S. dollars per kilogram of fertilizer.</w:t>
+        <w:t xml:space="preserve">– Prices received from USDA-ERS were received in units of U.S. dollars per short ton of </w:t>
+      </w:r>
+      <w:proofErr w:type="gramStart"/>
+      <w:r>
+        <w:t>fertilizer,</w:t>
+      </w:r>
+      <w:proofErr w:type="gramEnd"/>
+      <w:r>
+        <w:t xml:space="preserve"> therefore they were divided by 907.185 (kilograms/short-ton) to get prices in units of U.S. dollars per kilogram of fertilizer.</w:t>
       </w:r>
     </w:p>
     <w:p/>
@@ -12931,7 +13794,15 @@
         <w:t xml:space="preserve">Data Conversions </w:t>
       </w:r>
       <w:r>
-        <w:t>– Prices received from USDA-ERS were received in units of U.S. dollars per short ton of fertilizer, therefore they were divided by 907.185 (kilograms/short-ton) to get prices in units of U.S. dollars per kilogram of fertilizer.</w:t>
+        <w:t xml:space="preserve">– Prices received from USDA-ERS were received in units of U.S. dollars per short ton of </w:t>
+      </w:r>
+      <w:proofErr w:type="gramStart"/>
+      <w:r>
+        <w:t>fertilizer,</w:t>
+      </w:r>
+      <w:proofErr w:type="gramEnd"/>
+      <w:r>
+        <w:t xml:space="preserve"> therefore they were divided by 907.185 (kilograms/short-ton) to get prices in units of U.S. dollars per kilogram of fertilizer.</w:t>
       </w:r>
     </w:p>
     <w:p/>
@@ -13056,7 +13927,15 @@
         <w:t xml:space="preserve">Data Conversions </w:t>
       </w:r>
       <w:r>
-        <w:t>– Prices received from USDA-ERS were received in units of U.S. dollars per short ton of fertilizer, therefore they were divided by 907.185 (kilograms/short-ton) to get prices in units of U.S. dollars per kilogram of fertilizer.</w:t>
+        <w:t xml:space="preserve">– Prices received from USDA-ERS were received in units of U.S. dollars per short ton of </w:t>
+      </w:r>
+      <w:proofErr w:type="gramStart"/>
+      <w:r>
+        <w:t>fertilizer,</w:t>
+      </w:r>
+      <w:proofErr w:type="gramEnd"/>
+      <w:r>
+        <w:t xml:space="preserve"> therefore they were divided by 907.185 (kilograms/short-ton) to get prices in units of U.S. dollars per kilogram of fertilizer.</w:t>
       </w:r>
     </w:p>
     <w:p/>
@@ -13182,7 +14061,15 @@
         <w:t xml:space="preserve">Data Conversions </w:t>
       </w:r>
       <w:r>
-        <w:t>– Prices received from USDA-ERS were received in units of U.S. dollars per short ton of fertilizer, therefore they were divided by 907.185 (kilograms/short-ton) to get prices in units of U.S. dollars per kilogram of fertilizer.</w:t>
+        <w:t xml:space="preserve">– Prices received from USDA-ERS were received in units of U.S. dollars per short ton of </w:t>
+      </w:r>
+      <w:proofErr w:type="gramStart"/>
+      <w:r>
+        <w:t>fertilizer,</w:t>
+      </w:r>
+      <w:proofErr w:type="gramEnd"/>
+      <w:r>
+        <w:t xml:space="preserve"> therefore they were divided by 907.185 (kilograms/short-ton) to get prices in units of U.S. dollars per kilogram of fertilizer.</w:t>
       </w:r>
     </w:p>
     <w:p/>
@@ -13307,7 +14194,15 @@
         <w:t xml:space="preserve">Data Conversions </w:t>
       </w:r>
       <w:r>
-        <w:t>– Prices received from USDA-ERS were received in units of U.S. dollars per short ton of fertilizer, therefore they were divided by 907.185 (kilograms/short-ton) to get prices in units of U.S. dollars per kilogram of fertilizer.</w:t>
+        <w:t xml:space="preserve">– Prices received from USDA-ERS were received in units of U.S. dollars per short ton of </w:t>
+      </w:r>
+      <w:proofErr w:type="gramStart"/>
+      <w:r>
+        <w:t>fertilizer,</w:t>
+      </w:r>
+      <w:proofErr w:type="gramEnd"/>
+      <w:r>
+        <w:t xml:space="preserve"> therefore they were divided by 907.185 (kilograms/short-ton) to get prices in units of U.S. dollars per kilogram of fertilizer.</w:t>
       </w:r>
     </w:p>
     <w:p/>
@@ -13518,7 +14413,15 @@
         </w:r>
       </w:hyperlink>
       <w:r>
-        <w:t>. This report provided retail water prices from water utilities across the U.S with a first year rate, final year rate, and escalation rate found in their survey. Therefore, annual water prices were obtained for each year between 2008 and 2023 using the provided water rates and associated escalation rate for price scaling. Counties were assigned the prices of the utility within their county if available. If a utility did not fall within a county, the mean price of water utilities in the state was used for that county. If no utilities provided data within a state, the mean price from all the utilities within the water region were used for the county.</w:t>
+        <w:t xml:space="preserve">. This report provided retail water prices from water utilities across the U.S with a </w:t>
+      </w:r>
+      <w:proofErr w:type="gramStart"/>
+      <w:r>
+        <w:t>first year</w:t>
+      </w:r>
+      <w:proofErr w:type="gramEnd"/>
+      <w:r>
+        <w:t xml:space="preserve"> rate, final year rate, and escalation rate found in their survey. Therefore, annual water prices were obtained for each year between 2008 and 2023 using the provided water rates and associated escalation rate for price scaling. Counties were assigned the prices of the utility within their county if available. If a utility did not fall within a county, the mean price of water utilities in the state was used for that county. If no utilities provided data within a state, the mean price from all the utilities within the water region were used for the county.</w:t>
       </w:r>
     </w:p>
     <w:p>
@@ -13663,7 +14566,15 @@
         <w:t xml:space="preserve">Data Conversions </w:t>
       </w:r>
       <w:r>
-        <w:t>– Diesel prices from EIA where provided in U.S. dollars per gallon, therefore prices were divided by 3.78541 (liters per gallon) to get prices in $/liter.</w:t>
+        <w:t xml:space="preserve">– Diesel prices from EIA </w:t>
+      </w:r>
+      <w:proofErr w:type="gramStart"/>
+      <w:r>
+        <w:t>where</w:t>
+      </w:r>
+      <w:proofErr w:type="gramEnd"/>
+      <w:r>
+        <w:t xml:space="preserve"> provided in U.S. dollars per gallon, therefore prices were divided by 3.78541 (liters per gallon) to get prices in $/liter.</w:t>
       </w:r>
     </w:p>
     <w:p/>
@@ -13788,7 +14699,15 @@
         <w:t xml:space="preserve">Data Conversions </w:t>
       </w:r>
       <w:r>
-        <w:t>– Gasoline prices from EIA where provided in U.S. dollars per gallon, therefore prices were divided by 3.78541 (liters per gallon) to get prices in $/liter.</w:t>
+        <w:t xml:space="preserve">– Gasoline prices from EIA </w:t>
+      </w:r>
+      <w:proofErr w:type="gramStart"/>
+      <w:r>
+        <w:t>where</w:t>
+      </w:r>
+      <w:proofErr w:type="gramEnd"/>
+      <w:r>
+        <w:t xml:space="preserve"> provided in U.S. dollars per gallon, therefore prices were divided by 3.78541 (liters per gallon) to get prices in $/liter.</w:t>
       </w:r>
     </w:p>
     <w:p/>
@@ -14654,7 +15573,15 @@
         <w:t xml:space="preserve">Data Conversions </w:t>
       </w:r>
       <w:r>
-        <w:t>– Values received from EIA were received in dollars per gallon so values were divided by 3.78541 (liters per gallon) to get prices in $/liter.</w:t>
+        <w:t xml:space="preserve">– Values received from EIA were received in dollars per </w:t>
+      </w:r>
+      <w:proofErr w:type="gramStart"/>
+      <w:r>
+        <w:t>gallon</w:t>
+      </w:r>
+      <w:proofErr w:type="gramEnd"/>
+      <w:r>
+        <w:t xml:space="preserve"> so values were divided by 3.78541 (liters per gallon) to get prices in $/liter.</w:t>
       </w:r>
     </w:p>
     <w:p/>
@@ -14779,7 +15706,15 @@
         <w:t xml:space="preserve">Data Conversions </w:t>
       </w:r>
       <w:r>
-        <w:t>– Values received from EIA were received in dollars per gallon so values were divided by 3.78541 (liters per gallon) to get prices in $/liter.</w:t>
+        <w:t xml:space="preserve">– Values received from EIA were received in dollars per </w:t>
+      </w:r>
+      <w:proofErr w:type="gramStart"/>
+      <w:r>
+        <w:t>gallon</w:t>
+      </w:r>
+      <w:proofErr w:type="gramEnd"/>
+      <w:r>
+        <w:t xml:space="preserve"> so values were divided by 3.78541 (liters per gallon) to get prices in $/liter.</w:t>
       </w:r>
     </w:p>
     <w:p/>
@@ -14879,7 +15814,15 @@
         <w:t xml:space="preserve">– </w:t>
       </w:r>
       <w:r>
-        <w:t>There is no historical data available for this variable and it will have a user specific value. Therefore, all values in the CSV are zero and will be overwritten by the user defined value if entered.</w:t>
+        <w:t xml:space="preserve">There is no historical data available for this </w:t>
+      </w:r>
+      <w:proofErr w:type="gramStart"/>
+      <w:r>
+        <w:t>variable</w:t>
+      </w:r>
+      <w:proofErr w:type="gramEnd"/>
+      <w:r>
+        <w:t xml:space="preserve"> and it will have a user specific value. Therefore, all values in the CSV are zero and will be overwritten by the user defined value if entered.</w:t>
       </w:r>
     </w:p>
     <w:p>
@@ -15031,6 +15974,7 @@
         <w:t xml:space="preserve">guaranteed by </w:t>
       </w:r>
       <w:hyperlink r:id="rId116" w:history="1">
+        <w:proofErr w:type="spellStart"/>
         <w:r>
           <w:rPr>
             <w:rStyle w:val="Hyperlink"/>
@@ -15038,12 +15982,21 @@
           </w:rPr>
           <w:t>Bovaer</w:t>
         </w:r>
+        <w:proofErr w:type="spellEnd"/>
       </w:hyperlink>
       <w:r>
         <w:t>.</w:t>
       </w:r>
       <w:r>
-        <w:t xml:space="preserve"> This value was acquired from a personal interview with someone familiar with the Bovaer business.</w:t>
+        <w:t xml:space="preserve"> This value was acquired from a personal interview with someone familiar with the </w:t>
+      </w:r>
+      <w:proofErr w:type="spellStart"/>
+      <w:r>
+        <w:t>Bovaer</w:t>
+      </w:r>
+      <w:proofErr w:type="spellEnd"/>
+      <w:r>
+        <w:t xml:space="preserve"> business.</w:t>
       </w:r>
     </w:p>
     <w:p>
@@ -15243,7 +16196,13 @@
         <w:t>File: ‘</w:t>
       </w:r>
       <w:r>
-        <w:t>commodity_prices.digester_fertilizer_coproduct.dollars_per_kg_nitrogen.csv</w:t>
+        <w:t>commodity_prices.digester_fertilizer_coproduct.dollars_per_kg_</w:t>
+      </w:r>
+      <w:r>
+        <w:t>bedding</w:t>
+      </w:r>
+      <w:r>
+        <w:t>.csv</w:t>
       </w:r>
       <w:r>
         <w:t>’</w:t>
@@ -15290,7 +16249,19 @@
         <w:t xml:space="preserve">– </w:t>
       </w:r>
       <w:r>
-        <w:t>Nitrogen Fertilizer Digester Coproduct sales price</w:t>
+        <w:t>B</w:t>
+      </w:r>
+      <w:r>
+        <w:t xml:space="preserve">edding </w:t>
+      </w:r>
+      <w:r>
+        <w:t>Digester Coproduct</w:t>
+      </w:r>
+      <w:r>
+        <w:t xml:space="preserve"> </w:t>
+      </w:r>
+      <w:r>
+        <w:t>sales price</w:t>
       </w:r>
     </w:p>
     <w:p>
@@ -15312,7 +16283,10 @@
         <w:t xml:space="preserve">– U.S. dollars per </w:t>
       </w:r>
       <w:r>
-        <w:t xml:space="preserve">kilogram of nitrogen </w:t>
+        <w:t xml:space="preserve">kilogram of </w:t>
+      </w:r>
+      <w:r>
+        <w:t>bedding</w:t>
       </w:r>
     </w:p>
     <w:p>
@@ -15334,7 +16308,15 @@
         <w:t xml:space="preserve">– </w:t>
       </w:r>
       <w:r>
-        <w:t>There is no historical data available for this variable and it will have a user specific value. Therefore, all values in the CSV are zero and will be overwritten by the user defined value if entered.</w:t>
+        <w:t xml:space="preserve">There is no historical data available for this </w:t>
+      </w:r>
+      <w:proofErr w:type="gramStart"/>
+      <w:r>
+        <w:t>variable</w:t>
+      </w:r>
+      <w:proofErr w:type="gramEnd"/>
+      <w:r>
+        <w:t xml:space="preserve"> and it will have a user specific value. Therefore, all values in the CSV are zero and will be overwritten by the user defined value if entered.</w:t>
       </w:r>
     </w:p>
     <w:p>
@@ -15365,13 +16347,13 @@
         <w:t>File: ‘</w:t>
       </w:r>
       <w:r>
-        <w:t>commodity_prices.digester_fertilizer_coproduct.dollars_per_kg_</w:t>
-      </w:r>
-      <w:r>
-        <w:t>phosphorus</w:t>
-      </w:r>
-      <w:r>
-        <w:t>.csv</w:t>
+        <w:t>commodity_prices.digester_carbon_credits</w:t>
+      </w:r>
+      <w:r>
+        <w:t>.</w:t>
+      </w:r>
+      <w:r>
+        <w:t>dollar_per_tonne_CO2e.csv</w:t>
       </w:r>
       <w:r>
         <w:t>’</w:t>
@@ -15382,7 +16364,7 @@
         <w:pStyle w:val="ListParagraph"/>
         <w:numPr>
           <w:ilvl w:val="0"/>
-          <w:numId w:val="8"/>
+          <w:numId w:val="9"/>
         </w:numPr>
       </w:pPr>
       <w:r>
@@ -15396,7 +16378,7 @@
         <w:t xml:space="preserve">– </w:t>
       </w:r>
       <w:r>
-        <w:t>Digester Coproduct Prices</w:t>
+        <w:t>Carbon Credit Prices</w:t>
       </w:r>
     </w:p>
     <w:p>
@@ -15418,19 +16400,7 @@
         <w:t xml:space="preserve">– </w:t>
       </w:r>
       <w:r>
-        <w:t>P</w:t>
-      </w:r>
-      <w:r>
-        <w:t xml:space="preserve">hosphorus </w:t>
-      </w:r>
-      <w:r>
-        <w:t>Fertilizer Digester Coproduct</w:t>
-      </w:r>
-      <w:r>
-        <w:t xml:space="preserve"> </w:t>
-      </w:r>
-      <w:r>
-        <w:t>sales price</w:t>
+        <w:t>Enteric Carbon Credit Pricing</w:t>
       </w:r>
     </w:p>
     <w:p>
@@ -15452,10 +16422,25 @@
         <w:t xml:space="preserve">– U.S. dollars per </w:t>
       </w:r>
       <w:r>
-        <w:t xml:space="preserve">kilogram of </w:t>
-      </w:r>
-      <w:r>
-        <w:t>phosphorus</w:t>
+        <w:t>tonne of CO</w:t>
+      </w:r>
+      <w:r>
+        <w:rPr>
+          <w:vertAlign w:val="subscript"/>
+        </w:rPr>
+        <w:t>2</w:t>
+      </w:r>
+      <w:r>
+        <w:rPr>
+          <w:vertAlign w:val="subscript"/>
+        </w:rPr>
+        <w:t>-</w:t>
+      </w:r>
+      <w:r>
+        <w:rPr>
+          <w:vertAlign w:val="subscript"/>
+        </w:rPr>
+        <w:t>eq</w:t>
       </w:r>
     </w:p>
     <w:p>
@@ -15477,296 +16462,6 @@
         <w:t xml:space="preserve">– </w:t>
       </w:r>
       <w:r>
-        <w:t>There is no historical data available for this variable and it will have a user specific value. Therefore, all values in the CSV are zero and will be overwritten by the user defined value if entered.</w:t>
-      </w:r>
-    </w:p>
-    <w:p>
-      <w:pPr>
-        <w:pStyle w:val="ListParagraph"/>
-        <w:numPr>
-          <w:ilvl w:val="0"/>
-          <w:numId w:val="1"/>
-        </w:numPr>
-      </w:pPr>
-      <w:r>
-        <w:rPr>
-          <w:b/>
-          <w:bCs/>
-        </w:rPr>
-        <w:t xml:space="preserve">Data Conversions </w:t>
-      </w:r>
-      <w:r>
-        <w:t xml:space="preserve">– </w:t>
-      </w:r>
-      <w:r>
-        <w:t>None</w:t>
-      </w:r>
-    </w:p>
-    <w:p/>
-    <w:p>
-      <w:r>
-        <w:t>File: ‘</w:t>
-      </w:r>
-      <w:r>
-        <w:t>commodity_prices.digester_fertilizer_coproduct.dollars_per_kg_</w:t>
-      </w:r>
-      <w:r>
-        <w:t>bedding</w:t>
-      </w:r>
-      <w:r>
-        <w:t>.csv</w:t>
-      </w:r>
-      <w:r>
-        <w:t>’</w:t>
-      </w:r>
-    </w:p>
-    <w:p>
-      <w:pPr>
-        <w:pStyle w:val="ListParagraph"/>
-        <w:numPr>
-          <w:ilvl w:val="0"/>
-          <w:numId w:val="8"/>
-        </w:numPr>
-      </w:pPr>
-      <w:r>
-        <w:rPr>
-          <w:b/>
-          <w:bCs/>
-        </w:rPr>
-        <w:t xml:space="preserve">Primary Data Type </w:t>
-      </w:r>
-      <w:r>
-        <w:t xml:space="preserve">– </w:t>
-      </w:r>
-      <w:r>
-        <w:t>Digester Coproduct Prices</w:t>
-      </w:r>
-    </w:p>
-    <w:p>
-      <w:pPr>
-        <w:pStyle w:val="ListParagraph"/>
-        <w:numPr>
-          <w:ilvl w:val="0"/>
-          <w:numId w:val="1"/>
-        </w:numPr>
-      </w:pPr>
-      <w:r>
-        <w:rPr>
-          <w:b/>
-          <w:bCs/>
-        </w:rPr>
-        <w:t xml:space="preserve">Data Subtype </w:t>
-      </w:r>
-      <w:r>
-        <w:t xml:space="preserve">– </w:t>
-      </w:r>
-      <w:r>
-        <w:t>B</w:t>
-      </w:r>
-      <w:r>
-        <w:t xml:space="preserve">edding </w:t>
-      </w:r>
-      <w:r>
-        <w:t>Digester Coproduct</w:t>
-      </w:r>
-      <w:r>
-        <w:t xml:space="preserve"> </w:t>
-      </w:r>
-      <w:r>
-        <w:t>sales price</w:t>
-      </w:r>
-    </w:p>
-    <w:p>
-      <w:pPr>
-        <w:pStyle w:val="ListParagraph"/>
-        <w:numPr>
-          <w:ilvl w:val="0"/>
-          <w:numId w:val="1"/>
-        </w:numPr>
-      </w:pPr>
-      <w:r>
-        <w:rPr>
-          <w:b/>
-          <w:bCs/>
-        </w:rPr>
-        <w:t xml:space="preserve">Units </w:t>
-      </w:r>
-      <w:r>
-        <w:t xml:space="preserve">– U.S. dollars per </w:t>
-      </w:r>
-      <w:r>
-        <w:t xml:space="preserve">kilogram of </w:t>
-      </w:r>
-      <w:r>
-        <w:t>bedding</w:t>
-      </w:r>
-    </w:p>
-    <w:p>
-      <w:pPr>
-        <w:pStyle w:val="ListParagraph"/>
-        <w:numPr>
-          <w:ilvl w:val="0"/>
-          <w:numId w:val="1"/>
-        </w:numPr>
-      </w:pPr>
-      <w:r>
-        <w:rPr>
-          <w:b/>
-          <w:bCs/>
-        </w:rPr>
-        <w:lastRenderedPageBreak/>
-        <w:t xml:space="preserve">Data source </w:t>
-      </w:r>
-      <w:r>
-        <w:t xml:space="preserve">– </w:t>
-      </w:r>
-      <w:r>
-        <w:t>There is no historical data available for this variable and it will have a user specific value. Therefore, all values in the CSV are zero and will be overwritten by the user defined value if entered.</w:t>
-      </w:r>
-    </w:p>
-    <w:p>
-      <w:pPr>
-        <w:pStyle w:val="ListParagraph"/>
-        <w:numPr>
-          <w:ilvl w:val="0"/>
-          <w:numId w:val="1"/>
-        </w:numPr>
-      </w:pPr>
-      <w:r>
-        <w:rPr>
-          <w:b/>
-          <w:bCs/>
-        </w:rPr>
-        <w:t xml:space="preserve">Data Conversions </w:t>
-      </w:r>
-      <w:r>
-        <w:t xml:space="preserve">– </w:t>
-      </w:r>
-      <w:r>
-        <w:t>None</w:t>
-      </w:r>
-    </w:p>
-    <w:p/>
-    <w:p>
-      <w:r>
-        <w:t>File: ‘</w:t>
-      </w:r>
-      <w:r>
-        <w:t>commodity_prices.digester_carbon_credits</w:t>
-      </w:r>
-      <w:r>
-        <w:t>.</w:t>
-      </w:r>
-      <w:r>
-        <w:t>dollar_per_tonne_CO2e.csv</w:t>
-      </w:r>
-      <w:r>
-        <w:t>’</w:t>
-      </w:r>
-    </w:p>
-    <w:p>
-      <w:pPr>
-        <w:pStyle w:val="ListParagraph"/>
-        <w:numPr>
-          <w:ilvl w:val="0"/>
-          <w:numId w:val="9"/>
-        </w:numPr>
-      </w:pPr>
-      <w:r>
-        <w:rPr>
-          <w:b/>
-          <w:bCs/>
-        </w:rPr>
-        <w:t xml:space="preserve">Primary Data Type </w:t>
-      </w:r>
-      <w:r>
-        <w:t xml:space="preserve">– </w:t>
-      </w:r>
-      <w:r>
-        <w:t>Carbon Credit Prices</w:t>
-      </w:r>
-    </w:p>
-    <w:p>
-      <w:pPr>
-        <w:pStyle w:val="ListParagraph"/>
-        <w:numPr>
-          <w:ilvl w:val="0"/>
-          <w:numId w:val="1"/>
-        </w:numPr>
-      </w:pPr>
-      <w:r>
-        <w:rPr>
-          <w:b/>
-          <w:bCs/>
-        </w:rPr>
-        <w:t xml:space="preserve">Data Subtype </w:t>
-      </w:r>
-      <w:r>
-        <w:t xml:space="preserve">– </w:t>
-      </w:r>
-      <w:r>
-        <w:t>Enteric Carbon Credit Pricing</w:t>
-      </w:r>
-    </w:p>
-    <w:p>
-      <w:pPr>
-        <w:pStyle w:val="ListParagraph"/>
-        <w:numPr>
-          <w:ilvl w:val="0"/>
-          <w:numId w:val="1"/>
-        </w:numPr>
-      </w:pPr>
-      <w:r>
-        <w:rPr>
-          <w:b/>
-          <w:bCs/>
-        </w:rPr>
-        <w:t xml:space="preserve">Units </w:t>
-      </w:r>
-      <w:r>
-        <w:t xml:space="preserve">– U.S. dollars per </w:t>
-      </w:r>
-      <w:r>
-        <w:t>tonne of CO</w:t>
-      </w:r>
-      <w:r>
-        <w:rPr>
-          <w:vertAlign w:val="subscript"/>
-        </w:rPr>
-        <w:t>2</w:t>
-      </w:r>
-      <w:r>
-        <w:rPr>
-          <w:vertAlign w:val="subscript"/>
-        </w:rPr>
-        <w:t>-</w:t>
-      </w:r>
-      <w:r>
-        <w:rPr>
-          <w:vertAlign w:val="subscript"/>
-        </w:rPr>
-        <w:t>eq</w:t>
-      </w:r>
-    </w:p>
-    <w:p>
-      <w:pPr>
-        <w:pStyle w:val="ListParagraph"/>
-        <w:numPr>
-          <w:ilvl w:val="0"/>
-          <w:numId w:val="1"/>
-        </w:numPr>
-      </w:pPr>
-      <w:r>
-        <w:rPr>
-          <w:b/>
-          <w:bCs/>
-        </w:rPr>
-        <w:t xml:space="preserve">Data source </w:t>
-      </w:r>
-      <w:r>
-        <w:t xml:space="preserve">– </w:t>
-      </w:r>
-      <w:r>
         <w:t>There is no historical data available for this variable. Therefore, the default value of $60/t</w:t>
       </w:r>
       <w:r>
@@ -15779,7 +16474,15 @@
         <w:t xml:space="preserve">California Low </w:t>
       </w:r>
       <w:r>
-        <w:t>Carbon Fuels Standard (LCFS) in 2024 as reported by Navius Research [</w:t>
+        <w:t xml:space="preserve">Carbon Fuels Standard (LCFS) in 2024 as reported by </w:t>
+      </w:r>
+      <w:proofErr w:type="spellStart"/>
+      <w:r>
+        <w:t>Navius</w:t>
+      </w:r>
+      <w:proofErr w:type="spellEnd"/>
+      <w:r>
+        <w:t xml:space="preserve"> Research [</w:t>
       </w:r>
       <w:hyperlink r:id="rId118" w:history="1">
         <w:r>
@@ -15894,6 +16597,7 @@
           <w:b/>
           <w:bCs/>
         </w:rPr>
+        <w:lastRenderedPageBreak/>
         <w:t xml:space="preserve">Units </w:t>
       </w:r>
       <w:r>
@@ -16087,11 +16791,7 @@
         <w:t xml:space="preserve">Data Conversions </w:t>
       </w:r>
       <w:r>
-        <w:t xml:space="preserve">– Tractor list prices were estimated using a linear regression line of tractor purchase price vs size in horsepower. Using the estimated tractor purchase price, </w:t>
-      </w:r>
-      <w:r>
-        <w:lastRenderedPageBreak/>
-        <w:t>geospatially hourly tractor prices were based on local labor wage rates and diesel fuel prices. Annual CAPEX values were indexed using the BLS Producer Price Index (PPI) for farm equipment manufacturing.</w:t>
+        <w:t>– Tractor list prices were estimated using a linear regression line of tractor purchase price vs size in horsepower. Using the estimated tractor purchase price, geospatially hourly tractor prices were based on local labor wage rates and diesel fuel prices. Annual CAPEX values were indexed using the BLS Producer Price Index (PPI) for farm equipment manufacturing.</w:t>
       </w:r>
     </w:p>
     <w:p/>
@@ -16303,6 +17003,7 @@
           <w:b/>
           <w:bCs/>
         </w:rPr>
+        <w:lastRenderedPageBreak/>
         <w:t xml:space="preserve">Units </w:t>
       </w:r>
       <w:r>
@@ -16333,8 +17034,13 @@
       <w:r>
         <w:t xml:space="preserve">Historical pricing data for land costs were gathered from the USDA </w:t>
       </w:r>
-      <w:r>
-        <w:t>Quickstats Portal. County level land purchase prices from 2017 were used where available [</w:t>
+      <w:proofErr w:type="spellStart"/>
+      <w:r>
+        <w:t>Quickstats</w:t>
+      </w:r>
+      <w:proofErr w:type="spellEnd"/>
+      <w:r>
+        <w:t xml:space="preserve"> Portal. County level land purchase prices from 2017 were used where available [</w:t>
       </w:r>
       <w:hyperlink r:id="rId123" w:history="1">
         <w:r>
@@ -16478,15 +17184,35 @@
             <w:rStyle w:val="Hyperlink"/>
             <w:color w:val="auto"/>
           </w:rPr>
-          <w:t>National Agricultural Statistics Service Quickstats web portal</w:t>
+          <w:t xml:space="preserve">National Agricultural Statistics Service </w:t>
+        </w:r>
+        <w:proofErr w:type="spellStart"/>
+        <w:r>
+          <w:rPr>
+            <w:rStyle w:val="Hyperlink"/>
+            <w:color w:val="auto"/>
+          </w:rPr>
+          <w:t>Quickstats</w:t>
+        </w:r>
+        <w:proofErr w:type="spellEnd"/>
+        <w:r>
+          <w:rPr>
+            <w:rStyle w:val="Hyperlink"/>
+            <w:color w:val="auto"/>
+          </w:rPr>
+          <w:t xml:space="preserve"> web portal</w:t>
         </w:r>
       </w:hyperlink>
       <w:r>
-        <w:t xml:space="preserve">. This data can be obtained by selecting Group: Expenses, Commodity: Labor, Category: Wage </w:t>
-      </w:r>
-      <w:r>
-        <w:lastRenderedPageBreak/>
-        <w:t>Rate, Data Item: Labor, Hired – Wage Rate, Measured in $ / Hour, Geographic Level: National + State, Year: All, Period Type: Annual, Period: Annual. State level values were then assigned uniformly to each county within the state. When state or data was unavailable, the U.S. mean value was used.</w:t>
+        <w:t xml:space="preserve">. This data can be obtained by selecting Group: Expenses, Commodity: Labor, Category: Wage Rate, Data Item: Labor, </w:t>
+      </w:r>
+      <w:proofErr w:type="gramStart"/>
+      <w:r>
+        <w:t>Hired</w:t>
+      </w:r>
+      <w:proofErr w:type="gramEnd"/>
+      <w:r>
+        <w:t xml:space="preserve"> – Wage Rate, Measured in $ / Hour, Geographic Level: National + State, Year: All, Period Type: Annual, Period: Annual. State level values were then assigned uniformly to each county within the state. When state or data was unavailable, the U.S. mean value was used.</w:t>
       </w:r>
     </w:p>
     <w:p>
@@ -16505,7 +17231,15 @@
         <w:t xml:space="preserve">Data Conversions </w:t>
       </w:r>
       <w:r>
-        <w:t>– No conversions were made to this data from that received from the USDA’s Quickstats web portal.</w:t>
+        <w:t xml:space="preserve">– No conversions were made to this data from that received from the USDA’s </w:t>
+      </w:r>
+      <w:proofErr w:type="spellStart"/>
+      <w:r>
+        <w:t>Quickstats</w:t>
+      </w:r>
+      <w:proofErr w:type="spellEnd"/>
+      <w:r>
+        <w:t xml:space="preserve"> web portal.</w:t>
       </w:r>
     </w:p>
     <w:p/>
@@ -16668,7 +17402,32 @@
         </w:numPr>
       </w:pPr>
       <w:r>
-        <w:t xml:space="preserve">Then the rates were converted from $/mi/truckload to $/mi/lbs by dividing by 45,000 lbs. 45,000 lbs was calculated using the assumed 80,000 lbs gross truckload weight and a truck + trailer weight of 35,000 lbs. </w:t>
+        <w:lastRenderedPageBreak/>
+        <w:t>Then the rates were converted from $/mi/truckload to $/mi/</w:t>
+      </w:r>
+      <w:proofErr w:type="spellStart"/>
+      <w:r>
+        <w:t>lbs</w:t>
+      </w:r>
+      <w:proofErr w:type="spellEnd"/>
+      <w:r>
+        <w:t xml:space="preserve"> by dividing by 45,000 lbs. 45,000 </w:t>
+      </w:r>
+      <w:proofErr w:type="spellStart"/>
+      <w:r>
+        <w:t>lbs</w:t>
+      </w:r>
+      <w:proofErr w:type="spellEnd"/>
+      <w:r>
+        <w:t xml:space="preserve"> was calculated using the assumed 80,000 </w:t>
+      </w:r>
+      <w:proofErr w:type="spellStart"/>
+      <w:r>
+        <w:t>lbs</w:t>
+      </w:r>
+      <w:proofErr w:type="spellEnd"/>
+      <w:r>
+        <w:t xml:space="preserve"> gross truckload weight and a truck + trailer weight of 35,000 lbs. </w:t>
       </w:r>
     </w:p>
     <w:p>
@@ -16713,7 +17472,7 @@
         <w:t>File: ‘</w:t>
       </w:r>
       <w:r>
-        <w:t>farm_services.manure_hauling.dollars_per_tonne_km.csv</w:t>
+        <w:t>capital_costs.land_ha.dollar_per_hectare.csv</w:t>
       </w:r>
       <w:r>
         <w:t>’</w:t>
@@ -16724,7 +17483,7 @@
         <w:pStyle w:val="ListParagraph"/>
         <w:numPr>
           <w:ilvl w:val="0"/>
-          <w:numId w:val="9"/>
+          <w:numId w:val="8"/>
         </w:numPr>
       </w:pPr>
       <w:r>
@@ -16738,7 +17497,7 @@
         <w:t xml:space="preserve">– </w:t>
       </w:r>
       <w:r>
-        <w:t>Transportation Costs</w:t>
+        <w:t>Land Costs</w:t>
       </w:r>
     </w:p>
     <w:p>
@@ -16760,7 +17519,7 @@
         <w:t xml:space="preserve">– </w:t>
       </w:r>
       <w:r>
-        <w:t>Manure Transportation</w:t>
+        <w:t>Agricultural land purchase prices</w:t>
       </w:r>
     </w:p>
     <w:p>
@@ -16782,7 +17541,7 @@
         <w:t xml:space="preserve">– U.S. dollars per </w:t>
       </w:r>
       <w:r>
-        <w:t>tonne per kilometer</w:t>
+        <w:t xml:space="preserve">hectare of land </w:t>
       </w:r>
     </w:p>
     <w:p>
@@ -16804,149 +17563,15 @@
         <w:t xml:space="preserve">– </w:t>
       </w:r>
       <w:r>
-        <w:t xml:space="preserve">No transportation data could be found for manure transport. Therefore, the same values were used as the </w:t>
-      </w:r>
-      <w:r>
-        <w:t>‘</w:t>
-      </w:r>
-      <w:r>
-        <w:t>farm_services.grain_transportation.dollars_per_tonne_km.csv</w:t>
-      </w:r>
-      <w:r>
-        <w:t>’. Refer to that entry above for data source and conversions.</w:t>
-      </w:r>
-    </w:p>
-    <w:p>
-      <w:pPr>
-        <w:pStyle w:val="ListParagraph"/>
-        <w:numPr>
-          <w:ilvl w:val="0"/>
-          <w:numId w:val="1"/>
-        </w:numPr>
-      </w:pPr>
-      <w:r>
-        <w:rPr>
-          <w:b/>
-          <w:bCs/>
-        </w:rPr>
-        <w:lastRenderedPageBreak/>
-        <w:t>Data Conversions</w:t>
-      </w:r>
-      <w:r>
-        <w:rPr>
-          <w:b/>
-          <w:bCs/>
-        </w:rPr>
-        <w:t xml:space="preserve"> </w:t>
-      </w:r>
-      <w:r>
-        <w:t xml:space="preserve">– </w:t>
-      </w:r>
-      <w:r>
-        <w:t>See above</w:t>
-      </w:r>
-    </w:p>
-    <w:p/>
-    <w:p>
-      <w:r>
-        <w:t>File: ‘</w:t>
-      </w:r>
-      <w:r>
-        <w:t>capital_costs.land_ha.dollar_per_hectare.csv</w:t>
-      </w:r>
-      <w:r>
-        <w:t>’</w:t>
-      </w:r>
-    </w:p>
-    <w:p>
-      <w:pPr>
-        <w:pStyle w:val="ListParagraph"/>
-        <w:numPr>
-          <w:ilvl w:val="0"/>
-          <w:numId w:val="8"/>
-        </w:numPr>
-      </w:pPr>
-      <w:r>
-        <w:rPr>
-          <w:b/>
-          <w:bCs/>
-        </w:rPr>
-        <w:t xml:space="preserve">Primary Data Type </w:t>
-      </w:r>
-      <w:r>
-        <w:t xml:space="preserve">– </w:t>
-      </w:r>
-      <w:r>
-        <w:t>Land Costs</w:t>
-      </w:r>
-    </w:p>
-    <w:p>
-      <w:pPr>
-        <w:pStyle w:val="ListParagraph"/>
-        <w:numPr>
-          <w:ilvl w:val="0"/>
-          <w:numId w:val="1"/>
-        </w:numPr>
-      </w:pPr>
-      <w:r>
-        <w:rPr>
-          <w:b/>
-          <w:bCs/>
-        </w:rPr>
-        <w:t xml:space="preserve">Data Subtype </w:t>
-      </w:r>
-      <w:r>
-        <w:t xml:space="preserve">– </w:t>
-      </w:r>
-      <w:r>
-        <w:t>Agricultural land purchase prices</w:t>
-      </w:r>
-    </w:p>
-    <w:p>
-      <w:pPr>
-        <w:pStyle w:val="ListParagraph"/>
-        <w:numPr>
-          <w:ilvl w:val="0"/>
-          <w:numId w:val="1"/>
-        </w:numPr>
-      </w:pPr>
-      <w:r>
-        <w:rPr>
-          <w:b/>
-          <w:bCs/>
-        </w:rPr>
-        <w:t xml:space="preserve">Units </w:t>
-      </w:r>
-      <w:r>
-        <w:t xml:space="preserve">– U.S. dollars per </w:t>
-      </w:r>
-      <w:r>
-        <w:t xml:space="preserve">hectare of land </w:t>
-      </w:r>
-    </w:p>
-    <w:p>
-      <w:pPr>
-        <w:pStyle w:val="ListParagraph"/>
-        <w:numPr>
-          <w:ilvl w:val="0"/>
-          <w:numId w:val="1"/>
-        </w:numPr>
-      </w:pPr>
-      <w:r>
-        <w:rPr>
-          <w:b/>
-          <w:bCs/>
-        </w:rPr>
-        <w:t xml:space="preserve">Data source </w:t>
-      </w:r>
-      <w:r>
-        <w:t xml:space="preserve">– </w:t>
-      </w:r>
-      <w:r>
         <w:t xml:space="preserve">Historical pricing data for land costs were gathered from the USDA </w:t>
       </w:r>
-      <w:r>
-        <w:t>Quickstats Portal. County level land purchase prices from 2017 were used where available [</w:t>
+      <w:proofErr w:type="spellStart"/>
+      <w:r>
+        <w:t>Quickstats</w:t>
+      </w:r>
+      <w:proofErr w:type="spellEnd"/>
+      <w:r>
+        <w:t xml:space="preserve"> Portal. County level land purchase prices from 2017 were used where available [</w:t>
       </w:r>
       <w:hyperlink r:id="rId126" w:history="1">
         <w:r>
@@ -16954,21 +17579,7 @@
             <w:rStyle w:val="Hyperlink"/>
             <w:color w:val="auto"/>
           </w:rPr>
-          <w:t>Original Da</w:t>
-        </w:r>
-        <w:r>
-          <w:rPr>
-            <w:rStyle w:val="Hyperlink"/>
-            <w:color w:val="auto"/>
-          </w:rPr>
-          <w:t>t</w:t>
-        </w:r>
-        <w:r>
-          <w:rPr>
-            <w:rStyle w:val="Hyperlink"/>
-            <w:color w:val="auto"/>
-          </w:rPr>
-          <w:t>a</w:t>
+          <w:t>Original Data</w:t>
         </w:r>
       </w:hyperlink>
       <w:r>
@@ -16980,21 +17591,7 @@
             <w:rStyle w:val="Hyperlink"/>
             <w:color w:val="auto"/>
           </w:rPr>
-          <w:t>Orig</w:t>
-        </w:r>
-        <w:r>
-          <w:rPr>
-            <w:rStyle w:val="Hyperlink"/>
-            <w:color w:val="auto"/>
-          </w:rPr>
-          <w:t>i</w:t>
-        </w:r>
-        <w:r>
-          <w:rPr>
-            <w:rStyle w:val="Hyperlink"/>
-            <w:color w:val="auto"/>
-          </w:rPr>
-          <w:t>nal Data</w:t>
+          <w:t>Original Data</w:t>
         </w:r>
       </w:hyperlink>
       <w:r>
@@ -17251,6 +17848,7 @@
           <w:bCs/>
           <w:color w:val="000000" w:themeColor="text1"/>
         </w:rPr>
+        <w:lastRenderedPageBreak/>
         <w:t xml:space="preserve">Data Subtype </w:t>
       </w:r>
       <w:r>
@@ -17309,14 +17907,7 @@
         <w:rPr>
           <w:color w:val="000000" w:themeColor="text1"/>
         </w:rPr>
-        <w:t xml:space="preserve">– There is limited historical geospatial data available for this variable. Therefore, the U.S. average values for labor hours for dairy cows were gathered from FINBIN - The Farm Financial Management Database by University of Minnesota - Center </w:t>
-      </w:r>
-      <w:r>
-        <w:rPr>
-          <w:color w:val="000000" w:themeColor="text1"/>
-        </w:rPr>
-        <w:lastRenderedPageBreak/>
-        <w:t>for Farm Financial Management [</w:t>
+        <w:t>– There is limited historical geospatial data available for this variable. Therefore, the U.S. average values for labor hours for dairy cows were gathered from FINBIN - The Farm Financial Management Database by University of Minnesota - Center for Farm Financial Management [</w:t>
       </w:r>
       <w:hyperlink r:id="rId129" w:history="1">
         <w:r>
@@ -17632,8 +18223,16 @@
         <w:rPr>
           <w:color w:val="000000" w:themeColor="text1"/>
         </w:rPr>
-        <w:t>– Labor hours for management for dairy cows excluding manure mangement</w:t>
-      </w:r>
+        <w:t xml:space="preserve">– Labor hours for management for dairy cows excluding manure </w:t>
+      </w:r>
+      <w:proofErr w:type="spellStart"/>
+      <w:r>
+        <w:rPr>
+          <w:color w:val="000000" w:themeColor="text1"/>
+        </w:rPr>
+        <w:t>mangement</w:t>
+      </w:r>
+      <w:proofErr w:type="spellEnd"/>
     </w:p>
     <w:p>
       <w:pPr>
@@ -17725,7 +18324,14 @@
         <w:rPr>
           <w:color w:val="000000" w:themeColor="text1"/>
         </w:rPr>
-        <w:t xml:space="preserve"> percentile values. The median percentage of manure management on a farm was calculated to be 96.18%.</w:t>
+        <w:t xml:space="preserve"> </w:t>
+      </w:r>
+      <w:r>
+        <w:rPr>
+          <w:color w:val="000000" w:themeColor="text1"/>
+        </w:rPr>
+        <w:lastRenderedPageBreak/>
+        <w:t>percentile values. The median percentage of manure management on a farm was calculated to be 96.18%.</w:t>
       </w:r>
     </w:p>
     <w:p>
@@ -19519,7 +20125,7 @@
   <w:style w:type="paragraph" w:default="1" w:styleId="Normal">
     <w:name w:val="Normal"/>
     <w:qFormat/>
-    <w:rsid w:val="00AF0208"/>
+    <w:rsid w:val="009E2BAC"/>
     <w:pPr>
       <w:spacing w:after="160" w:line="278" w:lineRule="auto"/>
     </w:pPr>
@@ -19533,7 +20139,7 @@
     <w:uiPriority w:val="1"/>
     <w:semiHidden/>
     <w:unhideWhenUsed/>
-    <w:rsid w:val="00AF0208"/>
+    <w:rsid w:val="009E2BAC"/>
   </w:style>
   <w:style w:type="table" w:default="1" w:styleId="TableNormal">
     <w:name w:val="Normal Table"/>
@@ -19555,7 +20161,7 @@
     <w:uiPriority w:val="99"/>
     <w:semiHidden/>
     <w:unhideWhenUsed/>
-    <w:rsid w:val="00AF0208"/>
+    <w:rsid w:val="009E2BAC"/>
   </w:style>
   <w:style w:type="character" w:styleId="Hyperlink">
     <w:name w:val="Hyperlink"/>

</xml_diff>

<commit_message>
Changing milk prices to per liter to per kilogram
</commit_message>
<xml_diff>
--- a/_RuFaS Input Files/_Data Dictionary.docx
+++ b/_RuFaS Input Files/_Data Dictionary.docx
@@ -18,27 +18,7 @@
           <w:sz w:val="28"/>
           <w:szCs w:val="28"/>
         </w:rPr>
-        <w:t xml:space="preserve">Data Dictionary for </w:t>
-      </w:r>
-      <w:proofErr w:type="spellStart"/>
-      <w:r>
-        <w:rPr>
-          <w:b/>
-          <w:bCs/>
-          <w:sz w:val="28"/>
-          <w:szCs w:val="28"/>
-        </w:rPr>
-        <w:t>RuFaS</w:t>
-      </w:r>
-      <w:proofErr w:type="spellEnd"/>
-      <w:r>
-        <w:rPr>
-          <w:b/>
-          <w:bCs/>
-          <w:sz w:val="28"/>
-          <w:szCs w:val="28"/>
-        </w:rPr>
-        <w:t xml:space="preserve"> Economic Module Inputs</w:t>
+        <w:t>Data Dictionary for RuFaS Economic Module Inputs</w:t>
       </w:r>
     </w:p>
     <w:p>
@@ -48,21 +28,12 @@
           <w:iCs/>
         </w:rPr>
       </w:pPr>
-      <w:proofErr w:type="spellStart"/>
       <w:r>
         <w:rPr>
           <w:i/>
           <w:iCs/>
         </w:rPr>
-        <w:t>RuFaS</w:t>
-      </w:r>
-      <w:proofErr w:type="spellEnd"/>
-      <w:r>
-        <w:rPr>
-          <w:i/>
-          <w:iCs/>
-        </w:rPr>
-        <w:t xml:space="preserve"> Units: </w:t>
+        <w:t xml:space="preserve">RuFaS Units: </w:t>
       </w:r>
       <w:hyperlink r:id="rId5" w:anchor="L8" w:history="1">
         <w:r>
@@ -1332,15 +1303,7 @@
         <w:t xml:space="preserve">The data included in this data dictionary includes the </w:t>
       </w:r>
       <w:r>
-        <w:t xml:space="preserve">input data used for the </w:t>
-      </w:r>
-      <w:proofErr w:type="spellStart"/>
-      <w:r>
-        <w:t>RuFaS</w:t>
-      </w:r>
-      <w:proofErr w:type="spellEnd"/>
-      <w:r>
-        <w:t xml:space="preserve"> Economic Module developed by Sustainability Science. </w:t>
+        <w:t xml:space="preserve">input data used for the RuFaS Economic Module developed by Sustainability Science. </w:t>
       </w:r>
       <w:r>
         <w:t xml:space="preserve"> </w:t>
@@ -1352,9 +1315,17 @@
         <w:t xml:space="preserve"> </w:t>
       </w:r>
       <w:r>
-        <w:t>All csv input files use the following format {data type</w:t>
-      </w:r>
-      <w:proofErr w:type="gramStart"/>
+        <w:t>All csv input files use the following format {data type}</w:t>
+      </w:r>
+      <w:r>
+        <w:t>.</w:t>
+      </w:r>
+      <w:r>
+        <w:t xml:space="preserve">{data </w:t>
+      </w:r>
+      <w:r>
+        <w:t>variable</w:t>
+      </w:r>
       <w:r>
         <w:t>}</w:t>
       </w:r>
@@ -1362,28 +1333,55 @@
         <w:t>.</w:t>
       </w:r>
       <w:r>
-        <w:t>{</w:t>
-      </w:r>
-      <w:proofErr w:type="gramEnd"/>
-      <w:r>
-        <w:t xml:space="preserve">data </w:t>
+        <w:t>{units}.csv</w:t>
+      </w:r>
+    </w:p>
+    <w:p>
+      <w:pPr>
+        <w:pStyle w:val="ListParagraph"/>
+        <w:numPr>
+          <w:ilvl w:val="0"/>
+          <w:numId w:val="7"/>
+        </w:numPr>
+      </w:pPr>
+      <w:r>
+        <w:t>{data type} represents the primary data category (</w:t>
+      </w:r>
+      <w:r>
+        <w:t>commodity_prices, farm_services</w:t>
+      </w:r>
+      <w:r>
+        <w:t>, etc.)</w:t>
+      </w:r>
+    </w:p>
+    <w:p>
+      <w:pPr>
+        <w:pStyle w:val="ListParagraph"/>
+        <w:numPr>
+          <w:ilvl w:val="0"/>
+          <w:numId w:val="7"/>
+        </w:numPr>
+      </w:pPr>
+      <w:r>
+        <w:t xml:space="preserve">{data </w:t>
+      </w:r>
+      <w:r>
+        <w:t xml:space="preserve">variable </w:t>
+      </w:r>
+      <w:r>
+        <w:t xml:space="preserve">} represents the </w:t>
       </w:r>
       <w:r>
         <w:t>variable</w:t>
       </w:r>
-      <w:proofErr w:type="gramStart"/>
-      <w:r>
-        <w:t>}</w:t>
-      </w:r>
-      <w:r>
-        <w:t>.</w:t>
-      </w:r>
-      <w:r>
-        <w:t>{</w:t>
-      </w:r>
-      <w:proofErr w:type="gramEnd"/>
-      <w:r>
-        <w:t>units}.csv</w:t>
+      <w:r>
+        <w:t xml:space="preserve"> that the data falls into or the specific name of the input represented (</w:t>
+      </w:r>
+      <w:r>
+        <w:t>diesel, elec_commerical, milk</w:t>
+      </w:r>
+      <w:r>
+        <w:t>, etc.)</w:t>
       </w:r>
     </w:p>
     <w:p>
@@ -1395,100 +1393,13 @@
         </w:numPr>
       </w:pPr>
       <w:r>
-        <w:t>{data type} represents the primary data category (</w:t>
-      </w:r>
-      <w:proofErr w:type="spellStart"/>
-      <w:r>
-        <w:t>commodity_prices</w:t>
-      </w:r>
-      <w:proofErr w:type="spellEnd"/>
-      <w:r>
-        <w:t xml:space="preserve">, </w:t>
-      </w:r>
-      <w:proofErr w:type="spellStart"/>
-      <w:r>
-        <w:t>farm_services</w:t>
-      </w:r>
-      <w:proofErr w:type="spellEnd"/>
-      <w:r>
-        <w:t>, etc.)</w:t>
-      </w:r>
-    </w:p>
-    <w:p>
-      <w:pPr>
-        <w:pStyle w:val="ListParagraph"/>
-        <w:numPr>
-          <w:ilvl w:val="0"/>
-          <w:numId w:val="7"/>
-        </w:numPr>
-      </w:pPr>
-      <w:r>
-        <w:t xml:space="preserve">{data </w:t>
-      </w:r>
-      <w:proofErr w:type="gramStart"/>
-      <w:r>
-        <w:t xml:space="preserve">variable </w:t>
-      </w:r>
-      <w:r>
-        <w:t>}</w:t>
-      </w:r>
-      <w:proofErr w:type="gramEnd"/>
-      <w:r>
-        <w:t xml:space="preserve"> represents the </w:t>
-      </w:r>
-      <w:r>
-        <w:t>variable</w:t>
-      </w:r>
-      <w:r>
-        <w:t xml:space="preserve"> that the data falls into or the specific name of the input represented (</w:t>
-      </w:r>
-      <w:r>
-        <w:t xml:space="preserve">diesel, </w:t>
-      </w:r>
-      <w:proofErr w:type="spellStart"/>
-      <w:r>
-        <w:t>elec_commerical</w:t>
-      </w:r>
-      <w:proofErr w:type="spellEnd"/>
-      <w:r>
-        <w:t>, milk</w:t>
-      </w:r>
-      <w:r>
-        <w:t>, etc.)</w:t>
-      </w:r>
-    </w:p>
-    <w:p>
-      <w:pPr>
-        <w:pStyle w:val="ListParagraph"/>
-        <w:numPr>
-          <w:ilvl w:val="0"/>
-          <w:numId w:val="7"/>
-        </w:numPr>
-      </w:pPr>
-      <w:r>
         <w:t>{units} represents the units used for the data. Typically, US dollar per functional unit for the data type.</w:t>
       </w:r>
     </w:p>
     <w:p/>
     <w:p>
       <w:r>
-        <w:t>Each input file follows the same format. The first column “</w:t>
-      </w:r>
-      <w:proofErr w:type="spellStart"/>
-      <w:r>
-        <w:t>fips</w:t>
-      </w:r>
-      <w:proofErr w:type="spellEnd"/>
-      <w:r>
-        <w:t>” represents the Federal Information Processing Standard code which is a numeric code that uniquely identifies individual counties in the United States. The first row (</w:t>
-      </w:r>
-      <w:proofErr w:type="spellStart"/>
-      <w:r>
-        <w:t>fips</w:t>
-      </w:r>
-      <w:proofErr w:type="spellEnd"/>
-      <w:r>
-        <w:t xml:space="preserve"> = 01) is used to represent the U.S. mean value. Subsequent columns represent the years which the data represents (“2021” contains the prices for each county in the year 2021)</w:t>
+        <w:t>Each input file follows the same format. The first column “fips” represents the Federal Information Processing Standard code which is a numeric code that uniquely identifies individual counties in the United States. The first row (fips = 01) is used to represent the U.S. mean value. Subsequent columns represent the years which the data represents (“2021” contains the prices for each county in the year 2021)</w:t>
       </w:r>
       <w:r>
         <w:t>.</w:t>
@@ -1626,23 +1537,7 @@
             <w:rStyle w:val="Hyperlink"/>
             <w:color w:val="auto"/>
           </w:rPr>
-          <w:t xml:space="preserve">National Agricultural Statistics Service </w:t>
-        </w:r>
-        <w:proofErr w:type="spellStart"/>
-        <w:r>
-          <w:rPr>
-            <w:rStyle w:val="Hyperlink"/>
-            <w:color w:val="auto"/>
-          </w:rPr>
-          <w:t>Quickstats</w:t>
-        </w:r>
-        <w:proofErr w:type="spellEnd"/>
-        <w:r>
-          <w:rPr>
-            <w:rStyle w:val="Hyperlink"/>
-            <w:color w:val="auto"/>
-          </w:rPr>
-          <w:t xml:space="preserve"> web portal</w:t>
+          <w:t>National Agricultural Statistics Service Quickstats web portal</w:t>
         </w:r>
       </w:hyperlink>
       <w:r>
@@ -1668,28 +1563,7 @@
         <w:t xml:space="preserve">– </w:t>
       </w:r>
       <w:r>
-        <w:t xml:space="preserve">USDA provided cattle prices in dollars per CWT (100 </w:t>
-      </w:r>
-      <w:proofErr w:type="spellStart"/>
-      <w:r>
-        <w:t>lbs</w:t>
-      </w:r>
-      <w:proofErr w:type="spellEnd"/>
-      <w:proofErr w:type="gramStart"/>
-      <w:r>
-        <w:t>),</w:t>
-      </w:r>
-      <w:proofErr w:type="gramEnd"/>
-      <w:r>
-        <w:t xml:space="preserve"> therefore USDA values were divided by 45.3592 (kg/100 </w:t>
-      </w:r>
-      <w:proofErr w:type="spellStart"/>
-      <w:r>
-        <w:t>lbs</w:t>
-      </w:r>
-      <w:proofErr w:type="spellEnd"/>
-      <w:r>
-        <w:t>) to get prices in $/kg.</w:t>
+        <w:t>USDA provided cattle prices in dollars per CWT (100 lbs), therefore USDA values were divided by 45.3592 (kg/100 lbs) to get prices in $/kg.</w:t>
       </w:r>
     </w:p>
     <w:p/>
@@ -1779,23 +1653,7 @@
             <w:rStyle w:val="Hyperlink"/>
             <w:color w:val="auto"/>
           </w:rPr>
-          <w:t xml:space="preserve">National Agricultural Statistics Service </w:t>
-        </w:r>
-        <w:proofErr w:type="spellStart"/>
-        <w:r>
-          <w:rPr>
-            <w:rStyle w:val="Hyperlink"/>
-            <w:color w:val="auto"/>
-          </w:rPr>
-          <w:t>Quickstats</w:t>
-        </w:r>
-        <w:proofErr w:type="spellEnd"/>
-        <w:r>
-          <w:rPr>
-            <w:rStyle w:val="Hyperlink"/>
-            <w:color w:val="auto"/>
-          </w:rPr>
-          <w:t xml:space="preserve"> web portal</w:t>
+          <w:t>National Agricultural Statistics Service Quickstats web portal</w:t>
         </w:r>
       </w:hyperlink>
       <w:r>
@@ -1818,28 +1676,7 @@
         <w:t xml:space="preserve">Data Conversions </w:t>
       </w:r>
       <w:r>
-        <w:t xml:space="preserve">– USDA provided cattle prices in dollars per CWT (100 </w:t>
-      </w:r>
-      <w:proofErr w:type="spellStart"/>
-      <w:r>
-        <w:t>lbs</w:t>
-      </w:r>
-      <w:proofErr w:type="spellEnd"/>
-      <w:proofErr w:type="gramStart"/>
-      <w:r>
-        <w:t>),</w:t>
-      </w:r>
-      <w:proofErr w:type="gramEnd"/>
-      <w:r>
-        <w:t xml:space="preserve"> therefore USDA values were divided by 45.3592 (kg/100 </w:t>
-      </w:r>
-      <w:proofErr w:type="spellStart"/>
-      <w:r>
-        <w:t>lbs</w:t>
-      </w:r>
-      <w:proofErr w:type="spellEnd"/>
-      <w:r>
-        <w:t>) to get prices in $/kg.</w:t>
+        <w:t>– USDA provided cattle prices in dollars per CWT (100 lbs), therefore USDA values were divided by 45.3592 (kg/100 lbs) to get prices in $/kg.</w:t>
       </w:r>
     </w:p>
     <w:p/>
@@ -1942,23 +1779,7 @@
             <w:rStyle w:val="Hyperlink"/>
             <w:color w:val="auto"/>
           </w:rPr>
-          <w:t xml:space="preserve">National Agricultural Statistics Service </w:t>
-        </w:r>
-        <w:proofErr w:type="spellStart"/>
-        <w:r>
-          <w:rPr>
-            <w:rStyle w:val="Hyperlink"/>
-            <w:color w:val="auto"/>
-          </w:rPr>
-          <w:t>Quickstats</w:t>
-        </w:r>
-        <w:proofErr w:type="spellEnd"/>
-        <w:r>
-          <w:rPr>
-            <w:rStyle w:val="Hyperlink"/>
-            <w:color w:val="auto"/>
-          </w:rPr>
-          <w:t xml:space="preserve"> web portal</w:t>
+          <w:t>National Agricultural Statistics Service Quickstats web portal</w:t>
         </w:r>
       </w:hyperlink>
       <w:r>
@@ -1987,15 +1808,7 @@
         <w:t xml:space="preserve">Data Conversions </w:t>
       </w:r>
       <w:r>
-        <w:t xml:space="preserve">– No conversions were made to this data from that received from the USDA’s </w:t>
-      </w:r>
-      <w:proofErr w:type="spellStart"/>
-      <w:r>
-        <w:t>Quickstats</w:t>
-      </w:r>
-      <w:proofErr w:type="spellEnd"/>
-      <w:r>
-        <w:t xml:space="preserve"> web portal.</w:t>
+        <w:t>– No conversions were made to this data from that received from the USDA’s Quickstats web portal.</w:t>
       </w:r>
     </w:p>
     <w:p/>
@@ -2004,24 +1817,18 @@
         <w:t>File: ‘</w:t>
       </w:r>
       <w:r>
-        <w:t>commodity_</w:t>
-      </w:r>
-      <w:proofErr w:type="gramStart"/>
-      <w:r>
-        <w:t>prices.</w:t>
+        <w:t>commodity_prices.</w:t>
       </w:r>
       <w:commentRangeStart w:id="0"/>
       <w:r>
-        <w:t>cows</w:t>
-      </w:r>
-      <w:proofErr w:type="gramEnd"/>
-      <w:r>
-        <w:t>_ge_500</w:t>
+        <w:t>cows_ge_500</w:t>
       </w:r>
       <w:commentRangeEnd w:id="0"/>
       <w:r>
         <w:rPr>
           <w:rStyle w:val="CommentReference"/>
+          <w:sz w:val="24"/>
+          <w:szCs w:val="24"/>
         </w:rPr>
         <w:commentReference w:id="0"/>
       </w:r>
@@ -2067,13 +1874,8 @@
         <w:t xml:space="preserve">– Price received for </w:t>
       </w:r>
       <w:r>
-        <w:t xml:space="preserve">cattle greater than or equal to 500 </w:t>
-      </w:r>
-      <w:proofErr w:type="spellStart"/>
-      <w:r>
-        <w:t>lbs</w:t>
-      </w:r>
-      <w:proofErr w:type="spellEnd"/>
+        <w:t>cattle greater than or equal to 500 lbs</w:t>
+      </w:r>
     </w:p>
     <w:p>
       <w:pPr>
@@ -2121,23 +1923,7 @@
             <w:rStyle w:val="Hyperlink"/>
             <w:color w:val="auto"/>
           </w:rPr>
-          <w:t xml:space="preserve">National Agricultural Statistics Service </w:t>
-        </w:r>
-        <w:proofErr w:type="spellStart"/>
-        <w:r>
-          <w:rPr>
-            <w:rStyle w:val="Hyperlink"/>
-            <w:color w:val="auto"/>
-          </w:rPr>
-          <w:t>Quickstats</w:t>
-        </w:r>
-        <w:proofErr w:type="spellEnd"/>
-        <w:r>
-          <w:rPr>
-            <w:rStyle w:val="Hyperlink"/>
-            <w:color w:val="auto"/>
-          </w:rPr>
-          <w:t xml:space="preserve"> web portal</w:t>
+          <w:t>National Agricultural Statistics Service Quickstats web portal</w:t>
         </w:r>
       </w:hyperlink>
       <w:r>
@@ -2166,28 +1952,7 @@
         <w:t xml:space="preserve">Data Conversions </w:t>
       </w:r>
       <w:r>
-        <w:t xml:space="preserve">– USDA provided cattle prices in dollars per CWT (100 </w:t>
-      </w:r>
-      <w:proofErr w:type="spellStart"/>
-      <w:r>
-        <w:t>lbs</w:t>
-      </w:r>
-      <w:proofErr w:type="spellEnd"/>
-      <w:proofErr w:type="gramStart"/>
-      <w:r>
-        <w:t>),</w:t>
-      </w:r>
-      <w:proofErr w:type="gramEnd"/>
-      <w:r>
-        <w:t xml:space="preserve"> therefore USDA values were divided by 45.3592 (kg/100 </w:t>
-      </w:r>
-      <w:proofErr w:type="spellStart"/>
-      <w:r>
-        <w:t>lbs</w:t>
-      </w:r>
-      <w:proofErr w:type="spellEnd"/>
-      <w:r>
-        <w:t>) to get prices in $/kg.</w:t>
+        <w:t>– USDA provided cattle prices in dollars per CWT (100 lbs), therefore USDA values were divided by 45.3592 (kg/100 lbs) to get prices in $/kg.</w:t>
       </w:r>
     </w:p>
     <w:p/>
@@ -2237,13 +2002,8 @@
         <w:t xml:space="preserve">Data Subtype </w:t>
       </w:r>
       <w:r>
-        <w:t xml:space="preserve">– Price received for Steers and Heifers greater than or equal to 500 </w:t>
-      </w:r>
-      <w:proofErr w:type="spellStart"/>
-      <w:r>
-        <w:t>lbs</w:t>
-      </w:r>
-      <w:proofErr w:type="spellEnd"/>
+        <w:t>– Price received for Steers and Heifers greater than or equal to 500 lbs</w:t>
+      </w:r>
     </w:p>
     <w:p>
       <w:pPr>
@@ -2291,23 +2051,7 @@
             <w:rStyle w:val="Hyperlink"/>
             <w:color w:val="auto"/>
           </w:rPr>
-          <w:t xml:space="preserve">National Agricultural Statistics Service </w:t>
-        </w:r>
-        <w:proofErr w:type="spellStart"/>
-        <w:r>
-          <w:rPr>
-            <w:rStyle w:val="Hyperlink"/>
-            <w:color w:val="auto"/>
-          </w:rPr>
-          <w:t>Quickstats</w:t>
-        </w:r>
-        <w:proofErr w:type="spellEnd"/>
-        <w:r>
-          <w:rPr>
-            <w:rStyle w:val="Hyperlink"/>
-            <w:color w:val="auto"/>
-          </w:rPr>
-          <w:t xml:space="preserve"> web portal</w:t>
+          <w:t>National Agricultural Statistics Service Quickstats web portal</w:t>
         </w:r>
       </w:hyperlink>
       <w:r>
@@ -2343,28 +2087,7 @@
         <w:t xml:space="preserve">– </w:t>
       </w:r>
       <w:r>
-        <w:t xml:space="preserve">USDA provided cattle prices in dollars per CWT (100 </w:t>
-      </w:r>
-      <w:proofErr w:type="spellStart"/>
-      <w:r>
-        <w:t>lbs</w:t>
-      </w:r>
-      <w:proofErr w:type="spellEnd"/>
-      <w:proofErr w:type="gramStart"/>
-      <w:r>
-        <w:t>),</w:t>
-      </w:r>
-      <w:proofErr w:type="gramEnd"/>
-      <w:r>
-        <w:t xml:space="preserve"> therefore USDA values were divided by 45.3592 (kg/100 </w:t>
-      </w:r>
-      <w:proofErr w:type="spellStart"/>
-      <w:r>
-        <w:t>lbs</w:t>
-      </w:r>
-      <w:proofErr w:type="spellEnd"/>
-      <w:r>
-        <w:t>) to get prices in $/kg.</w:t>
+        <w:t>USDA provided cattle prices in dollars per CWT (100 lbs), therefore USDA values were divided by 45.3592 (kg/100 lbs) to get prices in $/kg.</w:t>
       </w:r>
     </w:p>
     <w:p/>
@@ -2420,13 +2143,8 @@
         <w:t xml:space="preserve"> </w:t>
       </w:r>
       <w:r>
-        <w:t xml:space="preserve">Fresh Dairy Cow Replacements (recently gave birth and lactating) with weight 1,000-1,600 </w:t>
-      </w:r>
-      <w:proofErr w:type="spellStart"/>
-      <w:r>
-        <w:t>lbs</w:t>
-      </w:r>
-      <w:proofErr w:type="spellEnd"/>
+        <w:t>Fresh Dairy Cow Replacements (recently gave birth and lactating) with weight 1,000-1,600 lbs</w:t>
+      </w:r>
     </w:p>
     <w:p>
       <w:pPr>
@@ -2601,13 +2319,8 @@
         <w:t xml:space="preserve"> </w:t>
       </w:r>
       <w:r>
-        <w:t xml:space="preserve">T3 Bred Dairy Cow (mature and pregnant) with weight 1,000-1,600 </w:t>
-      </w:r>
-      <w:proofErr w:type="spellStart"/>
-      <w:r>
-        <w:t>lbs</w:t>
-      </w:r>
-      <w:proofErr w:type="spellEnd"/>
+        <w:t>T3 Bred Dairy Cow (mature and pregnant) with weight 1,000-1,600 lbs</w:t>
+      </w:r>
     </w:p>
     <w:p>
       <w:pPr>
@@ -2783,13 +2496,8 @@
         <w:t xml:space="preserve"> </w:t>
       </w:r>
       <w:r>
-        <w:t xml:space="preserve">T3 Bred Dairy Heifer (pregnant and never calved before) with weight 800-1,400 </w:t>
-      </w:r>
-      <w:proofErr w:type="spellStart"/>
-      <w:r>
-        <w:t>lbs</w:t>
-      </w:r>
-      <w:proofErr w:type="spellEnd"/>
+        <w:t>T3 Bred Dairy Heifer (pregnant and never calved before) with weight 800-1,400 lbs</w:t>
+      </w:r>
     </w:p>
     <w:p>
       <w:pPr>
@@ -2964,13 +2672,8 @@
         <w:t xml:space="preserve"> </w:t>
       </w:r>
       <w:r>
-        <w:t xml:space="preserve">Open Dairy Heifer (not yet been bred or is not currently pregnant) with weight 600-900 </w:t>
-      </w:r>
-      <w:proofErr w:type="spellStart"/>
-      <w:r>
-        <w:t>lbs</w:t>
-      </w:r>
-      <w:proofErr w:type="spellEnd"/>
+        <w:t>Open Dairy Heifer (not yet been bred or is not currently pregnant) with weight 600-900 lbs</w:t>
+      </w:r>
     </w:p>
     <w:p>
       <w:pPr>
@@ -3145,13 +2848,8 @@
         <w:t xml:space="preserve"> </w:t>
       </w:r>
       <w:r>
-        <w:t xml:space="preserve">No.1 Bull Calves (0-14 days) with weight 90-130 </w:t>
-      </w:r>
-      <w:proofErr w:type="spellStart"/>
-      <w:r>
-        <w:t>lbs</w:t>
-      </w:r>
-      <w:proofErr w:type="spellEnd"/>
+        <w:t>No.1 Bull Calves (0-14 days) with weight 90-130 lbs</w:t>
+      </w:r>
     </w:p>
     <w:p>
       <w:pPr>
@@ -3270,28 +2968,7 @@
         <w:t xml:space="preserve">– </w:t>
       </w:r>
       <w:r>
-        <w:t xml:space="preserve">USDA provided cattle prices in dollars per CWT (100 </w:t>
-      </w:r>
-      <w:proofErr w:type="spellStart"/>
-      <w:r>
-        <w:t>lbs</w:t>
-      </w:r>
-      <w:proofErr w:type="spellEnd"/>
-      <w:proofErr w:type="gramStart"/>
-      <w:r>
-        <w:t>),</w:t>
-      </w:r>
-      <w:proofErr w:type="gramEnd"/>
-      <w:r>
-        <w:t xml:space="preserve"> therefore USDA values were divided by 45.3592 (kg/100 </w:t>
-      </w:r>
-      <w:proofErr w:type="spellStart"/>
-      <w:r>
-        <w:t>lbs</w:t>
-      </w:r>
-      <w:proofErr w:type="spellEnd"/>
-      <w:r>
-        <w:t>) to get prices in $/kg.</w:t>
+        <w:t>USDA provided cattle prices in dollars per CWT (100 lbs), therefore USDA values were divided by 45.3592 (kg/100 lbs) to get prices in $/kg.</w:t>
       </w:r>
     </w:p>
     <w:p/>
@@ -3348,13 +3025,8 @@
         <w:t xml:space="preserve"> </w:t>
       </w:r>
       <w:r>
-        <w:t xml:space="preserve">No.2 Bull Calves (0-14 days) with weight 85-120 </w:t>
-      </w:r>
-      <w:proofErr w:type="spellStart"/>
-      <w:r>
-        <w:t>lbs</w:t>
-      </w:r>
-      <w:proofErr w:type="spellEnd"/>
+        <w:t>No.2 Bull Calves (0-14 days) with weight 85-120 lbs</w:t>
+      </w:r>
     </w:p>
     <w:p>
       <w:pPr>
@@ -3473,28 +3145,7 @@
         <w:t xml:space="preserve">– </w:t>
       </w:r>
       <w:r>
-        <w:t xml:space="preserve">USDA provided cattle prices in dollars per CWT (100 </w:t>
-      </w:r>
-      <w:proofErr w:type="spellStart"/>
-      <w:r>
-        <w:t>lbs</w:t>
-      </w:r>
-      <w:proofErr w:type="spellEnd"/>
-      <w:proofErr w:type="gramStart"/>
-      <w:r>
-        <w:t>),</w:t>
-      </w:r>
-      <w:proofErr w:type="gramEnd"/>
-      <w:r>
-        <w:t xml:space="preserve"> therefore USDA values were divided by 45.3592 (kg/100 </w:t>
-      </w:r>
-      <w:proofErr w:type="spellStart"/>
-      <w:r>
-        <w:t>lbs</w:t>
-      </w:r>
-      <w:proofErr w:type="spellEnd"/>
-      <w:r>
-        <w:t>) to get prices in $/kg.</w:t>
+        <w:t>USDA provided cattle prices in dollars per CWT (100 lbs), therefore USDA values were divided by 45.3592 (kg/100 lbs) to get prices in $/kg.</w:t>
       </w:r>
     </w:p>
     <w:p/>
@@ -3550,13 +3201,8 @@
         <w:t xml:space="preserve"> </w:t>
       </w:r>
       <w:r>
-        <w:t xml:space="preserve">No.1 Heifer Calves (0-14 days) with weight 80-130 </w:t>
-      </w:r>
-      <w:proofErr w:type="spellStart"/>
-      <w:r>
-        <w:t>lbs</w:t>
-      </w:r>
-      <w:proofErr w:type="spellEnd"/>
+        <w:t>No.1 Heifer Calves (0-14 days) with weight 80-130 lbs</w:t>
+      </w:r>
     </w:p>
     <w:p>
       <w:pPr>
@@ -3675,28 +3321,7 @@
         <w:t xml:space="preserve">– </w:t>
       </w:r>
       <w:r>
-        <w:t xml:space="preserve">USDA provided cattle prices in dollars per CWT (100 </w:t>
-      </w:r>
-      <w:proofErr w:type="spellStart"/>
-      <w:r>
-        <w:t>lbs</w:t>
-      </w:r>
-      <w:proofErr w:type="spellEnd"/>
-      <w:proofErr w:type="gramStart"/>
-      <w:r>
-        <w:t>),</w:t>
-      </w:r>
-      <w:proofErr w:type="gramEnd"/>
-      <w:r>
-        <w:t xml:space="preserve"> therefore USDA values were divided by 45.3592 (kg/100 </w:t>
-      </w:r>
-      <w:proofErr w:type="spellStart"/>
-      <w:r>
-        <w:t>lbs</w:t>
-      </w:r>
-      <w:proofErr w:type="spellEnd"/>
-      <w:r>
-        <w:t>) to get prices in $/kg.</w:t>
+        <w:t>USDA provided cattle prices in dollars per CWT (100 lbs), therefore USDA values were divided by 45.3592 (kg/100 lbs) to get prices in $/kg.</w:t>
       </w:r>
     </w:p>
     <w:p/>
@@ -3752,13 +3377,8 @@
         <w:t xml:space="preserve"> </w:t>
       </w:r>
       <w:r>
-        <w:t xml:space="preserve">No.2 Heifer Calves (0-14 days) with weight 85-120 </w:t>
-      </w:r>
-      <w:proofErr w:type="spellStart"/>
-      <w:r>
-        <w:t>lbs</w:t>
-      </w:r>
-      <w:proofErr w:type="spellEnd"/>
+        <w:t>No.2 Heifer Calves (0-14 days) with weight 85-120 lbs</w:t>
+      </w:r>
     </w:p>
     <w:p>
       <w:pPr>
@@ -3878,28 +3498,7 @@
         <w:t xml:space="preserve">– </w:t>
       </w:r>
       <w:r>
-        <w:t xml:space="preserve">USDA provided cattle prices in dollars per CWT (100 </w:t>
-      </w:r>
-      <w:proofErr w:type="spellStart"/>
-      <w:r>
-        <w:t>lbs</w:t>
-      </w:r>
-      <w:proofErr w:type="spellEnd"/>
-      <w:proofErr w:type="gramStart"/>
-      <w:r>
-        <w:t>),</w:t>
-      </w:r>
-      <w:proofErr w:type="gramEnd"/>
-      <w:r>
-        <w:t xml:space="preserve"> therefore USDA values were divided by 45.3592 (kg/100 </w:t>
-      </w:r>
-      <w:proofErr w:type="spellStart"/>
-      <w:r>
-        <w:t>lbs</w:t>
-      </w:r>
-      <w:proofErr w:type="spellEnd"/>
-      <w:r>
-        <w:t>) to get prices in $/kg.</w:t>
+        <w:t>USDA provided cattle prices in dollars per CWT (100 lbs), therefore USDA values were divided by 45.3592 (kg/100 lbs) to get prices in $/kg.</w:t>
       </w:r>
     </w:p>
     <w:p/>
@@ -3955,15 +3554,7 @@
         <w:t xml:space="preserve"> </w:t>
       </w:r>
       <w:r>
-        <w:t xml:space="preserve">Feeder Holstein Steers (300-500 </w:t>
-      </w:r>
-      <w:proofErr w:type="spellStart"/>
-      <w:r>
-        <w:t>lbs</w:t>
-      </w:r>
-      <w:proofErr w:type="spellEnd"/>
-      <w:r>
-        <w:t>)</w:t>
+        <w:t>Feeder Holstein Steers (300-500 lbs)</w:t>
       </w:r>
     </w:p>
     <w:p>
@@ -4083,28 +3674,7 @@
         <w:t xml:space="preserve">– </w:t>
       </w:r>
       <w:r>
-        <w:t xml:space="preserve">USDA provided cattle prices in dollars per CWT (100 </w:t>
-      </w:r>
-      <w:proofErr w:type="spellStart"/>
-      <w:r>
-        <w:t>lbs</w:t>
-      </w:r>
-      <w:proofErr w:type="spellEnd"/>
-      <w:proofErr w:type="gramStart"/>
-      <w:r>
-        <w:t>),</w:t>
-      </w:r>
-      <w:proofErr w:type="gramEnd"/>
-      <w:r>
-        <w:t xml:space="preserve"> therefore USDA values were divided by 45.3592 (kg/100 </w:t>
-      </w:r>
-      <w:proofErr w:type="spellStart"/>
-      <w:r>
-        <w:t>lbs</w:t>
-      </w:r>
-      <w:proofErr w:type="spellEnd"/>
-      <w:r>
-        <w:t>) to get prices in $/kg.</w:t>
+        <w:t>USDA provided cattle prices in dollars per CWT (100 lbs), therefore USDA values were divided by 45.3592 (kg/100 lbs) to get prices in $/kg.</w:t>
       </w:r>
     </w:p>
     <w:p/>
@@ -4169,13 +3739,8 @@
         <w:t>Feeder Holstein Steers (</w:t>
       </w:r>
       <w:r>
-        <w:t xml:space="preserve">500-700 </w:t>
-      </w:r>
-      <w:proofErr w:type="spellStart"/>
-      <w:r>
-        <w:t>lbs</w:t>
-      </w:r>
-      <w:proofErr w:type="spellEnd"/>
+        <w:t>500-700 lbs</w:t>
+      </w:r>
       <w:r>
         <w:t>)</w:t>
       </w:r>
@@ -4297,28 +3862,7 @@
         <w:t xml:space="preserve">– </w:t>
       </w:r>
       <w:r>
-        <w:t xml:space="preserve">USDA provided cattle prices in dollars per CWT (100 </w:t>
-      </w:r>
-      <w:proofErr w:type="spellStart"/>
-      <w:r>
-        <w:t>lbs</w:t>
-      </w:r>
-      <w:proofErr w:type="spellEnd"/>
-      <w:proofErr w:type="gramStart"/>
-      <w:r>
-        <w:t>),</w:t>
-      </w:r>
-      <w:proofErr w:type="gramEnd"/>
-      <w:r>
-        <w:t xml:space="preserve"> therefore USDA values were divided by 45.3592 (kg/100 </w:t>
-      </w:r>
-      <w:proofErr w:type="spellStart"/>
-      <w:r>
-        <w:t>lbs</w:t>
-      </w:r>
-      <w:proofErr w:type="spellEnd"/>
-      <w:r>
-        <w:t>) to get prices in $/kg.</w:t>
+        <w:t>USDA provided cattle prices in dollars per CWT (100 lbs), therefore USDA values were divided by 45.3592 (kg/100 lbs) to get prices in $/kg.</w:t>
       </w:r>
     </w:p>
     <w:p/>
@@ -4383,13 +3927,8 @@
         <w:t>Feeder Holstein Steers (</w:t>
       </w:r>
       <w:r>
-        <w:t xml:space="preserve">700-1,000 </w:t>
-      </w:r>
-      <w:proofErr w:type="spellStart"/>
-      <w:r>
-        <w:t>lbs</w:t>
-      </w:r>
-      <w:proofErr w:type="spellEnd"/>
+        <w:t>700-1,000 lbs</w:t>
+      </w:r>
       <w:r>
         <w:t>)</w:t>
       </w:r>
@@ -4519,32 +4058,12 @@
         <w:t xml:space="preserve">– </w:t>
       </w:r>
       <w:r>
-        <w:t xml:space="preserve">USDA provided cattle prices in dollars per CWT (100 </w:t>
-      </w:r>
-      <w:proofErr w:type="spellStart"/>
-      <w:r>
-        <w:t>lbs</w:t>
-      </w:r>
-      <w:proofErr w:type="spellEnd"/>
-      <w:proofErr w:type="gramStart"/>
-      <w:r>
-        <w:t>),</w:t>
-      </w:r>
-      <w:proofErr w:type="gramEnd"/>
-      <w:r>
-        <w:t xml:space="preserve"> therefore USDA values were divided by 45.3592 (kg/100 </w:t>
-      </w:r>
-      <w:proofErr w:type="spellStart"/>
-      <w:r>
-        <w:t>lbs</w:t>
-      </w:r>
-      <w:proofErr w:type="spellEnd"/>
-      <w:r>
-        <w:t>) to get prices in $/kg.</w:t>
+        <w:t>USDA provided cattle prices in dollars per CWT (100 lbs), therefore USDA values were divided by 45.3592 (kg/100 lbs) to get prices in $/kg.</w:t>
       </w:r>
     </w:p>
     <w:p/>
     <w:p>
+      <w:commentRangeStart w:id="1"/>
       <w:r>
         <w:t>File: ‘commodity_prices.milk</w:t>
       </w:r>
@@ -4552,7 +4071,25 @@
         <w:t>_all</w:t>
       </w:r>
       <w:r>
-        <w:t>.dollar_per_liter.csv’</w:t>
+        <w:t>.dollar_per_</w:t>
+      </w:r>
+      <w:r>
+        <w:rPr>
+          <w:color w:val="000000" w:themeColor="text1"/>
+        </w:rPr>
+        <w:t>kilogram</w:t>
+      </w:r>
+      <w:r>
+        <w:t>.csv’</w:t>
+      </w:r>
+      <w:commentRangeEnd w:id="1"/>
+      <w:r>
+        <w:rPr>
+          <w:rStyle w:val="CommentReference"/>
+          <w:sz w:val="24"/>
+          <w:szCs w:val="24"/>
+        </w:rPr>
+        <w:commentReference w:id="1"/>
       </w:r>
     </w:p>
     <w:p>
@@ -4621,7 +4158,19 @@
         <w:t xml:space="preserve">Units </w:t>
       </w:r>
       <w:r>
-        <w:t>– U.S. dollars per liter of milk</w:t>
+        <w:t xml:space="preserve">– U.S. dollars per </w:t>
+      </w:r>
+      <w:r>
+        <w:rPr>
+          <w:color w:val="000000" w:themeColor="text1"/>
+        </w:rPr>
+        <w:t>kilogram</w:t>
+      </w:r>
+      <w:r>
+        <w:t xml:space="preserve"> </w:t>
+      </w:r>
+      <w:r>
+        <w:t>of milk</w:t>
       </w:r>
     </w:p>
     <w:p>
@@ -4648,23 +4197,7 @@
             <w:rStyle w:val="Hyperlink"/>
             <w:color w:val="auto"/>
           </w:rPr>
-          <w:t xml:space="preserve">National Agricultural Statistics Service </w:t>
-        </w:r>
-        <w:proofErr w:type="spellStart"/>
-        <w:r>
-          <w:rPr>
-            <w:rStyle w:val="Hyperlink"/>
-            <w:color w:val="auto"/>
-          </w:rPr>
-          <w:t>Quickstats</w:t>
-        </w:r>
-        <w:proofErr w:type="spellEnd"/>
-        <w:r>
-          <w:rPr>
-            <w:rStyle w:val="Hyperlink"/>
-            <w:color w:val="auto"/>
-          </w:rPr>
-          <w:t xml:space="preserve"> web portal</w:t>
+          <w:t>National Agricultural Statistics Service Quickstats web portal</w:t>
         </w:r>
       </w:hyperlink>
       <w:r>
@@ -4687,7 +4220,52 @@
         <w:t xml:space="preserve">Data Conversions </w:t>
       </w:r>
       <w:r>
-        <w:t>– Data from USDA were received in dollars per CWT (100 pounds), therefore values were divided by 44.05 (liters/100 pounds) to get prices in $/liters. Values were only kept for years 1980 and newer.</w:t>
+        <w:t xml:space="preserve">– </w:t>
+      </w:r>
+      <w:r>
+        <w:rPr>
+          <w:color w:val="000000" w:themeColor="text1"/>
+        </w:rPr>
+        <w:t xml:space="preserve">Data from USDA were received in dollars per CWT (100 pounds), therefore values were divided by </w:t>
+      </w:r>
+      <w:r>
+        <w:rPr>
+          <w:color w:val="000000" w:themeColor="text1"/>
+        </w:rPr>
+        <w:t>45.3592</w:t>
+      </w:r>
+      <w:r>
+        <w:rPr>
+          <w:color w:val="000000" w:themeColor="text1"/>
+        </w:rPr>
+        <w:t xml:space="preserve"> (</w:t>
+      </w:r>
+      <w:r>
+        <w:rPr>
+          <w:color w:val="000000" w:themeColor="text1"/>
+        </w:rPr>
+        <w:t>kilograms</w:t>
+      </w:r>
+      <w:r>
+        <w:rPr>
+          <w:color w:val="000000" w:themeColor="text1"/>
+        </w:rPr>
+        <w:t>/100 pounds) to get prices in $/</w:t>
+      </w:r>
+      <w:r>
+        <w:rPr>
+          <w:color w:val="000000" w:themeColor="text1"/>
+        </w:rPr>
+        <w:t>kg</w:t>
+      </w:r>
+      <w:r>
+        <w:rPr>
+          <w:color w:val="000000" w:themeColor="text1"/>
+        </w:rPr>
+        <w:t xml:space="preserve">. </w:t>
+      </w:r>
+      <w:r>
+        <w:t>Values were only kept for years 1980 and newer.</w:t>
       </w:r>
     </w:p>
     <w:p/>
@@ -4701,7 +4279,19 @@
         <w:rPr>
           <w:color w:val="000000" w:themeColor="text1"/>
         </w:rPr>
-        <w:t>File: ‘commodity_prices.milk_class_2.dollar_per_liter.csv’</w:t>
+        <w:t>File: ‘commodity_prices.milk_class_2.dollar_per_</w:t>
+      </w:r>
+      <w:r>
+        <w:rPr>
+          <w:color w:val="000000" w:themeColor="text1"/>
+        </w:rPr>
+        <w:t>kilogram</w:t>
+      </w:r>
+      <w:r>
+        <w:rPr>
+          <w:color w:val="000000" w:themeColor="text1"/>
+        </w:rPr>
+        <w:t>.csv’</w:t>
       </w:r>
     </w:p>
     <w:p>
@@ -4779,7 +4369,25 @@
         <w:rPr>
           <w:color w:val="000000" w:themeColor="text1"/>
         </w:rPr>
-        <w:t>– U.S. dollars per liter of milk</w:t>
+        <w:t xml:space="preserve">– U.S. dollars per </w:t>
+      </w:r>
+      <w:r>
+        <w:rPr>
+          <w:color w:val="000000" w:themeColor="text1"/>
+        </w:rPr>
+        <w:t>kilogram</w:t>
+      </w:r>
+      <w:r>
+        <w:rPr>
+          <w:color w:val="000000" w:themeColor="text1"/>
+        </w:rPr>
+        <w:t xml:space="preserve"> </w:t>
+      </w:r>
+      <w:r>
+        <w:rPr>
+          <w:color w:val="000000" w:themeColor="text1"/>
+        </w:rPr>
+        <w:t>of milk</w:t>
       </w:r>
     </w:p>
     <w:p>
@@ -4882,7 +4490,43 @@
         <w:rPr>
           <w:color w:val="000000" w:themeColor="text1"/>
         </w:rPr>
-        <w:t xml:space="preserve">– Data from USDA were received in dollars per CWT (100 pounds), therefore values were divided by 44.05 (liters/100 pounds) to get prices in $/liters. </w:t>
+        <w:t xml:space="preserve">– Data from USDA were received in dollars per CWT (100 pounds), therefore values were divided by </w:t>
+      </w:r>
+      <w:r>
+        <w:rPr>
+          <w:color w:val="000000" w:themeColor="text1"/>
+        </w:rPr>
+        <w:t>45.3592</w:t>
+      </w:r>
+      <w:r>
+        <w:rPr>
+          <w:color w:val="000000" w:themeColor="text1"/>
+        </w:rPr>
+        <w:t xml:space="preserve"> (</w:t>
+      </w:r>
+      <w:r>
+        <w:rPr>
+          <w:color w:val="000000" w:themeColor="text1"/>
+        </w:rPr>
+        <w:t>kilograms</w:t>
+      </w:r>
+      <w:r>
+        <w:rPr>
+          <w:color w:val="000000" w:themeColor="text1"/>
+        </w:rPr>
+        <w:t>/100 pounds) to get prices in $/</w:t>
+      </w:r>
+      <w:r>
+        <w:rPr>
+          <w:color w:val="000000" w:themeColor="text1"/>
+        </w:rPr>
+        <w:t>kg</w:t>
+      </w:r>
+      <w:r>
+        <w:rPr>
+          <w:color w:val="000000" w:themeColor="text1"/>
+        </w:rPr>
+        <w:t xml:space="preserve">. </w:t>
       </w:r>
     </w:p>
     <w:p>
@@ -4910,7 +4554,19 @@
           <w:color w:val="000000" w:themeColor="text1"/>
         </w:rPr>
         <w:lastRenderedPageBreak/>
-        <w:t>File: ‘commodity_prices.milk_class_3.dollar_per_liter.csv’</w:t>
+        <w:t>File: ‘commodity_prices.milk_class_3.dollar_per_</w:t>
+      </w:r>
+      <w:r>
+        <w:rPr>
+          <w:color w:val="000000" w:themeColor="text1"/>
+        </w:rPr>
+        <w:t>kilogram</w:t>
+      </w:r>
+      <w:r>
+        <w:rPr>
+          <w:color w:val="000000" w:themeColor="text1"/>
+        </w:rPr>
+        <w:t>.csv’</w:t>
       </w:r>
     </w:p>
     <w:p>
@@ -5000,7 +4656,25 @@
         <w:rPr>
           <w:color w:val="000000" w:themeColor="text1"/>
         </w:rPr>
-        <w:t>– U.S. dollars per liter of milk</w:t>
+        <w:t xml:space="preserve">– U.S. dollars per </w:t>
+      </w:r>
+      <w:r>
+        <w:rPr>
+          <w:color w:val="000000" w:themeColor="text1"/>
+        </w:rPr>
+        <w:t>kilogram</w:t>
+      </w:r>
+      <w:r>
+        <w:rPr>
+          <w:color w:val="000000" w:themeColor="text1"/>
+        </w:rPr>
+        <w:t xml:space="preserve"> </w:t>
+      </w:r>
+      <w:r>
+        <w:rPr>
+          <w:color w:val="000000" w:themeColor="text1"/>
+        </w:rPr>
+        <w:t>of milk</w:t>
       </w:r>
     </w:p>
     <w:p>
@@ -5103,7 +4777,43 @@
         <w:rPr>
           <w:color w:val="000000" w:themeColor="text1"/>
         </w:rPr>
-        <w:t xml:space="preserve">– Data from USDA were received in dollars per CWT (100 pounds), therefore values were divided by 44.05 (liters/100 pounds) to get prices in $/liters. </w:t>
+        <w:t xml:space="preserve">– Data from USDA were received in dollars per CWT (100 pounds), therefore values were divided by </w:t>
+      </w:r>
+      <w:r>
+        <w:rPr>
+          <w:color w:val="000000" w:themeColor="text1"/>
+        </w:rPr>
+        <w:t>45.3592</w:t>
+      </w:r>
+      <w:r>
+        <w:rPr>
+          <w:color w:val="000000" w:themeColor="text1"/>
+        </w:rPr>
+        <w:t xml:space="preserve"> (</w:t>
+      </w:r>
+      <w:r>
+        <w:rPr>
+          <w:color w:val="000000" w:themeColor="text1"/>
+        </w:rPr>
+        <w:t>kilograms</w:t>
+      </w:r>
+      <w:r>
+        <w:rPr>
+          <w:color w:val="000000" w:themeColor="text1"/>
+        </w:rPr>
+        <w:t>/100 pounds) to get prices in $/</w:t>
+      </w:r>
+      <w:r>
+        <w:rPr>
+          <w:color w:val="000000" w:themeColor="text1"/>
+        </w:rPr>
+        <w:t>kg</w:t>
+      </w:r>
+      <w:r>
+        <w:rPr>
+          <w:color w:val="000000" w:themeColor="text1"/>
+        </w:rPr>
+        <w:t xml:space="preserve">. </w:t>
       </w:r>
     </w:p>
     <w:p>
@@ -5135,7 +4845,19 @@
         <w:rPr>
           <w:color w:val="000000" w:themeColor="text1"/>
         </w:rPr>
-        <w:t>.dollar_per_liter.csv’</w:t>
+        <w:t>.dollar_per_</w:t>
+      </w:r>
+      <w:r>
+        <w:rPr>
+          <w:color w:val="000000" w:themeColor="text1"/>
+        </w:rPr>
+        <w:t>kilogram</w:t>
+      </w:r>
+      <w:r>
+        <w:rPr>
+          <w:color w:val="000000" w:themeColor="text1"/>
+        </w:rPr>
+        <w:t>.csv’</w:t>
       </w:r>
     </w:p>
     <w:p>
@@ -5225,7 +4947,25 @@
         <w:rPr>
           <w:color w:val="000000" w:themeColor="text1"/>
         </w:rPr>
-        <w:t>– U.S. dollars per liter of milk</w:t>
+        <w:t xml:space="preserve">– U.S. dollars per </w:t>
+      </w:r>
+      <w:r>
+        <w:rPr>
+          <w:color w:val="000000" w:themeColor="text1"/>
+        </w:rPr>
+        <w:t>kilogram</w:t>
+      </w:r>
+      <w:r>
+        <w:rPr>
+          <w:color w:val="000000" w:themeColor="text1"/>
+        </w:rPr>
+        <w:t xml:space="preserve"> </w:t>
+      </w:r>
+      <w:r>
+        <w:rPr>
+          <w:color w:val="000000" w:themeColor="text1"/>
+        </w:rPr>
+        <w:t>of milk</w:t>
       </w:r>
     </w:p>
     <w:p>
@@ -5328,7 +5068,43 @@
         <w:rPr>
           <w:color w:val="000000" w:themeColor="text1"/>
         </w:rPr>
-        <w:t xml:space="preserve">– Data from USDA were received in dollars per CWT (100 pounds), therefore values were divided by 44.05 (liters/100 pounds) to get prices in $/liters. </w:t>
+        <w:t xml:space="preserve">– Data from USDA were received in dollars per CWT (100 pounds), therefore values were divided by </w:t>
+      </w:r>
+      <w:r>
+        <w:rPr>
+          <w:color w:val="000000" w:themeColor="text1"/>
+        </w:rPr>
+        <w:t>45.3592</w:t>
+      </w:r>
+      <w:r>
+        <w:rPr>
+          <w:color w:val="000000" w:themeColor="text1"/>
+        </w:rPr>
+        <w:t xml:space="preserve"> (</w:t>
+      </w:r>
+      <w:r>
+        <w:rPr>
+          <w:color w:val="000000" w:themeColor="text1"/>
+        </w:rPr>
+        <w:t>kilograms</w:t>
+      </w:r>
+      <w:r>
+        <w:rPr>
+          <w:color w:val="000000" w:themeColor="text1"/>
+        </w:rPr>
+        <w:t>/100 pounds) to get prices in $/</w:t>
+      </w:r>
+      <w:r>
+        <w:rPr>
+          <w:color w:val="000000" w:themeColor="text1"/>
+        </w:rPr>
+        <w:t>kg</w:t>
+      </w:r>
+      <w:r>
+        <w:rPr>
+          <w:color w:val="000000" w:themeColor="text1"/>
+        </w:rPr>
+        <w:t xml:space="preserve">. </w:t>
       </w:r>
     </w:p>
     <w:p>
@@ -5743,15 +5519,7 @@
         <w:t xml:space="preserve">Data Conversions </w:t>
       </w:r>
       <w:r>
-        <w:t xml:space="preserve">– Values received from FRED were received in dollars per </w:t>
-      </w:r>
-      <w:proofErr w:type="gramStart"/>
-      <w:r>
-        <w:t>gallon</w:t>
-      </w:r>
-      <w:proofErr w:type="gramEnd"/>
-      <w:r>
-        <w:t xml:space="preserve"> so values were divided by 3.78541 (liters per gallon) to get prices in $/liter.</w:t>
+        <w:t>– Values received from FRED were received in dollars per gallon so values were divided by 3.78541 (liters per gallon) to get prices in $/liter.</w:t>
       </w:r>
     </w:p>
     <w:p>
@@ -7211,23 +6979,7 @@
             <w:rStyle w:val="Hyperlink"/>
             <w:color w:val="auto"/>
           </w:rPr>
-          <w:t xml:space="preserve">National Agricultural Statistics Service </w:t>
-        </w:r>
-        <w:proofErr w:type="spellStart"/>
-        <w:r>
-          <w:rPr>
-            <w:rStyle w:val="Hyperlink"/>
-            <w:color w:val="auto"/>
-          </w:rPr>
-          <w:t>Quickstats</w:t>
-        </w:r>
-        <w:proofErr w:type="spellEnd"/>
-        <w:r>
-          <w:rPr>
-            <w:rStyle w:val="Hyperlink"/>
-            <w:color w:val="auto"/>
-          </w:rPr>
-          <w:t xml:space="preserve"> web portal</w:t>
+          <w:t>National Agricultural Statistics Service Quickstats web portal</w:t>
         </w:r>
       </w:hyperlink>
       <w:r>
@@ -7461,15 +7213,7 @@
         </w:r>
       </w:hyperlink>
       <w:r>
-        <w:t xml:space="preserve">. Data is provided weekly using the parameters for “Commodities” as “Almond Hulls” and “Report” as “National </w:t>
-      </w:r>
-      <w:proofErr w:type="gramStart"/>
-      <w:r>
-        <w:t>Mill-Feeds</w:t>
-      </w:r>
-      <w:proofErr w:type="gramEnd"/>
-      <w:r>
-        <w:t xml:space="preserve"> and Miscellaneous Feedstuff Report” then selecting the appropriate date. Reported weekly data is provided for multiple locations in California. As such, the mean of the individual weekly prices was taken to get an overall mean for the week. The annual mean almond hull price was then taken as the average of the calculated weekly prices. Since data was only provided for locations in California, these values were assumed to be representative of the nation average. </w:t>
+        <w:t xml:space="preserve">. Data is provided weekly using the parameters for “Commodities” as “Almond Hulls” and “Report” as “National Mill-Feeds and Miscellaneous Feedstuff Report” then selecting the appropriate date. Reported weekly data is provided for multiple locations in California. As such, the mean of the individual weekly prices was taken to get an overall mean for the week. The annual mean almond hull price was then taken as the average of the calculated weekly prices. Since data was only provided for locations in California, these values were assumed to be representative of the nation average. </w:t>
       </w:r>
     </w:p>
     <w:p>
@@ -8252,23 +7996,7 @@
             <w:rStyle w:val="Hyperlink"/>
             <w:color w:val="auto"/>
           </w:rPr>
-          <w:t xml:space="preserve">National Agricultural Statistics Service </w:t>
-        </w:r>
-        <w:proofErr w:type="spellStart"/>
-        <w:r>
-          <w:rPr>
-            <w:rStyle w:val="Hyperlink"/>
-            <w:color w:val="auto"/>
-          </w:rPr>
-          <w:t>Quickstats</w:t>
-        </w:r>
-        <w:proofErr w:type="spellEnd"/>
-        <w:r>
-          <w:rPr>
-            <w:rStyle w:val="Hyperlink"/>
-            <w:color w:val="auto"/>
-          </w:rPr>
-          <w:t xml:space="preserve"> web portal</w:t>
+          <w:t>National Agricultural Statistics Service Quickstats web portal</w:t>
         </w:r>
       </w:hyperlink>
       <w:r>
@@ -8297,15 +8025,7 @@
         <w:t xml:space="preserve">– </w:t>
       </w:r>
       <w:r>
-        <w:t xml:space="preserve">USDA data was provided in units of U.S. dollars per bushel of corn </w:t>
-      </w:r>
-      <w:proofErr w:type="gramStart"/>
-      <w:r>
-        <w:t>grain,</w:t>
-      </w:r>
-      <w:proofErr w:type="gramEnd"/>
-      <w:r>
-        <w:t xml:space="preserve"> therefore the USDA </w:t>
+        <w:t xml:space="preserve">USDA data was provided in units of U.S. dollars per bushel of corn grain, therefore the USDA </w:t>
       </w:r>
       <w:r>
         <w:t xml:space="preserve">data </w:t>
@@ -8423,15 +8143,7 @@
         </w:r>
       </w:hyperlink>
       <w:r>
-        <w:t xml:space="preserve">. They </w:t>
-      </w:r>
-      <w:proofErr w:type="gramStart"/>
-      <w:r>
-        <w:t>state</w:t>
-      </w:r>
-      <w:proofErr w:type="gramEnd"/>
-      <w:r>
-        <w:t xml:space="preserve"> “Corn silage that has already been harvested and stored is worth more, naturally, typically 10-12 times the price of a bushel of corn.” Therefore, a scaling factor of 11 was used to estimate corn silage pricing. </w:t>
+        <w:t xml:space="preserve">. They state “Corn silage that has already been harvested and stored is worth more, naturally, typically 10-12 times the price of a bushel of corn.” Therefore, a scaling factor of 11 was used to estimate corn silage pricing. </w:t>
       </w:r>
       <w:r>
         <w:t xml:space="preserve">The results of this scaling are in line with estimates by </w:t>
@@ -9124,23 +8836,7 @@
             <w:rStyle w:val="Hyperlink"/>
             <w:color w:val="auto"/>
           </w:rPr>
-          <w:t xml:space="preserve">National Agricultural Statistics Service </w:t>
-        </w:r>
-        <w:proofErr w:type="spellStart"/>
-        <w:r>
-          <w:rPr>
-            <w:rStyle w:val="Hyperlink"/>
-            <w:color w:val="auto"/>
-          </w:rPr>
-          <w:t>Quickstats</w:t>
-        </w:r>
-        <w:proofErr w:type="spellEnd"/>
-        <w:r>
-          <w:rPr>
-            <w:rStyle w:val="Hyperlink"/>
-            <w:color w:val="auto"/>
-          </w:rPr>
-          <w:t xml:space="preserve"> web portal</w:t>
+          <w:t>National Agricultural Statistics Service Quickstats web portal</w:t>
         </w:r>
       </w:hyperlink>
       <w:r>
@@ -9271,23 +8967,7 @@
             <w:rStyle w:val="Hyperlink"/>
             <w:color w:val="auto"/>
           </w:rPr>
-          <w:t xml:space="preserve">National Agricultural Statistics Service </w:t>
-        </w:r>
-        <w:proofErr w:type="spellStart"/>
-        <w:r>
-          <w:rPr>
-            <w:rStyle w:val="Hyperlink"/>
-            <w:color w:val="auto"/>
-          </w:rPr>
-          <w:t>Quickstats</w:t>
-        </w:r>
-        <w:proofErr w:type="spellEnd"/>
-        <w:r>
-          <w:rPr>
-            <w:rStyle w:val="Hyperlink"/>
-            <w:color w:val="auto"/>
-          </w:rPr>
-          <w:t xml:space="preserve"> web portal</w:t>
+          <w:t>National Agricultural Statistics Service Quickstats web portal</w:t>
         </w:r>
       </w:hyperlink>
       <w:r>
@@ -9427,23 +9107,7 @@
             <w:rStyle w:val="Hyperlink"/>
             <w:color w:val="auto"/>
           </w:rPr>
-          <w:t xml:space="preserve">National Agricultural Statistics Service </w:t>
-        </w:r>
-        <w:proofErr w:type="spellStart"/>
-        <w:r>
-          <w:rPr>
-            <w:rStyle w:val="Hyperlink"/>
-            <w:color w:val="auto"/>
-          </w:rPr>
-          <w:t>Quickstats</w:t>
-        </w:r>
-        <w:proofErr w:type="spellEnd"/>
-        <w:r>
-          <w:rPr>
-            <w:rStyle w:val="Hyperlink"/>
-            <w:color w:val="auto"/>
-          </w:rPr>
-          <w:t xml:space="preserve"> web portal</w:t>
+          <w:t>National Agricultural Statistics Service Quickstats web portal</w:t>
         </w:r>
       </w:hyperlink>
       <w:r>
@@ -9487,15 +9151,7 @@
         <w:t xml:space="preserve">– </w:t>
       </w:r>
       <w:r>
-        <w:t xml:space="preserve">USDA data was provided in units of U.S. dollars per bushel of rye </w:t>
-      </w:r>
-      <w:proofErr w:type="gramStart"/>
-      <w:r>
-        <w:t>grain,</w:t>
-      </w:r>
-      <w:proofErr w:type="gramEnd"/>
-      <w:r>
-        <w:t xml:space="preserve"> therefore the USDA data was divided by 25.401 (kg rye/bushel) to get prices in $/kg. Note: This is the same conversion factor as bushel of corn grain to kilogram.</w:t>
+        <w:t>USDA data was provided in units of U.S. dollars per bushel of rye grain, therefore the USDA data was divided by 25.401 (kg rye/bushel) to get prices in $/kg. Note: This is the same conversion factor as bushel of corn grain to kilogram.</w:t>
       </w:r>
     </w:p>
     <w:p/>
@@ -9594,23 +9250,7 @@
             <w:rStyle w:val="Hyperlink"/>
             <w:color w:val="auto"/>
           </w:rPr>
-          <w:t xml:space="preserve">National Agricultural Statistics Service </w:t>
-        </w:r>
-        <w:proofErr w:type="spellStart"/>
-        <w:r>
-          <w:rPr>
-            <w:rStyle w:val="Hyperlink"/>
-            <w:color w:val="auto"/>
-          </w:rPr>
-          <w:t>Quickstats</w:t>
-        </w:r>
-        <w:proofErr w:type="spellEnd"/>
-        <w:r>
-          <w:rPr>
-            <w:rStyle w:val="Hyperlink"/>
-            <w:color w:val="auto"/>
-          </w:rPr>
-          <w:t xml:space="preserve"> web portal</w:t>
+          <w:t>National Agricultural Statistics Service Quickstats web portal</w:t>
         </w:r>
       </w:hyperlink>
       <w:r>
@@ -9636,15 +9276,7 @@
         <w:t xml:space="preserve">– </w:t>
       </w:r>
       <w:r>
-        <w:t xml:space="preserve">USDA data was provided in units of U.S. dollars per bushel of soybean </w:t>
-      </w:r>
-      <w:proofErr w:type="gramStart"/>
-      <w:r>
-        <w:t>grain,</w:t>
-      </w:r>
-      <w:proofErr w:type="gramEnd"/>
-      <w:r>
-        <w:t xml:space="preserve"> therefore the USDA data was divided by 27.2155 (kg soybeans/bushel) to get prices in $/kg.</w:t>
+        <w:t>USDA data was provided in units of U.S. dollars per bushel of soybean grain, therefore the USDA data was divided by 27.2155 (kg soybeans/bushel) to get prices in $/kg.</w:t>
       </w:r>
     </w:p>
     <w:p/>
@@ -9999,15 +9631,7 @@
         <w:t xml:space="preserve">Data Subtype </w:t>
       </w:r>
       <w:r>
-        <w:t xml:space="preserve">– </w:t>
-      </w:r>
-      <w:proofErr w:type="spellStart"/>
-      <w:r>
-        <w:t>Sudangrass</w:t>
-      </w:r>
-      <w:proofErr w:type="spellEnd"/>
-      <w:r>
-        <w:t xml:space="preserve"> Silage</w:t>
+        <w:t>– Sudangrass Silage</w:t>
       </w:r>
     </w:p>
     <w:p>
@@ -10026,15 +9650,7 @@
         <w:t xml:space="preserve">Units </w:t>
       </w:r>
       <w:r>
-        <w:t xml:space="preserve">– U.S. dollars per kilogram of </w:t>
-      </w:r>
-      <w:proofErr w:type="spellStart"/>
-      <w:r>
-        <w:t>sudangrass</w:t>
-      </w:r>
-      <w:proofErr w:type="spellEnd"/>
-      <w:r>
-        <w:t xml:space="preserve"> silage</w:t>
+        <w:t>– U.S. dollars per kilogram of sudangrass silage</w:t>
       </w:r>
     </w:p>
     <w:p>
@@ -10053,23 +9669,7 @@
         <w:t xml:space="preserve">Data source </w:t>
       </w:r>
       <w:r>
-        <w:t xml:space="preserve">– Historical prices for </w:t>
-      </w:r>
-      <w:proofErr w:type="spellStart"/>
-      <w:r>
-        <w:t>sudangrass</w:t>
-      </w:r>
-      <w:proofErr w:type="spellEnd"/>
-      <w:r>
-        <w:t xml:space="preserve"> silage was not found. The only </w:t>
-      </w:r>
-      <w:proofErr w:type="spellStart"/>
-      <w:r>
-        <w:t>sudangrass</w:t>
-      </w:r>
-      <w:proofErr w:type="spellEnd"/>
-      <w:r>
-        <w:t xml:space="preserve"> silage estimate that could be find was provided by </w:t>
+        <w:t xml:space="preserve">– Historical prices for sudangrass silage was not found. The only sudangrass silage estimate that could be find was provided by </w:t>
       </w:r>
       <w:hyperlink r:id="rId61" w:history="1">
         <w:r>
@@ -10081,59 +9681,11 @@
         </w:r>
       </w:hyperlink>
       <w:r>
-        <w:t xml:space="preserve">. They estimate the cost of </w:t>
-      </w:r>
-      <w:proofErr w:type="spellStart"/>
-      <w:r>
-        <w:t>sudangrass</w:t>
-      </w:r>
-      <w:proofErr w:type="spellEnd"/>
-      <w:r>
-        <w:t xml:space="preserve"> silage for </w:t>
-      </w:r>
-      <w:proofErr w:type="spellStart"/>
-      <w:r>
-        <w:t>sudangrass</w:t>
-      </w:r>
-      <w:proofErr w:type="spellEnd"/>
-      <w:r>
-        <w:t xml:space="preserve"> yields between 9.5 to 18.5 tons per acre. For the purposes of this data, the cost of $53/ton </w:t>
-      </w:r>
-      <w:proofErr w:type="spellStart"/>
-      <w:r>
-        <w:t>sudangrass</w:t>
-      </w:r>
-      <w:proofErr w:type="spellEnd"/>
-      <w:r>
-        <w:t xml:space="preserve"> silage was used for all counties which is associated with the middle </w:t>
-      </w:r>
-      <w:proofErr w:type="spellStart"/>
-      <w:r>
-        <w:t>sudangrass</w:t>
-      </w:r>
-      <w:proofErr w:type="spellEnd"/>
-      <w:r>
-        <w:t xml:space="preserve"> yield of 14 tons per acre. Since the report was produced in 2009, a </w:t>
+        <w:t xml:space="preserve">. They estimate the cost of sudangrass silage for sudangrass yields between 9.5 to 18.5 tons per acre. For the purposes of this data, the cost of $53/ton sudangrass silage was used for all counties which is associated with the middle sudangrass yield of 14 tons per acre. Since the report was produced in 2009, a </w:t>
       </w:r>
       <w:r>
         <w:lastRenderedPageBreak/>
-        <w:t xml:space="preserve">scaling factor of 1.4614 was used to convert from 2009 dollars to 2024 dollars. </w:t>
-      </w:r>
-      <w:proofErr w:type="gramStart"/>
-      <w:r>
-        <w:t>Therefore</w:t>
-      </w:r>
-      <w:proofErr w:type="gramEnd"/>
-      <w:r>
-        <w:t xml:space="preserve"> a final value of $77.45 per ton of </w:t>
-      </w:r>
-      <w:proofErr w:type="spellStart"/>
-      <w:r>
-        <w:t>sudangrass</w:t>
-      </w:r>
-      <w:proofErr w:type="spellEnd"/>
-      <w:r>
-        <w:t xml:space="preserve"> silage was used for all counties.</w:t>
+        <w:t>scaling factor of 1.4614 was used to convert from 2009 dollars to 2024 dollars. Therefore a final value of $77.45 per ton of sudangrass silage was used for all counties.</w:t>
       </w:r>
     </w:p>
     <w:p>
@@ -10275,39 +9827,154 @@
             <w:rStyle w:val="Hyperlink"/>
             <w:color w:val="auto"/>
           </w:rPr>
-          <w:t xml:space="preserve">National Agricultural Statistics Service </w:t>
+          <w:t>National Agricultural Statistics Service Quickstats web portal</w:t>
         </w:r>
-        <w:proofErr w:type="spellStart"/>
+      </w:hyperlink>
+      <w:r>
+        <w:t xml:space="preserve">. This data can be obtained by selecting Group: Field Crops, Commodity: </w:t>
+      </w:r>
+      <w:r>
+        <w:t>Wheat</w:t>
+      </w:r>
+      <w:r>
+        <w:t xml:space="preserve">, Category: Price Received, Data Item: </w:t>
+      </w:r>
+      <w:r>
+        <w:t>Wheat, Winter</w:t>
+      </w:r>
+      <w:r>
+        <w:t xml:space="preserve"> – Price Received, Measured in $ / BU, Geographic Level: National + State, Year: All, Period Type: Annual, Period: Marketing Year. State level values were then assigned uniformly to each county within the state. When state or data was unavailable, the U.S. mean value was used.</w:t>
+      </w:r>
+    </w:p>
+    <w:p>
+      <w:pPr>
+        <w:pStyle w:val="ListParagraph"/>
+        <w:numPr>
+          <w:ilvl w:val="0"/>
+          <w:numId w:val="1"/>
+        </w:numPr>
+      </w:pPr>
+      <w:r>
+        <w:rPr>
+          <w:b/>
+          <w:bCs/>
+        </w:rPr>
+        <w:t xml:space="preserve">Data Conversions </w:t>
+      </w:r>
+      <w:r>
+        <w:t xml:space="preserve">– </w:t>
+      </w:r>
+      <w:r>
+        <w:t xml:space="preserve">USDA data was provided in units of U.S. dollars per bushel of </w:t>
+      </w:r>
+      <w:r>
+        <w:t>winter wheat</w:t>
+      </w:r>
+      <w:r>
+        <w:t xml:space="preserve"> grain, therefore the USDA data was divided by 27.2155 (kg </w:t>
+      </w:r>
+      <w:r>
+        <w:t>winter wheat</w:t>
+      </w:r>
+      <w:r>
+        <w:t>/bushel) to get prices in $/kg.</w:t>
+      </w:r>
+      <w:r>
+        <w:t xml:space="preserve"> Note: This is the same conversion factor as bushel of soybeans to kilogram.</w:t>
+      </w:r>
+    </w:p>
+    <w:p/>
+    <w:p>
+      <w:r>
+        <w:t>File: ‘commodity_prices.calcium_phosphate_di.dollar_per_kilogram.csv’</w:t>
+      </w:r>
+    </w:p>
+    <w:p>
+      <w:pPr>
+        <w:pStyle w:val="ListParagraph"/>
+        <w:numPr>
+          <w:ilvl w:val="0"/>
+          <w:numId w:val="8"/>
+        </w:numPr>
+      </w:pPr>
+      <w:r>
+        <w:rPr>
+          <w:b/>
+          <w:bCs/>
+        </w:rPr>
+        <w:t xml:space="preserve">Primary Data Type </w:t>
+      </w:r>
+      <w:r>
+        <w:t>– Feed prices</w:t>
+      </w:r>
+    </w:p>
+    <w:p>
+      <w:pPr>
+        <w:pStyle w:val="ListParagraph"/>
+        <w:numPr>
+          <w:ilvl w:val="0"/>
+          <w:numId w:val="1"/>
+        </w:numPr>
+      </w:pPr>
+      <w:r>
+        <w:rPr>
+          <w:b/>
+          <w:bCs/>
+        </w:rPr>
+        <w:t xml:space="preserve">Data Subtype </w:t>
+      </w:r>
+      <w:r>
+        <w:t>– Calcium Phosphate (di)</w:t>
+      </w:r>
+    </w:p>
+    <w:p>
+      <w:pPr>
+        <w:pStyle w:val="ListParagraph"/>
+        <w:numPr>
+          <w:ilvl w:val="0"/>
+          <w:numId w:val="1"/>
+        </w:numPr>
+      </w:pPr>
+      <w:r>
+        <w:rPr>
+          <w:b/>
+          <w:bCs/>
+        </w:rPr>
+        <w:t xml:space="preserve">Units </w:t>
+      </w:r>
+      <w:r>
+        <w:t>– U.S. dollars per kilogram of Calcium Phosphate (di)</w:t>
+      </w:r>
+    </w:p>
+    <w:p>
+      <w:pPr>
+        <w:pStyle w:val="ListParagraph"/>
+        <w:numPr>
+          <w:ilvl w:val="0"/>
+          <w:numId w:val="1"/>
+        </w:numPr>
+      </w:pPr>
+      <w:r>
+        <w:rPr>
+          <w:b/>
+          <w:bCs/>
+        </w:rPr>
+        <w:t xml:space="preserve">Data source </w:t>
+      </w:r>
+      <w:r>
+        <w:t xml:space="preserve">– No historical prices could be found for calcium phosphate. Therefore, this file only features one economic price for calcium phosphate in 2024. The cost was gathered from </w:t>
+      </w:r>
+      <w:hyperlink r:id="rId64" w:history="1">
         <w:r>
           <w:rPr>
             <w:rStyle w:val="Hyperlink"/>
             <w:color w:val="auto"/>
           </w:rPr>
-          <w:t>Quickstats</w:t>
-        </w:r>
-        <w:proofErr w:type="spellEnd"/>
-        <w:r>
-          <w:rPr>
-            <w:rStyle w:val="Hyperlink"/>
-            <w:color w:val="auto"/>
-          </w:rPr>
-          <w:t xml:space="preserve"> web portal</w:t>
+          <w:t>AgCare Product, Inc.</w:t>
         </w:r>
       </w:hyperlink>
       <w:r>
-        <w:t xml:space="preserve">. This data can be obtained by selecting Group: Field Crops, Commodity: </w:t>
-      </w:r>
-      <w:r>
-        <w:t>Wheat</w:t>
-      </w:r>
-      <w:r>
-        <w:t xml:space="preserve">, Category: Price Received, Data Item: </w:t>
-      </w:r>
-      <w:r>
-        <w:t>Wheat, Winter</w:t>
-      </w:r>
-      <w:r>
-        <w:t xml:space="preserve"> – Price Received, Measured in $ / BU, Geographic Level: National + State, Year: All, Period Type: Annual, Period: Marketing Year. State level values were then assigned uniformly to each county within the state. When state or data was unavailable, the U.S. mean value was used.</w:t>
+        <w:t xml:space="preserve"> for a 50 pound (22.68 kilogram) feed grade bag of Dicalcium Phosphate plus shipping to Utah.</w:t>
       </w:r>
     </w:p>
     <w:p>
@@ -10326,163 +9993,7 @@
         <w:t xml:space="preserve">Data Conversions </w:t>
       </w:r>
       <w:r>
-        <w:t xml:space="preserve">– </w:t>
-      </w:r>
-      <w:r>
-        <w:t xml:space="preserve">USDA data was provided in units of U.S. dollars per bushel of </w:t>
-      </w:r>
-      <w:r>
-        <w:t>winter wheat</w:t>
-      </w:r>
-      <w:r>
-        <w:t xml:space="preserve"> </w:t>
-      </w:r>
-      <w:proofErr w:type="gramStart"/>
-      <w:r>
-        <w:t>grain,</w:t>
-      </w:r>
-      <w:proofErr w:type="gramEnd"/>
-      <w:r>
-        <w:t xml:space="preserve"> therefore the USDA data was divided by 27.2155 (kg </w:t>
-      </w:r>
-      <w:r>
-        <w:t>winter wheat</w:t>
-      </w:r>
-      <w:r>
-        <w:t>/bushel) to get prices in $/kg.</w:t>
-      </w:r>
-      <w:r>
-        <w:t xml:space="preserve"> Note: This is the same conversion factor as bushel of soybeans to kilogram.</w:t>
-      </w:r>
-    </w:p>
-    <w:p/>
-    <w:p>
-      <w:r>
-        <w:t>File: ‘commodity_prices.calcium_phosphate_di.dollar_per_kilogram.csv’</w:t>
-      </w:r>
-    </w:p>
-    <w:p>
-      <w:pPr>
-        <w:pStyle w:val="ListParagraph"/>
-        <w:numPr>
-          <w:ilvl w:val="0"/>
-          <w:numId w:val="8"/>
-        </w:numPr>
-      </w:pPr>
-      <w:r>
-        <w:rPr>
-          <w:b/>
-          <w:bCs/>
-        </w:rPr>
-        <w:t xml:space="preserve">Primary Data Type </w:t>
-      </w:r>
-      <w:r>
-        <w:t>– Feed prices</w:t>
-      </w:r>
-    </w:p>
-    <w:p>
-      <w:pPr>
-        <w:pStyle w:val="ListParagraph"/>
-        <w:numPr>
-          <w:ilvl w:val="0"/>
-          <w:numId w:val="1"/>
-        </w:numPr>
-      </w:pPr>
-      <w:r>
-        <w:rPr>
-          <w:b/>
-          <w:bCs/>
-        </w:rPr>
-        <w:t xml:space="preserve">Data Subtype </w:t>
-      </w:r>
-      <w:r>
-        <w:t>– Calcium Phosphate (di)</w:t>
-      </w:r>
-    </w:p>
-    <w:p>
-      <w:pPr>
-        <w:pStyle w:val="ListParagraph"/>
-        <w:numPr>
-          <w:ilvl w:val="0"/>
-          <w:numId w:val="1"/>
-        </w:numPr>
-      </w:pPr>
-      <w:r>
-        <w:rPr>
-          <w:b/>
-          <w:bCs/>
-        </w:rPr>
-        <w:t xml:space="preserve">Units </w:t>
-      </w:r>
-      <w:r>
-        <w:t>– U.S. dollars per kilogram of Calcium Phosphate (di)</w:t>
-      </w:r>
-    </w:p>
-    <w:p>
-      <w:pPr>
-        <w:pStyle w:val="ListParagraph"/>
-        <w:numPr>
-          <w:ilvl w:val="0"/>
-          <w:numId w:val="1"/>
-        </w:numPr>
-      </w:pPr>
-      <w:r>
-        <w:rPr>
-          <w:b/>
-          <w:bCs/>
-        </w:rPr>
-        <w:t xml:space="preserve">Data source </w:t>
-      </w:r>
-      <w:r>
-        <w:t xml:space="preserve">– No historical prices could be found for calcium phosphate. Therefore, this file only features one economic price for calcium phosphate in 2024. The cost was gathered from </w:t>
-      </w:r>
-      <w:hyperlink r:id="rId64" w:history="1">
-        <w:proofErr w:type="spellStart"/>
-        <w:r>
-          <w:rPr>
-            <w:rStyle w:val="Hyperlink"/>
-            <w:color w:val="auto"/>
-          </w:rPr>
-          <w:t>AgCare</w:t>
-        </w:r>
-        <w:proofErr w:type="spellEnd"/>
-        <w:r>
-          <w:rPr>
-            <w:rStyle w:val="Hyperlink"/>
-            <w:color w:val="auto"/>
-          </w:rPr>
-          <w:t xml:space="preserve"> Product, Inc.</w:t>
-        </w:r>
-      </w:hyperlink>
-      <w:r>
-        <w:t xml:space="preserve"> for a 50 pound (22.68 kilogram) feed grade bag of Dicalcium Phosphate plus shipping to Utah.</w:t>
-      </w:r>
-    </w:p>
-    <w:p>
-      <w:pPr>
-        <w:pStyle w:val="ListParagraph"/>
-        <w:numPr>
-          <w:ilvl w:val="0"/>
-          <w:numId w:val="1"/>
-        </w:numPr>
-      </w:pPr>
-      <w:r>
-        <w:rPr>
-          <w:b/>
-          <w:bCs/>
-        </w:rPr>
-        <w:t xml:space="preserve">Data Conversions </w:t>
-      </w:r>
-      <w:r>
-        <w:t xml:space="preserve">– Current price of $41.00 for the 50 </w:t>
-      </w:r>
-      <w:proofErr w:type="spellStart"/>
-      <w:r>
-        <w:t>lb</w:t>
-      </w:r>
-      <w:proofErr w:type="spellEnd"/>
-      <w:r>
-        <w:t xml:space="preserve"> bag plus $136.24 for shipping was divided by 22.68 kilograms to get the per kilogram price of $7.81.</w:t>
+        <w:t>– Current price of $41.00 for the 50 lb bag plus $136.24 for shipping was divided by 22.68 kilograms to get the per kilogram price of $7.81.</w:t>
       </w:r>
     </w:p>
     <w:p/>
@@ -10596,15 +10107,7 @@
         <w:t xml:space="preserve">Data Conversions </w:t>
       </w:r>
       <w:r>
-        <w:t xml:space="preserve">– Current price of $17.65 for the 50 </w:t>
-      </w:r>
-      <w:proofErr w:type="spellStart"/>
-      <w:r>
-        <w:t>lb</w:t>
-      </w:r>
-      <w:proofErr w:type="spellEnd"/>
-      <w:r>
-        <w:t xml:space="preserve"> bag plus $89.23 for shipping was divided by 22.68 kilograms to get the per kilogram price of $4.71.</w:t>
+        <w:t>– Current price of $17.65 for the 50 lb bag plus $89.23 for shipping was divided by 22.68 kilograms to get the per kilogram price of $4.71.</w:t>
       </w:r>
     </w:p>
     <w:p/>
@@ -10717,15 +10220,7 @@
         <w:t xml:space="preserve">Data Conversions </w:t>
       </w:r>
       <w:r>
-        <w:t xml:space="preserve">– Current price of $7.95 for the 50 </w:t>
-      </w:r>
-      <w:proofErr w:type="spellStart"/>
-      <w:r>
-        <w:t>lb</w:t>
-      </w:r>
-      <w:proofErr w:type="spellEnd"/>
-      <w:r>
-        <w:t xml:space="preserve"> bag plus $89.23 for shipping was divided by 22.68 kilograms to get the per kilogram price of $4.28.</w:t>
+        <w:t>– Current price of $7.95 for the 50 lb bag plus $89.23 for shipping was divided by 22.68 kilograms to get the per kilogram price of $4.28.</w:t>
       </w:r>
     </w:p>
     <w:p/>
@@ -10889,18 +10384,10 @@
         <w:t xml:space="preserve">USDA provided </w:t>
       </w:r>
       <w:r>
-        <w:t xml:space="preserve">seed prices in dollars per planted </w:t>
-      </w:r>
-      <w:proofErr w:type="gramStart"/>
-      <w:r>
-        <w:t>acre</w:t>
-      </w:r>
-      <w:r>
-        <w:t>,</w:t>
-      </w:r>
-      <w:proofErr w:type="gramEnd"/>
-      <w:r>
-        <w:t xml:space="preserve"> therefore USDA values were divided by </w:t>
+        <w:t>seed prices in dollars per planted acre</w:t>
+      </w:r>
+      <w:r>
+        <w:t xml:space="preserve">, therefore USDA values were divided by </w:t>
       </w:r>
       <w:r>
         <w:t>4</w:t>
@@ -11093,18 +10580,10 @@
         <w:t xml:space="preserve">USDA provided </w:t>
       </w:r>
       <w:r>
-        <w:t xml:space="preserve">seed prices in dollars per planted </w:t>
-      </w:r>
-      <w:proofErr w:type="gramStart"/>
-      <w:r>
-        <w:t>acre</w:t>
-      </w:r>
-      <w:r>
-        <w:t>,</w:t>
-      </w:r>
-      <w:proofErr w:type="gramEnd"/>
-      <w:r>
-        <w:t xml:space="preserve"> therefore USDA values were divided by </w:t>
+        <w:t>seed prices in dollars per planted acre</w:t>
+      </w:r>
+      <w:r>
+        <w:t xml:space="preserve">, therefore USDA values were divided by </w:t>
       </w:r>
       <w:r>
         <w:t>4</w:t>
@@ -11297,18 +10776,10 @@
         <w:t xml:space="preserve">USDA provided </w:t>
       </w:r>
       <w:r>
-        <w:t xml:space="preserve">seed prices in dollars per planted </w:t>
-      </w:r>
-      <w:proofErr w:type="gramStart"/>
-      <w:r>
-        <w:t>acre</w:t>
-      </w:r>
-      <w:r>
-        <w:t>,</w:t>
-      </w:r>
-      <w:proofErr w:type="gramEnd"/>
-      <w:r>
-        <w:t xml:space="preserve"> therefore USDA values were divided by </w:t>
+        <w:t>seed prices in dollars per planted acre</w:t>
+      </w:r>
+      <w:r>
+        <w:t xml:space="preserve">, therefore USDA values were divided by </w:t>
       </w:r>
       <w:r>
         <w:t>4</w:t>
@@ -11502,18 +10973,10 @@
         <w:t xml:space="preserve">USDA provided </w:t>
       </w:r>
       <w:r>
-        <w:t xml:space="preserve">seed prices in dollars per planted </w:t>
-      </w:r>
-      <w:proofErr w:type="gramStart"/>
-      <w:r>
-        <w:t>acre</w:t>
-      </w:r>
-      <w:r>
-        <w:t>,</w:t>
-      </w:r>
-      <w:proofErr w:type="gramEnd"/>
-      <w:r>
-        <w:t xml:space="preserve"> therefore USDA values were divided by </w:t>
+        <w:t>seed prices in dollars per planted acre</w:t>
+      </w:r>
+      <w:r>
+        <w:t xml:space="preserve">, therefore USDA values were divided by </w:t>
       </w:r>
       <w:r>
         <w:t>4</w:t>
@@ -11706,18 +11169,10 @@
         <w:t xml:space="preserve">USDA provided </w:t>
       </w:r>
       <w:r>
-        <w:t xml:space="preserve">seed prices in dollars per planted </w:t>
-      </w:r>
-      <w:proofErr w:type="gramStart"/>
-      <w:r>
-        <w:t>acre</w:t>
-      </w:r>
-      <w:r>
-        <w:t>,</w:t>
-      </w:r>
-      <w:proofErr w:type="gramEnd"/>
-      <w:r>
-        <w:t xml:space="preserve"> therefore USDA values were divided by </w:t>
+        <w:t>seed prices in dollars per planted acre</w:t>
+      </w:r>
+      <w:r>
+        <w:t xml:space="preserve">, therefore USDA values were divided by </w:t>
       </w:r>
       <w:r>
         <w:t>4</w:t>
@@ -11914,18 +11369,10 @@
         <w:t xml:space="preserve">USDA provided </w:t>
       </w:r>
       <w:r>
-        <w:t xml:space="preserve">seed prices in dollars per planted </w:t>
-      </w:r>
-      <w:proofErr w:type="gramStart"/>
-      <w:r>
-        <w:t>acre</w:t>
-      </w:r>
-      <w:r>
-        <w:t>,</w:t>
-      </w:r>
-      <w:proofErr w:type="gramEnd"/>
-      <w:r>
-        <w:t xml:space="preserve"> therefore USDA values were divided by </w:t>
+        <w:t>seed prices in dollars per planted acre</w:t>
+      </w:r>
+      <w:r>
+        <w:t xml:space="preserve">, therefore USDA values were divided by </w:t>
       </w:r>
       <w:r>
         <w:t>4</w:t>
@@ -12118,18 +11565,10 @@
         <w:t xml:space="preserve">USDA provided </w:t>
       </w:r>
       <w:r>
-        <w:t xml:space="preserve">seed prices in dollars per planted </w:t>
-      </w:r>
-      <w:proofErr w:type="gramStart"/>
-      <w:r>
-        <w:t>acre</w:t>
-      </w:r>
-      <w:r>
-        <w:t>,</w:t>
-      </w:r>
-      <w:proofErr w:type="gramEnd"/>
-      <w:r>
-        <w:t xml:space="preserve"> therefore USDA values were divided by </w:t>
+        <w:t>seed prices in dollars per planted acre</w:t>
+      </w:r>
+      <w:r>
+        <w:t xml:space="preserve">, therefore USDA values were divided by </w:t>
       </w:r>
       <w:r>
         <w:t>4</w:t>
@@ -12325,18 +11764,10 @@
         <w:t xml:space="preserve">USDA provided </w:t>
       </w:r>
       <w:r>
-        <w:t xml:space="preserve">seed prices in dollars per planted </w:t>
-      </w:r>
-      <w:proofErr w:type="gramStart"/>
-      <w:r>
-        <w:t>acre</w:t>
-      </w:r>
-      <w:r>
-        <w:t>,</w:t>
-      </w:r>
-      <w:proofErr w:type="gramEnd"/>
-      <w:r>
-        <w:t xml:space="preserve"> therefore USDA values were divided by </w:t>
+        <w:t>seed prices in dollars per planted acre</w:t>
+      </w:r>
+      <w:r>
+        <w:t xml:space="preserve">, therefore USDA values were divided by </w:t>
       </w:r>
       <w:r>
         <w:t>4</w:t>
@@ -12530,18 +11961,10 @@
         <w:t xml:space="preserve">USDA provided </w:t>
       </w:r>
       <w:r>
-        <w:t xml:space="preserve">seed prices in dollars per planted </w:t>
-      </w:r>
-      <w:proofErr w:type="gramStart"/>
-      <w:r>
-        <w:t>acre</w:t>
-      </w:r>
-      <w:r>
-        <w:t>,</w:t>
-      </w:r>
-      <w:proofErr w:type="gramEnd"/>
-      <w:r>
-        <w:t xml:space="preserve"> therefore USDA values were divided by </w:t>
+        <w:t>seed prices in dollars per planted acre</w:t>
+      </w:r>
+      <w:r>
+        <w:t xml:space="preserve">, therefore USDA values were divided by </w:t>
       </w:r>
       <w:r>
         <w:t>4</w:t>
@@ -12702,15 +12125,7 @@
         <w:t xml:space="preserve">Data Conversions </w:t>
       </w:r>
       <w:r>
-        <w:t xml:space="preserve">– Prices received from USDA-ERS were received in units of U.S. dollars per short ton of </w:t>
-      </w:r>
-      <w:proofErr w:type="gramStart"/>
-      <w:r>
-        <w:t>fertilizer,</w:t>
-      </w:r>
-      <w:proofErr w:type="gramEnd"/>
-      <w:r>
-        <w:t xml:space="preserve"> therefore they were divided by 907.185 (kilograms/short-ton) to get prices in units of U.S. dollars per kilogram of fertilizer.</w:t>
+        <w:t>– Prices received from USDA-ERS were received in units of U.S. dollars per short ton of fertilizer, therefore they were divided by 907.185 (kilograms/short-ton) to get prices in units of U.S. dollars per kilogram of fertilizer.</w:t>
       </w:r>
     </w:p>
     <w:p/>
@@ -12844,15 +12259,7 @@
         <w:t xml:space="preserve">Data Conversions </w:t>
       </w:r>
       <w:r>
-        <w:t xml:space="preserve">– Prices received from USDA-ERS were received in units of U.S. dollars per short ton of </w:t>
-      </w:r>
-      <w:proofErr w:type="gramStart"/>
-      <w:r>
-        <w:t>fertilizer,</w:t>
-      </w:r>
-      <w:proofErr w:type="gramEnd"/>
-      <w:r>
-        <w:t xml:space="preserve"> therefore they were divided by 907.185 (kilograms/short-ton) to get prices in units of U.S. dollars per kilogram of fertilizer.</w:t>
+        <w:t>– Prices received from USDA-ERS were received in units of U.S. dollars per short ton of fertilizer, therefore they were divided by 907.185 (kilograms/short-ton) to get prices in units of U.S. dollars per kilogram of fertilizer.</w:t>
       </w:r>
     </w:p>
     <w:p/>
@@ -12977,15 +12384,7 @@
         <w:t xml:space="preserve">Data Conversions </w:t>
       </w:r>
       <w:r>
-        <w:t xml:space="preserve">– Prices received from USDA-ERS were received in units of U.S. dollars per short ton of </w:t>
-      </w:r>
-      <w:proofErr w:type="gramStart"/>
-      <w:r>
-        <w:t>fertilizer,</w:t>
-      </w:r>
-      <w:proofErr w:type="gramEnd"/>
-      <w:r>
-        <w:t xml:space="preserve"> therefore they were divided by 907.185 (kilograms/short-ton) to get prices in units of U.S. dollars per kilogram of fertilizer.</w:t>
+        <w:t>– Prices received from USDA-ERS were received in units of U.S. dollars per short ton of fertilizer, therefore they were divided by 907.185 (kilograms/short-ton) to get prices in units of U.S. dollars per kilogram of fertilizer.</w:t>
       </w:r>
     </w:p>
     <w:p/>
@@ -13111,15 +12510,7 @@
         <w:t xml:space="preserve">Data Conversions </w:t>
       </w:r>
       <w:r>
-        <w:t xml:space="preserve">– Prices received from USDA-ERS were received in units of U.S. dollars per short ton of </w:t>
-      </w:r>
-      <w:proofErr w:type="gramStart"/>
-      <w:r>
-        <w:t>fertilizer,</w:t>
-      </w:r>
-      <w:proofErr w:type="gramEnd"/>
-      <w:r>
-        <w:t xml:space="preserve"> therefore they were divided by 907.185 (kilograms/short-ton) to get prices in units of U.S. dollars per kilogram of fertilizer.</w:t>
+        <w:t>– Prices received from USDA-ERS were received in units of U.S. dollars per short ton of fertilizer, therefore they were divided by 907.185 (kilograms/short-ton) to get prices in units of U.S. dollars per kilogram of fertilizer.</w:t>
       </w:r>
     </w:p>
     <w:p/>
@@ -13244,15 +12635,7 @@
         <w:t xml:space="preserve">Data Conversions </w:t>
       </w:r>
       <w:r>
-        <w:t xml:space="preserve">– Prices received from USDA-ERS were received in units of U.S. dollars per short ton of </w:t>
-      </w:r>
-      <w:proofErr w:type="gramStart"/>
-      <w:r>
-        <w:t>fertilizer,</w:t>
-      </w:r>
-      <w:proofErr w:type="gramEnd"/>
-      <w:r>
-        <w:t xml:space="preserve"> therefore they were divided by 907.185 (kilograms/short-ton) to get prices in units of U.S. dollars per kilogram of fertilizer.</w:t>
+        <w:t>– Prices received from USDA-ERS were received in units of U.S. dollars per short ton of fertilizer, therefore they were divided by 907.185 (kilograms/short-ton) to get prices in units of U.S. dollars per kilogram of fertilizer.</w:t>
       </w:r>
     </w:p>
     <w:p>
@@ -13382,15 +12765,7 @@
         <w:t xml:space="preserve">Data Conversions </w:t>
       </w:r>
       <w:r>
-        <w:t xml:space="preserve">– Prices received from USDA-ERS were received in units of U.S. dollars per short ton of </w:t>
-      </w:r>
-      <w:proofErr w:type="gramStart"/>
-      <w:r>
-        <w:t>fertilizer,</w:t>
-      </w:r>
-      <w:proofErr w:type="gramEnd"/>
-      <w:r>
-        <w:t xml:space="preserve"> therefore they were divided by 907.185 (kilograms/short-ton) to get prices in units of U.S. dollars per kilogram of fertilizer.</w:t>
+        <w:t>– Prices received from USDA-ERS were received in units of U.S. dollars per short ton of fertilizer, therefore they were divided by 907.185 (kilograms/short-ton) to get prices in units of U.S. dollars per kilogram of fertilizer.</w:t>
       </w:r>
     </w:p>
     <w:p/>
@@ -13515,15 +12890,7 @@
         <w:t xml:space="preserve">Data Conversions </w:t>
       </w:r>
       <w:r>
-        <w:t xml:space="preserve">– Prices received from USDA-ERS were received in units of U.S. dollars per short ton of </w:t>
-      </w:r>
-      <w:proofErr w:type="gramStart"/>
-      <w:r>
-        <w:t>fertilizer,</w:t>
-      </w:r>
-      <w:proofErr w:type="gramEnd"/>
-      <w:r>
-        <w:t xml:space="preserve"> therefore they were divided by 907.185 (kilograms/short-ton) to get prices in units of U.S. dollars per kilogram of fertilizer.</w:t>
+        <w:t>– Prices received from USDA-ERS were received in units of U.S. dollars per short ton of fertilizer, therefore they were divided by 907.185 (kilograms/short-ton) to get prices in units of U.S. dollars per kilogram of fertilizer.</w:t>
       </w:r>
     </w:p>
     <w:p/>
@@ -13649,15 +13016,7 @@
         <w:t xml:space="preserve">Data Conversions </w:t>
       </w:r>
       <w:r>
-        <w:t xml:space="preserve">– Prices received from USDA-ERS were received in units of U.S. dollars per short ton of </w:t>
-      </w:r>
-      <w:proofErr w:type="gramStart"/>
-      <w:r>
-        <w:t>fertilizer,</w:t>
-      </w:r>
-      <w:proofErr w:type="gramEnd"/>
-      <w:r>
-        <w:t xml:space="preserve"> therefore they were divided by 907.185 (kilograms/short-ton) to get prices in units of U.S. dollars per kilogram of fertilizer.</w:t>
+        <w:t>– Prices received from USDA-ERS were received in units of U.S. dollars per short ton of fertilizer, therefore they were divided by 907.185 (kilograms/short-ton) to get prices in units of U.S. dollars per kilogram of fertilizer.</w:t>
       </w:r>
     </w:p>
     <w:p/>
@@ -13782,15 +13141,7 @@
         <w:t xml:space="preserve">Data Conversions </w:t>
       </w:r>
       <w:r>
-        <w:t xml:space="preserve">– Prices received from USDA-ERS were received in units of U.S. dollars per short ton of </w:t>
-      </w:r>
-      <w:proofErr w:type="gramStart"/>
-      <w:r>
-        <w:t>fertilizer,</w:t>
-      </w:r>
-      <w:proofErr w:type="gramEnd"/>
-      <w:r>
-        <w:t xml:space="preserve"> therefore they were divided by 907.185 (kilograms/short-ton) to get prices in units of U.S. dollars per kilogram of fertilizer.</w:t>
+        <w:t>– Prices received from USDA-ERS were received in units of U.S. dollars per short ton of fertilizer, therefore they were divided by 907.185 (kilograms/short-ton) to get prices in units of U.S. dollars per kilogram of fertilizer.</w:t>
       </w:r>
     </w:p>
     <w:p/>
@@ -13915,15 +13266,7 @@
         <w:t xml:space="preserve">Data Conversions </w:t>
       </w:r>
       <w:r>
-        <w:t xml:space="preserve">– Prices received from USDA-ERS were received in units of U.S. dollars per short ton of </w:t>
-      </w:r>
-      <w:proofErr w:type="gramStart"/>
-      <w:r>
-        <w:t>fertilizer,</w:t>
-      </w:r>
-      <w:proofErr w:type="gramEnd"/>
-      <w:r>
-        <w:t xml:space="preserve"> therefore they were divided by 907.185 (kilograms/short-ton) to get prices in units of U.S. dollars per kilogram of fertilizer.</w:t>
+        <w:t>– Prices received from USDA-ERS were received in units of U.S. dollars per short ton of fertilizer, therefore they were divided by 907.185 (kilograms/short-ton) to get prices in units of U.S. dollars per kilogram of fertilizer.</w:t>
       </w:r>
     </w:p>
     <w:p/>
@@ -14049,15 +13392,7 @@
         <w:t xml:space="preserve">Data Conversions </w:t>
       </w:r>
       <w:r>
-        <w:t xml:space="preserve">– Prices received from USDA-ERS were received in units of U.S. dollars per short ton of </w:t>
-      </w:r>
-      <w:proofErr w:type="gramStart"/>
-      <w:r>
-        <w:t>fertilizer,</w:t>
-      </w:r>
-      <w:proofErr w:type="gramEnd"/>
-      <w:r>
-        <w:t xml:space="preserve"> therefore they were divided by 907.185 (kilograms/short-ton) to get prices in units of U.S. dollars per kilogram of fertilizer.</w:t>
+        <w:t>– Prices received from USDA-ERS were received in units of U.S. dollars per short ton of fertilizer, therefore they were divided by 907.185 (kilograms/short-ton) to get prices in units of U.S. dollars per kilogram of fertilizer.</w:t>
       </w:r>
     </w:p>
     <w:p/>
@@ -14182,15 +13517,7 @@
         <w:t xml:space="preserve">Data Conversions </w:t>
       </w:r>
       <w:r>
-        <w:t xml:space="preserve">– Prices received from USDA-ERS were received in units of U.S. dollars per short ton of </w:t>
-      </w:r>
-      <w:proofErr w:type="gramStart"/>
-      <w:r>
-        <w:t>fertilizer,</w:t>
-      </w:r>
-      <w:proofErr w:type="gramEnd"/>
-      <w:r>
-        <w:t xml:space="preserve"> therefore they were divided by 907.185 (kilograms/short-ton) to get prices in units of U.S. dollars per kilogram of fertilizer.</w:t>
+        <w:t>– Prices received from USDA-ERS were received in units of U.S. dollars per short ton of fertilizer, therefore they were divided by 907.185 (kilograms/short-ton) to get prices in units of U.S. dollars per kilogram of fertilizer.</w:t>
       </w:r>
     </w:p>
     <w:p/>
@@ -14401,15 +13728,7 @@
         </w:r>
       </w:hyperlink>
       <w:r>
-        <w:t xml:space="preserve">. This report provided retail water prices from water utilities across the U.S with a </w:t>
-      </w:r>
-      <w:proofErr w:type="gramStart"/>
-      <w:r>
-        <w:t>first year</w:t>
-      </w:r>
-      <w:proofErr w:type="gramEnd"/>
-      <w:r>
-        <w:t xml:space="preserve"> rate, final year rate, and escalation rate found in their survey. Therefore, annual water prices were obtained for each year between 2008 and 2023 using the provided water rates and associated escalation rate for price scaling. Counties were assigned the prices of the utility within their county if available. If a utility did not fall within a county, the mean price of water utilities in the state was used for that county. If no utilities provided data within a state, the mean price from all the utilities within the water region were used for the county.</w:t>
+        <w:t>. This report provided retail water prices from water utilities across the U.S with a first year rate, final year rate, and escalation rate found in their survey. Therefore, annual water prices were obtained for each year between 2008 and 2023 using the provided water rates and associated escalation rate for price scaling. Counties were assigned the prices of the utility within their county if available. If a utility did not fall within a county, the mean price of water utilities in the state was used for that county. If no utilities provided data within a state, the mean price from all the utilities within the water region were used for the county.</w:t>
       </w:r>
     </w:p>
     <w:p>
@@ -14554,15 +13873,7 @@
         <w:t xml:space="preserve">Data Conversions </w:t>
       </w:r>
       <w:r>
-        <w:t xml:space="preserve">– Diesel prices from EIA </w:t>
-      </w:r>
-      <w:proofErr w:type="gramStart"/>
-      <w:r>
-        <w:t>where</w:t>
-      </w:r>
-      <w:proofErr w:type="gramEnd"/>
-      <w:r>
-        <w:t xml:space="preserve"> provided in U.S. dollars per gallon, therefore prices were divided by 3.78541 (liters per gallon) to get prices in $/liter.</w:t>
+        <w:t>– Diesel prices from EIA where provided in U.S. dollars per gallon, therefore prices were divided by 3.78541 (liters per gallon) to get prices in $/liter.</w:t>
       </w:r>
     </w:p>
     <w:p/>
@@ -14687,15 +13998,7 @@
         <w:t xml:space="preserve">Data Conversions </w:t>
       </w:r>
       <w:r>
-        <w:t xml:space="preserve">– Gasoline prices from EIA </w:t>
-      </w:r>
-      <w:proofErr w:type="gramStart"/>
-      <w:r>
-        <w:t>where</w:t>
-      </w:r>
-      <w:proofErr w:type="gramEnd"/>
-      <w:r>
-        <w:t xml:space="preserve"> provided in U.S. dollars per gallon, therefore prices were divided by 3.78541 (liters per gallon) to get prices in $/liter.</w:t>
+        <w:t>– Gasoline prices from EIA where provided in U.S. dollars per gallon, therefore prices were divided by 3.78541 (liters per gallon) to get prices in $/liter.</w:t>
       </w:r>
     </w:p>
     <w:p/>
@@ -15561,15 +14864,7 @@
         <w:t xml:space="preserve">Data Conversions </w:t>
       </w:r>
       <w:r>
-        <w:t xml:space="preserve">– Values received from EIA were received in dollars per </w:t>
-      </w:r>
-      <w:proofErr w:type="gramStart"/>
-      <w:r>
-        <w:t>gallon</w:t>
-      </w:r>
-      <w:proofErr w:type="gramEnd"/>
-      <w:r>
-        <w:t xml:space="preserve"> so values were divided by 3.78541 (liters per gallon) to get prices in $/liter.</w:t>
+        <w:t>– Values received from EIA were received in dollars per gallon so values were divided by 3.78541 (liters per gallon) to get prices in $/liter.</w:t>
       </w:r>
     </w:p>
     <w:p/>
@@ -15694,15 +14989,7 @@
         <w:t xml:space="preserve">Data Conversions </w:t>
       </w:r>
       <w:r>
-        <w:t xml:space="preserve">– Values received from EIA were received in dollars per </w:t>
-      </w:r>
-      <w:proofErr w:type="gramStart"/>
-      <w:r>
-        <w:t>gallon</w:t>
-      </w:r>
-      <w:proofErr w:type="gramEnd"/>
-      <w:r>
-        <w:t xml:space="preserve"> so values were divided by 3.78541 (liters per gallon) to get prices in $/liter.</w:t>
+        <w:t>– Values received from EIA were received in dollars per gallon so values were divided by 3.78541 (liters per gallon) to get prices in $/liter.</w:t>
       </w:r>
     </w:p>
     <w:p/>
@@ -15832,7 +15119,6 @@
         <w:t xml:space="preserve">guaranteed by </w:t>
       </w:r>
       <w:hyperlink r:id="rId116" w:history="1">
-        <w:proofErr w:type="spellStart"/>
         <w:r>
           <w:rPr>
             <w:rStyle w:val="Hyperlink"/>
@@ -15840,21 +15126,12 @@
           </w:rPr>
           <w:t>Bovaer</w:t>
         </w:r>
-        <w:proofErr w:type="spellEnd"/>
       </w:hyperlink>
       <w:r>
         <w:t>.</w:t>
       </w:r>
       <w:r>
-        <w:t xml:space="preserve"> This value was acquired from a personal interview with someone familiar with the </w:t>
-      </w:r>
-      <w:proofErr w:type="spellStart"/>
-      <w:r>
-        <w:t>Bovaer</w:t>
-      </w:r>
-      <w:proofErr w:type="spellEnd"/>
-      <w:r>
-        <w:t xml:space="preserve"> business.</w:t>
+        <w:t xml:space="preserve"> This value was acquired from a personal interview with someone familiar with the Bovaer business.</w:t>
       </w:r>
     </w:p>
     <w:p>
@@ -16166,15 +15443,7 @@
         <w:t xml:space="preserve">– </w:t>
       </w:r>
       <w:r>
-        <w:t xml:space="preserve">There is no historical data available for this </w:t>
-      </w:r>
-      <w:proofErr w:type="gramStart"/>
-      <w:r>
-        <w:t>variable</w:t>
-      </w:r>
-      <w:proofErr w:type="gramEnd"/>
-      <w:r>
-        <w:t xml:space="preserve"> and it will have a user specific value. Therefore, all values in the CSV are zero and will be overwritten by the user defined value if entered.</w:t>
+        <w:t>There is no historical data available for this variable and it will have a user specific value. Therefore, all values in the CSV are zero and will be overwritten by the user defined value if entered.</w:t>
       </w:r>
     </w:p>
     <w:p>
@@ -16332,15 +15601,7 @@
         <w:t xml:space="preserve">California Low </w:t>
       </w:r>
       <w:r>
-        <w:t xml:space="preserve">Carbon Fuels Standard (LCFS) in 2024 as reported by </w:t>
-      </w:r>
-      <w:proofErr w:type="spellStart"/>
-      <w:r>
-        <w:t>Navius</w:t>
-      </w:r>
-      <w:proofErr w:type="spellEnd"/>
-      <w:r>
-        <w:t xml:space="preserve"> Research [</w:t>
+        <w:t>Carbon Fuels Standard (LCFS) in 2024 as reported by Navius Research [</w:t>
       </w:r>
       <w:hyperlink r:id="rId118" w:history="1">
         <w:r>
@@ -16891,13 +16152,8 @@
       <w:r>
         <w:t xml:space="preserve">Historical pricing data for land costs were gathered from the USDA </w:t>
       </w:r>
-      <w:proofErr w:type="spellStart"/>
-      <w:r>
-        <w:t>Quickstats</w:t>
-      </w:r>
-      <w:proofErr w:type="spellEnd"/>
-      <w:r>
-        <w:t xml:space="preserve"> Portal. County level land purchase prices from 2017 were used where available [</w:t>
+      <w:r>
+        <w:t>Quickstats Portal. County level land purchase prices from 2017 were used where available [</w:t>
       </w:r>
       <w:hyperlink r:id="rId123" w:history="1">
         <w:r>
@@ -16948,16 +16204,18 @@
     </w:p>
     <w:p/>
     <w:p>
-      <w:commentRangeStart w:id="1"/>
+      <w:commentRangeStart w:id="2"/>
       <w:r>
         <w:t>File: ‘farm_services.labor_hours.dollar_per_hour.csv’</w:t>
       </w:r>
-      <w:commentRangeEnd w:id="1"/>
+      <w:commentRangeEnd w:id="2"/>
       <w:r>
         <w:rPr>
           <w:rStyle w:val="CommentReference"/>
-        </w:rPr>
-        <w:commentReference w:id="1"/>
+          <w:sz w:val="24"/>
+          <w:szCs w:val="24"/>
+        </w:rPr>
+        <w:commentReference w:id="2"/>
       </w:r>
     </w:p>
     <w:p>
@@ -17042,35 +16300,11 @@
             <w:rStyle w:val="Hyperlink"/>
             <w:color w:val="auto"/>
           </w:rPr>
-          <w:t xml:space="preserve">National Agricultural Statistics Service </w:t>
-        </w:r>
-        <w:proofErr w:type="spellStart"/>
-        <w:r>
-          <w:rPr>
-            <w:rStyle w:val="Hyperlink"/>
-            <w:color w:val="auto"/>
-          </w:rPr>
-          <w:t>Quickstats</w:t>
-        </w:r>
-        <w:proofErr w:type="spellEnd"/>
-        <w:r>
-          <w:rPr>
-            <w:rStyle w:val="Hyperlink"/>
-            <w:color w:val="auto"/>
-          </w:rPr>
-          <w:t xml:space="preserve"> web portal</w:t>
+          <w:t>National Agricultural Statistics Service Quickstats web portal</w:t>
         </w:r>
       </w:hyperlink>
       <w:r>
-        <w:t xml:space="preserve">. This data can be obtained by selecting Group: Expenses, Commodity: Labor, Category: Wage Rate, Data Item: Labor, </w:t>
-      </w:r>
-      <w:proofErr w:type="gramStart"/>
-      <w:r>
-        <w:t>Hired</w:t>
-      </w:r>
-      <w:proofErr w:type="gramEnd"/>
-      <w:r>
-        <w:t xml:space="preserve"> – Wage Rate, Measured in $ / Hour, Geographic Level: National + State, Year: All, Period Type: Annual, Period: Annual. State level values were then assigned uniformly to each county within the state. When state or data was unavailable, the U.S. mean value was used.</w:t>
+        <w:t>. This data can be obtained by selecting Group: Expenses, Commodity: Labor, Category: Wage Rate, Data Item: Labor, Hired – Wage Rate, Measured in $ / Hour, Geographic Level: National + State, Year: All, Period Type: Annual, Period: Annual. State level values were then assigned uniformly to each county within the state. When state or data was unavailable, the U.S. mean value was used.</w:t>
       </w:r>
     </w:p>
     <w:p>
@@ -17089,15 +16323,7 @@
         <w:t xml:space="preserve">Data Conversions </w:t>
       </w:r>
       <w:r>
-        <w:t xml:space="preserve">– No conversions were made to this data from that received from the USDA’s </w:t>
-      </w:r>
-      <w:proofErr w:type="spellStart"/>
-      <w:r>
-        <w:t>Quickstats</w:t>
-      </w:r>
-      <w:proofErr w:type="spellEnd"/>
-      <w:r>
-        <w:t xml:space="preserve"> web portal.</w:t>
+        <w:t>– No conversions were made to this data from that received from the USDA’s Quickstats web portal.</w:t>
       </w:r>
     </w:p>
     <w:p/>
@@ -17260,31 +16486,7 @@
         </w:numPr>
       </w:pPr>
       <w:r>
-        <w:t>Then the rates were converted from $/mi/truckload to $/mi/</w:t>
-      </w:r>
-      <w:proofErr w:type="spellStart"/>
-      <w:r>
-        <w:t>lbs</w:t>
-      </w:r>
-      <w:proofErr w:type="spellEnd"/>
-      <w:r>
-        <w:t xml:space="preserve"> by dividing by 45,000 lbs. 45,000 </w:t>
-      </w:r>
-      <w:proofErr w:type="spellStart"/>
-      <w:r>
-        <w:t>lbs</w:t>
-      </w:r>
-      <w:proofErr w:type="spellEnd"/>
-      <w:r>
-        <w:t xml:space="preserve"> was calculated using the assumed 80,000 </w:t>
-      </w:r>
-      <w:proofErr w:type="spellStart"/>
-      <w:r>
-        <w:t>lbs</w:t>
-      </w:r>
-      <w:proofErr w:type="spellEnd"/>
-      <w:r>
-        <w:t xml:space="preserve"> gross truckload weight and a truck + trailer weight of 35,000 lbs. </w:t>
+        <w:t xml:space="preserve">Then the rates were converted from $/mi/truckload to $/mi/lbs by dividing by 45,000 lbs. 45,000 lbs was calculated using the assumed 80,000 lbs gross truckload weight and a truck + trailer weight of 35,000 lbs. </w:t>
       </w:r>
     </w:p>
     <w:p>
@@ -17423,13 +16625,8 @@
       <w:r>
         <w:t xml:space="preserve">Historical pricing data for land costs were gathered from the USDA </w:t>
       </w:r>
-      <w:proofErr w:type="spellStart"/>
-      <w:r>
-        <w:t>Quickstats</w:t>
-      </w:r>
-      <w:proofErr w:type="spellEnd"/>
-      <w:r>
-        <w:t xml:space="preserve"> Portal. County level land purchase prices from 2017 were used where available [</w:t>
+      <w:r>
+        <w:t>Quickstats Portal. County level land purchase prices from 2017 were used where available [</w:t>
       </w:r>
       <w:hyperlink r:id="rId126" w:history="1">
         <w:r>
@@ -18081,16 +17278,8 @@
         <w:rPr>
           <w:color w:val="000000" w:themeColor="text1"/>
         </w:rPr>
-        <w:t xml:space="preserve">– Labor hours for management for dairy cows excluding manure </w:t>
-      </w:r>
-      <w:proofErr w:type="spellStart"/>
-      <w:r>
-        <w:rPr>
-          <w:color w:val="000000" w:themeColor="text1"/>
-        </w:rPr>
-        <w:t>mangement</w:t>
-      </w:r>
-      <w:proofErr w:type="spellEnd"/>
+        <w:t>– Labor hours for management for dairy cows excluding manure mangement</w:t>
+      </w:r>
     </w:p>
     <w:p>
       <w:pPr>
@@ -18258,7 +17447,24 @@
       </w:r>
     </w:p>
   </w:comment>
-  <w:comment w:id="1" w:author="Braden Limb" w:date="2025-07-30T14:03:00Z" w:initials="BL">
+  <w:comment w:id="1" w:author="Braden Limb" w:date="2026-06-15T13:53:00Z" w:initials="BL">
+    <w:p>
+      <w:r>
+        <w:rPr>
+          <w:rStyle w:val="CommentReference"/>
+        </w:rPr>
+        <w:annotationRef/>
+      </w:r>
+      <w:r>
+        <w:rPr>
+          <w:sz w:val="20"/>
+          <w:szCs w:val="20"/>
+        </w:rPr>
+        <w:t>This needs to change to per kg</w:t>
+      </w:r>
+    </w:p>
+  </w:comment>
+  <w:comment w:id="2" w:author="Braden Limb" w:date="2025-07-30T14:03:00Z" w:initials="BL">
     <w:p>
       <w:r>
         <w:rPr>
@@ -18281,6 +17487,7 @@
 <file path=word/commentsExtended.xml><?xml version="1.0" encoding="utf-8"?>
 <w15:commentsEx xmlns:wpc="http://schemas.microsoft.com/office/word/2010/wordprocessingCanvas" xmlns:cx="http://schemas.microsoft.com/office/drawing/2014/chartex" xmlns:cx1="http://schemas.microsoft.com/office/drawing/2015/9/8/chartex" xmlns:cx2="http://schemas.microsoft.com/office/drawing/2015/10/21/chartex" xmlns:cx3="http://schemas.microsoft.com/office/drawing/2016/5/9/chartex" xmlns:cx4="http://schemas.microsoft.com/office/drawing/2016/5/10/chartex" xmlns:cx5="http://schemas.microsoft.com/office/drawing/2016/5/11/chartex" xmlns:cx6="http://schemas.microsoft.com/office/drawing/2016/5/12/chartex" xmlns:cx7="http://schemas.microsoft.com/office/drawing/2016/5/13/chartex" xmlns:cx8="http://schemas.microsoft.com/office/drawing/2016/5/14/chartex" xmlns:mc="http://schemas.openxmlformats.org/markup-compatibility/2006" xmlns:aink="http://schemas.microsoft.com/office/drawing/2016/ink" xmlns:am3d="http://schemas.microsoft.com/office/drawing/2017/model3d" xmlns:o="urn:schemas-microsoft-com:office:office" xmlns:oel="http://schemas.microsoft.com/office/2019/extlst" xmlns:r="http://schemas.openxmlformats.org/officeDocument/2006/relationships" xmlns:m="http://schemas.openxmlformats.org/officeDocument/2006/math" xmlns:v="urn:schemas-microsoft-com:vml" xmlns:wp14="http://schemas.microsoft.com/office/word/2010/wordprocessingDrawing" xmlns:wp="http://schemas.openxmlformats.org/drawingml/2006/wordprocessingDrawing" xmlns:w10="urn:schemas-microsoft-com:office:word" xmlns:w="http://schemas.openxmlformats.org/wordprocessingml/2006/main" xmlns:w14="http://schemas.microsoft.com/office/word/2010/wordml" xmlns:w15="http://schemas.microsoft.com/office/word/2012/wordml" xmlns:w16cex="http://schemas.microsoft.com/office/word/2018/wordml/cex" xmlns:w16cid="http://schemas.microsoft.com/office/word/2016/wordml/cid" xmlns:w16="http://schemas.microsoft.com/office/word/2018/wordml" xmlns:w16du="http://schemas.microsoft.com/office/word/2023/wordml/word16du" xmlns:w16sdtdh="http://schemas.microsoft.com/office/word/2020/wordml/sdtdatahash" xmlns:w16sdtfl="http://schemas.microsoft.com/office/word/2024/wordml/sdtformatlock" xmlns:w16se="http://schemas.microsoft.com/office/word/2015/wordml/symex" xmlns:wpg="http://schemas.microsoft.com/office/word/2010/wordprocessingGroup" xmlns:wpi="http://schemas.microsoft.com/office/word/2010/wordprocessingInk" xmlns:wne="http://schemas.microsoft.com/office/word/2006/wordml" xmlns:wps="http://schemas.microsoft.com/office/word/2010/wordprocessingShape" mc:Ignorable="w14 w15 w16se w16cid w16 w16cex w16sdtdh w16sdtfl w16du wp14">
   <w15:commentEx w15:paraId="42D45FEE" w15:done="0"/>
+  <w15:commentEx w15:paraId="2F8F5079" w15:done="0"/>
   <w15:commentEx w15:paraId="1BF884BD" w15:done="0"/>
 </w15:commentsEx>
 </file>
@@ -18288,6 +17495,7 @@
 <file path=word/commentsExtensible.xml><?xml version="1.0" encoding="utf-8"?>
 <w16cex:commentsExtensible xmlns:wpc="http://schemas.microsoft.com/office/word/2010/wordprocessingCanvas" xmlns:cx="http://schemas.microsoft.com/office/drawing/2014/chartex" xmlns:cx1="http://schemas.microsoft.com/office/drawing/2015/9/8/chartex" xmlns:cx2="http://schemas.microsoft.com/office/drawing/2015/10/21/chartex" xmlns:cx3="http://schemas.microsoft.com/office/drawing/2016/5/9/chartex" xmlns:cx4="http://schemas.microsoft.com/office/drawing/2016/5/10/chartex" xmlns:cx5="http://schemas.microsoft.com/office/drawing/2016/5/11/chartex" xmlns:cx6="http://schemas.microsoft.com/office/drawing/2016/5/12/chartex" xmlns:cx7="http://schemas.microsoft.com/office/drawing/2016/5/13/chartex" xmlns:cx8="http://schemas.microsoft.com/office/drawing/2016/5/14/chartex" xmlns:cr="http://schemas.microsoft.com/office/comments/2020/reactions" xmlns:mc="http://schemas.openxmlformats.org/markup-compatibility/2006" xmlns:aink="http://schemas.microsoft.com/office/drawing/2016/ink" xmlns:am3d="http://schemas.microsoft.com/office/drawing/2017/model3d" xmlns:o="urn:schemas-microsoft-com:office:office" xmlns:oel="http://schemas.microsoft.com/office/2019/extlst" xmlns:r="http://schemas.openxmlformats.org/officeDocument/2006/relationships" xmlns:m="http://schemas.openxmlformats.org/officeDocument/2006/math" xmlns:v="urn:schemas-microsoft-com:vml" xmlns:wp14="http://schemas.microsoft.com/office/word/2010/wordprocessingDrawing" xmlns:wp="http://schemas.openxmlformats.org/drawingml/2006/wordprocessingDrawing" xmlns:w10="urn:schemas-microsoft-com:office:word" xmlns:w="http://schemas.openxmlformats.org/wordprocessingml/2006/main" xmlns:w14="http://schemas.microsoft.com/office/word/2010/wordml" xmlns:w15="http://schemas.microsoft.com/office/word/2012/wordml" xmlns:w16cex="http://schemas.microsoft.com/office/word/2018/wordml/cex" xmlns:w16cid="http://schemas.microsoft.com/office/word/2016/wordml/cid" xmlns:w16="http://schemas.microsoft.com/office/word/2018/wordml" xmlns:w16du="http://schemas.microsoft.com/office/word/2023/wordml/word16du" xmlns:w16sdtdh="http://schemas.microsoft.com/office/word/2020/wordml/sdtdatahash" xmlns:w16sdtfl="http://schemas.microsoft.com/office/word/2024/wordml/sdtformatlock" xmlns:w16se="http://schemas.microsoft.com/office/word/2015/wordml/symex" xmlns:wpg="http://schemas.microsoft.com/office/word/2010/wordprocessingGroup" xmlns:wpi="http://schemas.microsoft.com/office/word/2010/wordprocessingInk" xmlns:wne="http://schemas.microsoft.com/office/word/2006/wordml" xmlns:wps="http://schemas.microsoft.com/office/word/2010/wordprocessingShape" mc:Ignorable="w14 w15 w16se w16cid w16 w16cex w16sdtdh w16sdtfl cr w16du wp14">
   <w16cex:commentExtensible w16cex:durableId="61A4A495" w16cex:dateUtc="2025-04-07T18:53:00Z"/>
+  <w16cex:commentExtensible w16cex:durableId="1CF63AD1" w16cex:dateUtc="2026-06-15T19:53:00Z"/>
   <w16cex:commentExtensible w16cex:durableId="0918C9D9" w16cex:dateUtc="2025-07-30T20:03:00Z"/>
 </w16cex:commentsExtensible>
 </file>
@@ -18295,6 +17503,7 @@
 <file path=word/commentsIds.xml><?xml version="1.0" encoding="utf-8"?>
 <w16cid:commentsIds xmlns:wpc="http://schemas.microsoft.com/office/word/2010/wordprocessingCanvas" xmlns:cx="http://schemas.microsoft.com/office/drawing/2014/chartex" xmlns:cx1="http://schemas.microsoft.com/office/drawing/2015/9/8/chartex" xmlns:cx2="http://schemas.microsoft.com/office/drawing/2015/10/21/chartex" xmlns:cx3="http://schemas.microsoft.com/office/drawing/2016/5/9/chartex" xmlns:cx4="http://schemas.microsoft.com/office/drawing/2016/5/10/chartex" xmlns:cx5="http://schemas.microsoft.com/office/drawing/2016/5/11/chartex" xmlns:cx6="http://schemas.microsoft.com/office/drawing/2016/5/12/chartex" xmlns:cx7="http://schemas.microsoft.com/office/drawing/2016/5/13/chartex" xmlns:cx8="http://schemas.microsoft.com/office/drawing/2016/5/14/chartex" xmlns:mc="http://schemas.openxmlformats.org/markup-compatibility/2006" xmlns:aink="http://schemas.microsoft.com/office/drawing/2016/ink" xmlns:am3d="http://schemas.microsoft.com/office/drawing/2017/model3d" xmlns:o="urn:schemas-microsoft-com:office:office" xmlns:oel="http://schemas.microsoft.com/office/2019/extlst" xmlns:r="http://schemas.openxmlformats.org/officeDocument/2006/relationships" xmlns:m="http://schemas.openxmlformats.org/officeDocument/2006/math" xmlns:v="urn:schemas-microsoft-com:vml" xmlns:wp14="http://schemas.microsoft.com/office/word/2010/wordprocessingDrawing" xmlns:wp="http://schemas.openxmlformats.org/drawingml/2006/wordprocessingDrawing" xmlns:w10="urn:schemas-microsoft-com:office:word" xmlns:w="http://schemas.openxmlformats.org/wordprocessingml/2006/main" xmlns:w14="http://schemas.microsoft.com/office/word/2010/wordml" xmlns:w15="http://schemas.microsoft.com/office/word/2012/wordml" xmlns:w16cex="http://schemas.microsoft.com/office/word/2018/wordml/cex" xmlns:w16cid="http://schemas.microsoft.com/office/word/2016/wordml/cid" xmlns:w16="http://schemas.microsoft.com/office/word/2018/wordml" xmlns:w16du="http://schemas.microsoft.com/office/word/2023/wordml/word16du" xmlns:w16sdtdh="http://schemas.microsoft.com/office/word/2020/wordml/sdtdatahash" xmlns:w16sdtfl="http://schemas.microsoft.com/office/word/2024/wordml/sdtformatlock" xmlns:w16se="http://schemas.microsoft.com/office/word/2015/wordml/symex" xmlns:wpg="http://schemas.microsoft.com/office/word/2010/wordprocessingGroup" xmlns:wpi="http://schemas.microsoft.com/office/word/2010/wordprocessingInk" xmlns:wne="http://schemas.microsoft.com/office/word/2006/wordml" xmlns:wps="http://schemas.microsoft.com/office/word/2010/wordprocessingShape" mc:Ignorable="w14 w15 w16se w16cid w16 w16cex w16sdtdh w16sdtfl w16du wp14">
   <w16cid:commentId w16cid:paraId="42D45FEE" w16cid:durableId="61A4A495"/>
+  <w16cid:commentId w16cid:paraId="2F8F5079" w16cid:durableId="1CF63AD1"/>
   <w16cid:commentId w16cid:paraId="1BF884BD" w16cid:durableId="0918C9D9"/>
 </w16cid:commentsIds>
 </file>
@@ -19976,7 +19185,7 @@
   <w:style w:type="paragraph" w:default="1" w:styleId="Normal">
     <w:name w:val="Normal"/>
     <w:qFormat/>
-    <w:rsid w:val="00CD3E27"/>
+    <w:rsid w:val="00992883"/>
     <w:pPr>
       <w:spacing w:after="160" w:line="278" w:lineRule="auto"/>
     </w:pPr>
@@ -19990,7 +19199,7 @@
     <w:uiPriority w:val="1"/>
     <w:semiHidden/>
     <w:unhideWhenUsed/>
-    <w:rsid w:val="00CD3E27"/>
+    <w:rsid w:val="00992883"/>
   </w:style>
   <w:style w:type="table" w:default="1" w:styleId="TableNormal">
     <w:name w:val="Normal Table"/>
@@ -20012,7 +19221,7 @@
     <w:uiPriority w:val="99"/>
     <w:semiHidden/>
     <w:unhideWhenUsed/>
-    <w:rsid w:val="00CD3E27"/>
+    <w:rsid w:val="00992883"/>
   </w:style>
   <w:style w:type="character" w:styleId="Hyperlink">
     <w:name w:val="Hyperlink"/>

</xml_diff>

<commit_message>
updating bedding to clarify lactating cow
</commit_message>
<xml_diff>
--- a/_RuFaS Input Files/_Data Dictionary.docx
+++ b/_RuFaS Input Files/_Data Dictionary.docx
@@ -1,6 +1,6 @@
 
 <file path=word/document.xml><?xml version="1.0" encoding="utf-8"?>
-<w:document xmlns:wpc="http://schemas.microsoft.com/office/word/2010/wordprocessingCanvas" xmlns:cx="http://schemas.microsoft.com/office/drawing/2014/chartex" xmlns:cx1="http://schemas.microsoft.com/office/drawing/2015/9/8/chartex" xmlns:cx2="http://schemas.microsoft.com/office/drawing/2015/10/21/chartex" xmlns:cx3="http://schemas.microsoft.com/office/drawing/2016/5/9/chartex" xmlns:cx4="http://schemas.microsoft.com/office/drawing/2016/5/10/chartex" xmlns:cx5="http://schemas.microsoft.com/office/drawing/2016/5/11/chartex" xmlns:cx6="http://schemas.microsoft.com/office/drawing/2016/5/12/chartex" xmlns:cx7="http://schemas.microsoft.com/office/drawing/2016/5/13/chartex" xmlns:cx8="http://schemas.microsoft.com/office/drawing/2016/5/14/chartex" xmlns:mc="http://schemas.openxmlformats.org/markup-compatibility/2006" xmlns:aink="http://schemas.microsoft.com/office/drawing/2016/ink" xmlns:am3d="http://schemas.microsoft.com/office/drawing/2017/model3d" xmlns:o="urn:schemas-microsoft-com:office:office" xmlns:oel="http://schemas.microsoft.com/office/2019/extlst" xmlns:r="http://schemas.openxmlformats.org/officeDocument/2006/relationships" xmlns:m="http://schemas.openxmlformats.org/officeDocument/2006/math" xmlns:v="urn:schemas-microsoft-com:vml" xmlns:wp14="http://schemas.microsoft.com/office/word/2010/wordprocessingDrawing" xmlns:wp="http://schemas.openxmlformats.org/drawingml/2006/wordprocessingDrawing" xmlns:w10="urn:schemas-microsoft-com:office:word" xmlns:w="http://schemas.openxmlformats.org/wordprocessingml/2006/main" xmlns:w14="http://schemas.microsoft.com/office/word/2010/wordml" xmlns:w15="http://schemas.microsoft.com/office/word/2012/wordml" xmlns:w16cex="http://schemas.microsoft.com/office/word/2018/wordml/cex" xmlns:w16cid="http://schemas.microsoft.com/office/word/2016/wordml/cid" xmlns:w16="http://schemas.microsoft.com/office/word/2018/wordml" xmlns:w16du="http://schemas.microsoft.com/office/word/2023/wordml/word16du" xmlns:w16sdtdh="http://schemas.microsoft.com/office/word/2020/wordml/sdtdatahash" xmlns:w16sdtfl="http://schemas.microsoft.com/office/word/2024/wordml/sdtformatlock" xmlns:w16se="http://schemas.microsoft.com/office/word/2015/wordml/symex" xmlns:wpg="http://schemas.microsoft.com/office/word/2010/wordprocessingGroup" xmlns:wpi="http://schemas.microsoft.com/office/word/2010/wordprocessingInk" xmlns:wne="http://schemas.microsoft.com/office/word/2006/wordml" xmlns:wps="http://schemas.microsoft.com/office/word/2010/wordprocessingShape" mc:Ignorable="w14 w15 w16se w16cid w16 w16cex w16sdtdh w16sdtfl w16du wp14">
+<w:document xmlns:wpc="http://schemas.microsoft.com/office/word/2010/wordprocessingCanvas" xmlns:cx="http://schemas.microsoft.com/office/drawing/2014/chartex" xmlns:cx1="http://schemas.microsoft.com/office/drawing/2015/9/8/chartex" xmlns:cx2="http://schemas.microsoft.com/office/drawing/2015/10/21/chartex" xmlns:cx3="http://schemas.microsoft.com/office/drawing/2016/5/9/chartex" xmlns:cx4="http://schemas.microsoft.com/office/drawing/2016/5/10/chartex" xmlns:cx5="http://schemas.microsoft.com/office/drawing/2016/5/11/chartex" xmlns:cx6="http://schemas.microsoft.com/office/drawing/2016/5/12/chartex" xmlns:cx7="http://schemas.microsoft.com/office/drawing/2016/5/13/chartex" xmlns:cx8="http://schemas.microsoft.com/office/drawing/2016/5/14/chartex" xmlns:mc="http://schemas.openxmlformats.org/markup-compatibility/2006" xmlns:m="http://schemas.openxmlformats.org/officeDocument/2006/math" xmlns:aink="http://schemas.microsoft.com/office/drawing/2016/ink" xmlns:am3d="http://schemas.microsoft.com/office/drawing/2017/model3d" xmlns:oel="http://schemas.microsoft.com/office/2019/extlst" xmlns:r="http://schemas.openxmlformats.org/officeDocument/2006/relationships" xmlns:wp14="http://schemas.microsoft.com/office/word/2010/wordprocessingDrawing" xmlns:wp="http://schemas.openxmlformats.org/drawingml/2006/wordprocessingDrawing" xmlns:wpg="http://schemas.microsoft.com/office/word/2010/wordprocessingGroup" xmlns:wpi="http://schemas.microsoft.com/office/word/2010/wordprocessingInk" xmlns:wps="http://schemas.microsoft.com/office/word/2010/wordprocessingShape" xmlns:o="urn:schemas-microsoft-com:office:office" xmlns:v="urn:schemas-microsoft-com:vml" xmlns:w10="urn:schemas-microsoft-com:office:word" xmlns:w="http://schemas.openxmlformats.org/wordprocessingml/2006/main" xmlns:w14="http://schemas.microsoft.com/office/word/2010/wordml" xmlns:w15="http://schemas.microsoft.com/office/word/2012/wordml" xmlns:w16cei="http://schemas.microsoft.com/office/word/2026/wordml/cei" xmlns:w16cex="http://schemas.microsoft.com/office/word/2018/wordml/cex" xmlns:w16cid="http://schemas.microsoft.com/office/word/2016/wordml/cid" xmlns:w16="http://schemas.microsoft.com/office/word/2018/wordml" xmlns:w16sdtdh="http://schemas.microsoft.com/office/word/2020/wordml/sdtdatahash" xmlns:w16sdtfl="http://schemas.microsoft.com/office/word/2024/wordml/sdtformatlock" xmlns:w16se="http://schemas.microsoft.com/office/word/2015/wordml/symex" xmlns:w16du="http://schemas.microsoft.com/office/word/2023/wordml/word16du" xmlns:wne="http://schemas.microsoft.com/office/word/2006/wordml" mc:Ignorable="w14 w15 w16se w16cid w16 w16cex w16sdtdh w16sdtfl w16du wp14">
   <w:body>
     <w:p>
       <w:pPr>
@@ -6240,7 +6240,16 @@
         <w:t xml:space="preserve">– U.S. dollars per </w:t>
       </w:r>
       <w:r>
-        <w:t>head of cattle per year</w:t>
+        <w:t xml:space="preserve">lactating </w:t>
+      </w:r>
+      <w:r>
+        <w:t>cow</w:t>
+      </w:r>
+      <w:r>
+        <w:t xml:space="preserve"> </w:t>
+      </w:r>
+      <w:r>
+        <w:t>per year</w:t>
       </w:r>
     </w:p>
     <w:p>
@@ -6302,7 +6311,13 @@
         <w:t xml:space="preserve">Default value calculated here was found </w:t>
       </w:r>
       <w:r>
-        <w:t>based on USDA ERS cost of production reports, using the "all farm size" value of $0.20 per cwt milk and 0.729 cwt of milk per cow per day</w:t>
+        <w:t xml:space="preserve">based on USDA ERS cost of production reports, using the "all farm size" value of $0.20 per cwt milk and 0.729 cwt of milk per </w:t>
+      </w:r>
+      <w:r>
+        <w:t xml:space="preserve">lactating </w:t>
+      </w:r>
+      <w:r>
+        <w:t>cow per day</w:t>
       </w:r>
     </w:p>
     <w:p/>
@@ -6387,7 +6402,16 @@
         <w:t xml:space="preserve">– U.S. dollars per </w:t>
       </w:r>
       <w:r>
-        <w:t>head of cattle per year</w:t>
+        <w:t xml:space="preserve">lactating </w:t>
+      </w:r>
+      <w:r>
+        <w:t>cow</w:t>
+      </w:r>
+      <w:r>
+        <w:t xml:space="preserve"> </w:t>
+      </w:r>
+      <w:r>
+        <w:t>per year</w:t>
       </w:r>
     </w:p>
     <w:p>
@@ -6449,7 +6473,13 @@
         <w:t xml:space="preserve">Default value calculated here was found </w:t>
       </w:r>
       <w:r>
-        <w:t>based on USDA ERS cost of production reports, using the "all farm size" value of $0.20 per cwt milk and 0.729 cwt of milk per cow per day</w:t>
+        <w:t xml:space="preserve">based on USDA ERS cost of production reports, using the "all farm size" value of $0.20 per cwt milk and 0.729 cwt of milk per </w:t>
+      </w:r>
+      <w:r>
+        <w:t xml:space="preserve">lactating </w:t>
+      </w:r>
+      <w:r>
+        <w:t>cow per day</w:t>
       </w:r>
     </w:p>
     <w:p/>
@@ -6533,7 +6563,16 @@
         <w:t xml:space="preserve">– U.S. dollars per </w:t>
       </w:r>
       <w:r>
-        <w:t>head of cattle per year</w:t>
+        <w:t xml:space="preserve">lactating </w:t>
+      </w:r>
+      <w:r>
+        <w:t>cow</w:t>
+      </w:r>
+      <w:r>
+        <w:t xml:space="preserve"> </w:t>
+      </w:r>
+      <w:r>
+        <w:t>per year</w:t>
       </w:r>
     </w:p>
     <w:p>
@@ -6595,7 +6634,13 @@
         <w:t xml:space="preserve">Default value calculated here was found </w:t>
       </w:r>
       <w:r>
-        <w:t>based on USDA ERS cost of production reports, using the "all farm size" value of $0.20 per cwt milk and 0.729 cwt of milk per cow per day</w:t>
+        <w:t xml:space="preserve">based on USDA ERS cost of production reports, using the "all farm size" value of $0.20 per cwt milk and 0.729 cwt of milk per </w:t>
+      </w:r>
+      <w:r>
+        <w:t xml:space="preserve">lactating </w:t>
+      </w:r>
+      <w:r>
+        <w:t>cow per day</w:t>
       </w:r>
     </w:p>
     <w:p/>
@@ -6679,7 +6724,13 @@
         <w:t xml:space="preserve">– U.S. dollars per </w:t>
       </w:r>
       <w:r>
-        <w:t>head of cattle per year</w:t>
+        <w:t xml:space="preserve">lactating </w:t>
+      </w:r>
+      <w:r>
+        <w:t>cow</w:t>
+      </w:r>
+      <w:r>
+        <w:t xml:space="preserve"> per year</w:t>
       </w:r>
     </w:p>
     <w:p>
@@ -6741,7 +6792,13 @@
         <w:t xml:space="preserve">Default value calculated here was found </w:t>
       </w:r>
       <w:r>
-        <w:t>based on USDA ERS cost of production reports, using the "all farm size" value of $0.20 per cwt milk and 0.729 cwt of milk per cow per day</w:t>
+        <w:t xml:space="preserve">based on USDA ERS cost of production reports, using the "all farm size" value of $0.20 per cwt milk and 0.729 cwt of milk per </w:t>
+      </w:r>
+      <w:r>
+        <w:t xml:space="preserve">lactating </w:t>
+      </w:r>
+      <w:r>
+        <w:t>cow per day</w:t>
       </w:r>
     </w:p>
     <w:p/>
@@ -6827,7 +6884,13 @@
         <w:t xml:space="preserve">– U.S. dollars per </w:t>
       </w:r>
       <w:r>
-        <w:t>head of cattle per year</w:t>
+        <w:t xml:space="preserve">lactating </w:t>
+      </w:r>
+      <w:r>
+        <w:t>cow</w:t>
+      </w:r>
+      <w:r>
+        <w:t xml:space="preserve"> per year</w:t>
       </w:r>
     </w:p>
     <w:p>
@@ -6889,7 +6952,13 @@
         <w:t xml:space="preserve">Default value calculated here was found </w:t>
       </w:r>
       <w:r>
-        <w:t>based on USDA ERS cost of production reports, using the "all farm size" value of $0.20 per cwt milk and 0.729 cwt of milk per cow per day</w:t>
+        <w:t xml:space="preserve">based on USDA ERS cost of production reports, using the "all farm size" value of $0.20 per cwt milk and 0.729 cwt of milk per </w:t>
+      </w:r>
+      <w:r>
+        <w:t xml:space="preserve">lactating </w:t>
+      </w:r>
+      <w:r>
+        <w:t>cow per day</w:t>
       </w:r>
     </w:p>
     <w:p/>
@@ -17429,7 +17498,7 @@
 </file>
 
 <file path=word/comments.xml><?xml version="1.0" encoding="utf-8"?>
-<w:comments xmlns:wpc="http://schemas.microsoft.com/office/word/2010/wordprocessingCanvas" xmlns:cx="http://schemas.microsoft.com/office/drawing/2014/chartex" xmlns:cx1="http://schemas.microsoft.com/office/drawing/2015/9/8/chartex" xmlns:cx2="http://schemas.microsoft.com/office/drawing/2015/10/21/chartex" xmlns:cx3="http://schemas.microsoft.com/office/drawing/2016/5/9/chartex" xmlns:cx4="http://schemas.microsoft.com/office/drawing/2016/5/10/chartex" xmlns:cx5="http://schemas.microsoft.com/office/drawing/2016/5/11/chartex" xmlns:cx6="http://schemas.microsoft.com/office/drawing/2016/5/12/chartex" xmlns:cx7="http://schemas.microsoft.com/office/drawing/2016/5/13/chartex" xmlns:cx8="http://schemas.microsoft.com/office/drawing/2016/5/14/chartex" xmlns:mc="http://schemas.openxmlformats.org/markup-compatibility/2006" xmlns:aink="http://schemas.microsoft.com/office/drawing/2016/ink" xmlns:am3d="http://schemas.microsoft.com/office/drawing/2017/model3d" xmlns:o="urn:schemas-microsoft-com:office:office" xmlns:oel="http://schemas.microsoft.com/office/2019/extlst" xmlns:r="http://schemas.openxmlformats.org/officeDocument/2006/relationships" xmlns:m="http://schemas.openxmlformats.org/officeDocument/2006/math" xmlns:v="urn:schemas-microsoft-com:vml" xmlns:wp14="http://schemas.microsoft.com/office/word/2010/wordprocessingDrawing" xmlns:wp="http://schemas.openxmlformats.org/drawingml/2006/wordprocessingDrawing" xmlns:w10="urn:schemas-microsoft-com:office:word" xmlns:w="http://schemas.openxmlformats.org/wordprocessingml/2006/main" xmlns:w14="http://schemas.microsoft.com/office/word/2010/wordml" xmlns:w15="http://schemas.microsoft.com/office/word/2012/wordml" xmlns:w16cex="http://schemas.microsoft.com/office/word/2018/wordml/cex" xmlns:w16cid="http://schemas.microsoft.com/office/word/2016/wordml/cid" xmlns:w16="http://schemas.microsoft.com/office/word/2018/wordml" xmlns:w16du="http://schemas.microsoft.com/office/word/2023/wordml/word16du" xmlns:w16sdtdh="http://schemas.microsoft.com/office/word/2020/wordml/sdtdatahash" xmlns:w16sdtfl="http://schemas.microsoft.com/office/word/2024/wordml/sdtformatlock" xmlns:w16se="http://schemas.microsoft.com/office/word/2015/wordml/symex" xmlns:wpg="http://schemas.microsoft.com/office/word/2010/wordprocessingGroup" xmlns:wpi="http://schemas.microsoft.com/office/word/2010/wordprocessingInk" xmlns:wne="http://schemas.microsoft.com/office/word/2006/wordml" xmlns:wps="http://schemas.microsoft.com/office/word/2010/wordprocessingShape" mc:Ignorable="w14 w15 w16se w16cid w16 w16cex w16sdtdh w16sdtfl w16du wp14">
+<w:comments xmlns:wpc="http://schemas.microsoft.com/office/word/2010/wordprocessingCanvas" xmlns:cx="http://schemas.microsoft.com/office/drawing/2014/chartex" xmlns:cx1="http://schemas.microsoft.com/office/drawing/2015/9/8/chartex" xmlns:cx2="http://schemas.microsoft.com/office/drawing/2015/10/21/chartex" xmlns:cx3="http://schemas.microsoft.com/office/drawing/2016/5/9/chartex" xmlns:cx4="http://schemas.microsoft.com/office/drawing/2016/5/10/chartex" xmlns:cx5="http://schemas.microsoft.com/office/drawing/2016/5/11/chartex" xmlns:cx6="http://schemas.microsoft.com/office/drawing/2016/5/12/chartex" xmlns:cx7="http://schemas.microsoft.com/office/drawing/2016/5/13/chartex" xmlns:cx8="http://schemas.microsoft.com/office/drawing/2016/5/14/chartex" xmlns:mc="http://schemas.openxmlformats.org/markup-compatibility/2006" xmlns:m="http://schemas.openxmlformats.org/officeDocument/2006/math" xmlns:aink="http://schemas.microsoft.com/office/drawing/2016/ink" xmlns:am3d="http://schemas.microsoft.com/office/drawing/2017/model3d" xmlns:oel="http://schemas.microsoft.com/office/2019/extlst" xmlns:r="http://schemas.openxmlformats.org/officeDocument/2006/relationships" xmlns:wp14="http://schemas.microsoft.com/office/word/2010/wordprocessingDrawing" xmlns:wp="http://schemas.openxmlformats.org/drawingml/2006/wordprocessingDrawing" xmlns:wpg="http://schemas.microsoft.com/office/word/2010/wordprocessingGroup" xmlns:wpi="http://schemas.microsoft.com/office/word/2010/wordprocessingInk" xmlns:wps="http://schemas.microsoft.com/office/word/2010/wordprocessingShape" xmlns:o="urn:schemas-microsoft-com:office:office" xmlns:v="urn:schemas-microsoft-com:vml" xmlns:w10="urn:schemas-microsoft-com:office:word" xmlns:w="http://schemas.openxmlformats.org/wordprocessingml/2006/main" xmlns:w14="http://schemas.microsoft.com/office/word/2010/wordml" xmlns:w15="http://schemas.microsoft.com/office/word/2012/wordml" xmlns:w16cei="http://schemas.microsoft.com/office/word/2026/wordml/cei" xmlns:w16cex="http://schemas.microsoft.com/office/word/2018/wordml/cex" xmlns:w16cid="http://schemas.microsoft.com/office/word/2016/wordml/cid" xmlns:w16="http://schemas.microsoft.com/office/word/2018/wordml" xmlns:w16sdtdh="http://schemas.microsoft.com/office/word/2020/wordml/sdtdatahash" xmlns:w16sdtfl="http://schemas.microsoft.com/office/word/2024/wordml/sdtformatlock" xmlns:w16se="http://schemas.microsoft.com/office/word/2015/wordml/symex" xmlns:w16du="http://schemas.microsoft.com/office/word/2023/wordml/word16du" xmlns:wne="http://schemas.microsoft.com/office/word/2006/wordml" mc:Ignorable="w14 w15 w16se w16cid w16 w16cex w16sdtdh w16sdtfl w16du wp14">
   <w:comment w:id="0" w:author="Braden Limb" w:date="2025-04-07T12:53:00Z" w:initials="BL">
     <w:p>
       <w:r>
@@ -17485,7 +17554,7 @@
 </file>
 
 <file path=word/commentsExtended.xml><?xml version="1.0" encoding="utf-8"?>
-<w15:commentsEx xmlns:wpc="http://schemas.microsoft.com/office/word/2010/wordprocessingCanvas" xmlns:cx="http://schemas.microsoft.com/office/drawing/2014/chartex" xmlns:cx1="http://schemas.microsoft.com/office/drawing/2015/9/8/chartex" xmlns:cx2="http://schemas.microsoft.com/office/drawing/2015/10/21/chartex" xmlns:cx3="http://schemas.microsoft.com/office/drawing/2016/5/9/chartex" xmlns:cx4="http://schemas.microsoft.com/office/drawing/2016/5/10/chartex" xmlns:cx5="http://schemas.microsoft.com/office/drawing/2016/5/11/chartex" xmlns:cx6="http://schemas.microsoft.com/office/drawing/2016/5/12/chartex" xmlns:cx7="http://schemas.microsoft.com/office/drawing/2016/5/13/chartex" xmlns:cx8="http://schemas.microsoft.com/office/drawing/2016/5/14/chartex" xmlns:mc="http://schemas.openxmlformats.org/markup-compatibility/2006" xmlns:aink="http://schemas.microsoft.com/office/drawing/2016/ink" xmlns:am3d="http://schemas.microsoft.com/office/drawing/2017/model3d" xmlns:o="urn:schemas-microsoft-com:office:office" xmlns:oel="http://schemas.microsoft.com/office/2019/extlst" xmlns:r="http://schemas.openxmlformats.org/officeDocument/2006/relationships" xmlns:m="http://schemas.openxmlformats.org/officeDocument/2006/math" xmlns:v="urn:schemas-microsoft-com:vml" xmlns:wp14="http://schemas.microsoft.com/office/word/2010/wordprocessingDrawing" xmlns:wp="http://schemas.openxmlformats.org/drawingml/2006/wordprocessingDrawing" xmlns:w10="urn:schemas-microsoft-com:office:word" xmlns:w="http://schemas.openxmlformats.org/wordprocessingml/2006/main" xmlns:w14="http://schemas.microsoft.com/office/word/2010/wordml" xmlns:w15="http://schemas.microsoft.com/office/word/2012/wordml" xmlns:w16cex="http://schemas.microsoft.com/office/word/2018/wordml/cex" xmlns:w16cid="http://schemas.microsoft.com/office/word/2016/wordml/cid" xmlns:w16="http://schemas.microsoft.com/office/word/2018/wordml" xmlns:w16du="http://schemas.microsoft.com/office/word/2023/wordml/word16du" xmlns:w16sdtdh="http://schemas.microsoft.com/office/word/2020/wordml/sdtdatahash" xmlns:w16sdtfl="http://schemas.microsoft.com/office/word/2024/wordml/sdtformatlock" xmlns:w16se="http://schemas.microsoft.com/office/word/2015/wordml/symex" xmlns:wpg="http://schemas.microsoft.com/office/word/2010/wordprocessingGroup" xmlns:wpi="http://schemas.microsoft.com/office/word/2010/wordprocessingInk" xmlns:wne="http://schemas.microsoft.com/office/word/2006/wordml" xmlns:wps="http://schemas.microsoft.com/office/word/2010/wordprocessingShape" mc:Ignorable="w14 w15 w16se w16cid w16 w16cex w16sdtdh w16sdtfl w16du wp14">
+<w15:commentsEx xmlns:wpc="http://schemas.microsoft.com/office/word/2010/wordprocessingCanvas" xmlns:cx="http://schemas.microsoft.com/office/drawing/2014/chartex" xmlns:cx1="http://schemas.microsoft.com/office/drawing/2015/9/8/chartex" xmlns:cx2="http://schemas.microsoft.com/office/drawing/2015/10/21/chartex" xmlns:cx3="http://schemas.microsoft.com/office/drawing/2016/5/9/chartex" xmlns:cx4="http://schemas.microsoft.com/office/drawing/2016/5/10/chartex" xmlns:cx5="http://schemas.microsoft.com/office/drawing/2016/5/11/chartex" xmlns:cx6="http://schemas.microsoft.com/office/drawing/2016/5/12/chartex" xmlns:cx7="http://schemas.microsoft.com/office/drawing/2016/5/13/chartex" xmlns:cx8="http://schemas.microsoft.com/office/drawing/2016/5/14/chartex" xmlns:mc="http://schemas.openxmlformats.org/markup-compatibility/2006" xmlns:m="http://schemas.openxmlformats.org/officeDocument/2006/math" xmlns:aink="http://schemas.microsoft.com/office/drawing/2016/ink" xmlns:am3d="http://schemas.microsoft.com/office/drawing/2017/model3d" xmlns:oel="http://schemas.microsoft.com/office/2019/extlst" xmlns:r="http://schemas.openxmlformats.org/officeDocument/2006/relationships" xmlns:wp14="http://schemas.microsoft.com/office/word/2010/wordprocessingDrawing" xmlns:wp="http://schemas.openxmlformats.org/drawingml/2006/wordprocessingDrawing" xmlns:wpg="http://schemas.microsoft.com/office/word/2010/wordprocessingGroup" xmlns:wpi="http://schemas.microsoft.com/office/word/2010/wordprocessingInk" xmlns:wps="http://schemas.microsoft.com/office/word/2010/wordprocessingShape" xmlns:o="urn:schemas-microsoft-com:office:office" xmlns:v="urn:schemas-microsoft-com:vml" xmlns:w10="urn:schemas-microsoft-com:office:word" xmlns:w="http://schemas.openxmlformats.org/wordprocessingml/2006/main" xmlns:w14="http://schemas.microsoft.com/office/word/2010/wordml" xmlns:w15="http://schemas.microsoft.com/office/word/2012/wordml" xmlns:w16cei="http://schemas.microsoft.com/office/word/2026/wordml/cei" xmlns:w16cex="http://schemas.microsoft.com/office/word/2018/wordml/cex" xmlns:w16cid="http://schemas.microsoft.com/office/word/2016/wordml/cid" xmlns:w16="http://schemas.microsoft.com/office/word/2018/wordml" xmlns:w16sdtdh="http://schemas.microsoft.com/office/word/2020/wordml/sdtdatahash" xmlns:w16sdtfl="http://schemas.microsoft.com/office/word/2024/wordml/sdtformatlock" xmlns:w16se="http://schemas.microsoft.com/office/word/2015/wordml/symex" xmlns:w16du="http://schemas.microsoft.com/office/word/2023/wordml/word16du" xmlns:wne="http://schemas.microsoft.com/office/word/2006/wordml" mc:Ignorable="w14 w15 w16se w16cid w16 w16cex w16sdtdh w16sdtfl w16du wp14">
   <w15:commentEx w15:paraId="42D45FEE" w15:done="0"/>
   <w15:commentEx w15:paraId="2F8F5079" w15:done="0"/>
   <w15:commentEx w15:paraId="1BF884BD" w15:done="0"/>
@@ -17493,7 +17562,7 @@
 </file>
 
 <file path=word/commentsExtensible.xml><?xml version="1.0" encoding="utf-8"?>
-<w16cex:commentsExtensible xmlns:wpc="http://schemas.microsoft.com/office/word/2010/wordprocessingCanvas" xmlns:cx="http://schemas.microsoft.com/office/drawing/2014/chartex" xmlns:cx1="http://schemas.microsoft.com/office/drawing/2015/9/8/chartex" xmlns:cx2="http://schemas.microsoft.com/office/drawing/2015/10/21/chartex" xmlns:cx3="http://schemas.microsoft.com/office/drawing/2016/5/9/chartex" xmlns:cx4="http://schemas.microsoft.com/office/drawing/2016/5/10/chartex" xmlns:cx5="http://schemas.microsoft.com/office/drawing/2016/5/11/chartex" xmlns:cx6="http://schemas.microsoft.com/office/drawing/2016/5/12/chartex" xmlns:cx7="http://schemas.microsoft.com/office/drawing/2016/5/13/chartex" xmlns:cx8="http://schemas.microsoft.com/office/drawing/2016/5/14/chartex" xmlns:cr="http://schemas.microsoft.com/office/comments/2020/reactions" xmlns:mc="http://schemas.openxmlformats.org/markup-compatibility/2006" xmlns:aink="http://schemas.microsoft.com/office/drawing/2016/ink" xmlns:am3d="http://schemas.microsoft.com/office/drawing/2017/model3d" xmlns:o="urn:schemas-microsoft-com:office:office" xmlns:oel="http://schemas.microsoft.com/office/2019/extlst" xmlns:r="http://schemas.openxmlformats.org/officeDocument/2006/relationships" xmlns:m="http://schemas.openxmlformats.org/officeDocument/2006/math" xmlns:v="urn:schemas-microsoft-com:vml" xmlns:wp14="http://schemas.microsoft.com/office/word/2010/wordprocessingDrawing" xmlns:wp="http://schemas.openxmlformats.org/drawingml/2006/wordprocessingDrawing" xmlns:w10="urn:schemas-microsoft-com:office:word" xmlns:w="http://schemas.openxmlformats.org/wordprocessingml/2006/main" xmlns:w14="http://schemas.microsoft.com/office/word/2010/wordml" xmlns:w15="http://schemas.microsoft.com/office/word/2012/wordml" xmlns:w16cex="http://schemas.microsoft.com/office/word/2018/wordml/cex" xmlns:w16cid="http://schemas.microsoft.com/office/word/2016/wordml/cid" xmlns:w16="http://schemas.microsoft.com/office/word/2018/wordml" xmlns:w16du="http://schemas.microsoft.com/office/word/2023/wordml/word16du" xmlns:w16sdtdh="http://schemas.microsoft.com/office/word/2020/wordml/sdtdatahash" xmlns:w16sdtfl="http://schemas.microsoft.com/office/word/2024/wordml/sdtformatlock" xmlns:w16se="http://schemas.microsoft.com/office/word/2015/wordml/symex" xmlns:wpg="http://schemas.microsoft.com/office/word/2010/wordprocessingGroup" xmlns:wpi="http://schemas.microsoft.com/office/word/2010/wordprocessingInk" xmlns:wne="http://schemas.microsoft.com/office/word/2006/wordml" xmlns:wps="http://schemas.microsoft.com/office/word/2010/wordprocessingShape" mc:Ignorable="w14 w15 w16se w16cid w16 w16cex w16sdtdh w16sdtfl cr w16du wp14">
+<w16cex:commentsExtensible xmlns:wpc="http://schemas.microsoft.com/office/word/2010/wordprocessingCanvas" xmlns:cx="http://schemas.microsoft.com/office/drawing/2014/chartex" xmlns:cx1="http://schemas.microsoft.com/office/drawing/2015/9/8/chartex" xmlns:cx2="http://schemas.microsoft.com/office/drawing/2015/10/21/chartex" xmlns:cx3="http://schemas.microsoft.com/office/drawing/2016/5/9/chartex" xmlns:cx4="http://schemas.microsoft.com/office/drawing/2016/5/10/chartex" xmlns:cx5="http://schemas.microsoft.com/office/drawing/2016/5/11/chartex" xmlns:cx6="http://schemas.microsoft.com/office/drawing/2016/5/12/chartex" xmlns:cx7="http://schemas.microsoft.com/office/drawing/2016/5/13/chartex" xmlns:cx8="http://schemas.microsoft.com/office/drawing/2016/5/14/chartex" xmlns:cr="http://schemas.microsoft.com/office/comments/2020/reactions" xmlns:mc="http://schemas.openxmlformats.org/markup-compatibility/2006" xmlns:m="http://schemas.openxmlformats.org/officeDocument/2006/math" xmlns:aink="http://schemas.microsoft.com/office/drawing/2016/ink" xmlns:am3d="http://schemas.microsoft.com/office/drawing/2017/model3d" xmlns:oel="http://schemas.microsoft.com/office/2019/extlst" xmlns:r="http://schemas.openxmlformats.org/officeDocument/2006/relationships" xmlns:wp14="http://schemas.microsoft.com/office/word/2010/wordprocessingDrawing" xmlns:wp="http://schemas.openxmlformats.org/drawingml/2006/wordprocessingDrawing" xmlns:wpg="http://schemas.microsoft.com/office/word/2010/wordprocessingGroup" xmlns:wpi="http://schemas.microsoft.com/office/word/2010/wordprocessingInk" xmlns:wps="http://schemas.microsoft.com/office/word/2010/wordprocessingShape" xmlns:o="urn:schemas-microsoft-com:office:office" xmlns:v="urn:schemas-microsoft-com:vml" xmlns:w10="urn:schemas-microsoft-com:office:word" xmlns:w="http://schemas.openxmlformats.org/wordprocessingml/2006/main" xmlns:w14="http://schemas.microsoft.com/office/word/2010/wordml" xmlns:w15="http://schemas.microsoft.com/office/word/2012/wordml" xmlns:w16cei="http://schemas.microsoft.com/office/word/2026/wordml/cei" xmlns:w16cex="http://schemas.microsoft.com/office/word/2018/wordml/cex" xmlns:w16cid="http://schemas.microsoft.com/office/word/2016/wordml/cid" xmlns:w16="http://schemas.microsoft.com/office/word/2018/wordml" xmlns:w16sdtdh="http://schemas.microsoft.com/office/word/2020/wordml/sdtdatahash" xmlns:w16sdtfl="http://schemas.microsoft.com/office/word/2024/wordml/sdtformatlock" xmlns:w16se="http://schemas.microsoft.com/office/word/2015/wordml/symex" xmlns:w16du="http://schemas.microsoft.com/office/word/2023/wordml/word16du" xmlns:wne="http://schemas.microsoft.com/office/word/2006/wordml" mc:Ignorable="w14 w15 w16se w16cid w16 w16cex w16sdtdh w16sdtfl cr w16du wp14">
   <w16cex:commentExtensible w16cex:durableId="61A4A495" w16cex:dateUtc="2025-04-07T18:53:00Z"/>
   <w16cex:commentExtensible w16cex:durableId="1CF63AD1" w16cex:dateUtc="2026-06-15T19:53:00Z"/>
   <w16cex:commentExtensible w16cex:durableId="0918C9D9" w16cex:dateUtc="2025-07-30T20:03:00Z"/>
@@ -17501,7 +17570,7 @@
 </file>
 
 <file path=word/commentsIds.xml><?xml version="1.0" encoding="utf-8"?>
-<w16cid:commentsIds xmlns:wpc="http://schemas.microsoft.com/office/word/2010/wordprocessingCanvas" xmlns:cx="http://schemas.microsoft.com/office/drawing/2014/chartex" xmlns:cx1="http://schemas.microsoft.com/office/drawing/2015/9/8/chartex" xmlns:cx2="http://schemas.microsoft.com/office/drawing/2015/10/21/chartex" xmlns:cx3="http://schemas.microsoft.com/office/drawing/2016/5/9/chartex" xmlns:cx4="http://schemas.microsoft.com/office/drawing/2016/5/10/chartex" xmlns:cx5="http://schemas.microsoft.com/office/drawing/2016/5/11/chartex" xmlns:cx6="http://schemas.microsoft.com/office/drawing/2016/5/12/chartex" xmlns:cx7="http://schemas.microsoft.com/office/drawing/2016/5/13/chartex" xmlns:cx8="http://schemas.microsoft.com/office/drawing/2016/5/14/chartex" xmlns:mc="http://schemas.openxmlformats.org/markup-compatibility/2006" xmlns:aink="http://schemas.microsoft.com/office/drawing/2016/ink" xmlns:am3d="http://schemas.microsoft.com/office/drawing/2017/model3d" xmlns:o="urn:schemas-microsoft-com:office:office" xmlns:oel="http://schemas.microsoft.com/office/2019/extlst" xmlns:r="http://schemas.openxmlformats.org/officeDocument/2006/relationships" xmlns:m="http://schemas.openxmlformats.org/officeDocument/2006/math" xmlns:v="urn:schemas-microsoft-com:vml" xmlns:wp14="http://schemas.microsoft.com/office/word/2010/wordprocessingDrawing" xmlns:wp="http://schemas.openxmlformats.org/drawingml/2006/wordprocessingDrawing" xmlns:w10="urn:schemas-microsoft-com:office:word" xmlns:w="http://schemas.openxmlformats.org/wordprocessingml/2006/main" xmlns:w14="http://schemas.microsoft.com/office/word/2010/wordml" xmlns:w15="http://schemas.microsoft.com/office/word/2012/wordml" xmlns:w16cex="http://schemas.microsoft.com/office/word/2018/wordml/cex" xmlns:w16cid="http://schemas.microsoft.com/office/word/2016/wordml/cid" xmlns:w16="http://schemas.microsoft.com/office/word/2018/wordml" xmlns:w16du="http://schemas.microsoft.com/office/word/2023/wordml/word16du" xmlns:w16sdtdh="http://schemas.microsoft.com/office/word/2020/wordml/sdtdatahash" xmlns:w16sdtfl="http://schemas.microsoft.com/office/word/2024/wordml/sdtformatlock" xmlns:w16se="http://schemas.microsoft.com/office/word/2015/wordml/symex" xmlns:wpg="http://schemas.microsoft.com/office/word/2010/wordprocessingGroup" xmlns:wpi="http://schemas.microsoft.com/office/word/2010/wordprocessingInk" xmlns:wne="http://schemas.microsoft.com/office/word/2006/wordml" xmlns:wps="http://schemas.microsoft.com/office/word/2010/wordprocessingShape" mc:Ignorable="w14 w15 w16se w16cid w16 w16cex w16sdtdh w16sdtfl w16du wp14">
+<w16cid:commentsIds xmlns:wpc="http://schemas.microsoft.com/office/word/2010/wordprocessingCanvas" xmlns:cx="http://schemas.microsoft.com/office/drawing/2014/chartex" xmlns:cx1="http://schemas.microsoft.com/office/drawing/2015/9/8/chartex" xmlns:cx2="http://schemas.microsoft.com/office/drawing/2015/10/21/chartex" xmlns:cx3="http://schemas.microsoft.com/office/drawing/2016/5/9/chartex" xmlns:cx4="http://schemas.microsoft.com/office/drawing/2016/5/10/chartex" xmlns:cx5="http://schemas.microsoft.com/office/drawing/2016/5/11/chartex" xmlns:cx6="http://schemas.microsoft.com/office/drawing/2016/5/12/chartex" xmlns:cx7="http://schemas.microsoft.com/office/drawing/2016/5/13/chartex" xmlns:cx8="http://schemas.microsoft.com/office/drawing/2016/5/14/chartex" xmlns:mc="http://schemas.openxmlformats.org/markup-compatibility/2006" xmlns:m="http://schemas.openxmlformats.org/officeDocument/2006/math" xmlns:aink="http://schemas.microsoft.com/office/drawing/2016/ink" xmlns:am3d="http://schemas.microsoft.com/office/drawing/2017/model3d" xmlns:oel="http://schemas.microsoft.com/office/2019/extlst" xmlns:r="http://schemas.openxmlformats.org/officeDocument/2006/relationships" xmlns:wp14="http://schemas.microsoft.com/office/word/2010/wordprocessingDrawing" xmlns:wp="http://schemas.openxmlformats.org/drawingml/2006/wordprocessingDrawing" xmlns:wpg="http://schemas.microsoft.com/office/word/2010/wordprocessingGroup" xmlns:wpi="http://schemas.microsoft.com/office/word/2010/wordprocessingInk" xmlns:wps="http://schemas.microsoft.com/office/word/2010/wordprocessingShape" xmlns:o="urn:schemas-microsoft-com:office:office" xmlns:v="urn:schemas-microsoft-com:vml" xmlns:w10="urn:schemas-microsoft-com:office:word" xmlns:w="http://schemas.openxmlformats.org/wordprocessingml/2006/main" xmlns:w14="http://schemas.microsoft.com/office/word/2010/wordml" xmlns:w15="http://schemas.microsoft.com/office/word/2012/wordml" xmlns:w16cei="http://schemas.microsoft.com/office/word/2026/wordml/cei" xmlns:w16cex="http://schemas.microsoft.com/office/word/2018/wordml/cex" xmlns:w16cid="http://schemas.microsoft.com/office/word/2016/wordml/cid" xmlns:w16="http://schemas.microsoft.com/office/word/2018/wordml" xmlns:w16sdtdh="http://schemas.microsoft.com/office/word/2020/wordml/sdtdatahash" xmlns:w16sdtfl="http://schemas.microsoft.com/office/word/2024/wordml/sdtformatlock" xmlns:w16se="http://schemas.microsoft.com/office/word/2015/wordml/symex" xmlns:w16du="http://schemas.microsoft.com/office/word/2023/wordml/word16du" xmlns:wne="http://schemas.microsoft.com/office/word/2006/wordml" mc:Ignorable="w14 w15 w16se w16cid w16 w16cex w16sdtdh w16sdtfl w16du wp14">
   <w16cid:commentId w16cid:paraId="42D45FEE" w16cid:durableId="61A4A495"/>
   <w16cid:commentId w16cid:paraId="2F8F5079" w16cid:durableId="1CF63AD1"/>
   <w16cid:commentId w16cid:paraId="1BF884BD" w16cid:durableId="0918C9D9"/>
@@ -17509,7 +17578,7 @@
 </file>
 
 <file path=word/numbering.xml><?xml version="1.0" encoding="utf-8"?>
-<w:numbering xmlns:wpc="http://schemas.microsoft.com/office/word/2010/wordprocessingCanvas" xmlns:cx="http://schemas.microsoft.com/office/drawing/2014/chartex" xmlns:cx1="http://schemas.microsoft.com/office/drawing/2015/9/8/chartex" xmlns:cx2="http://schemas.microsoft.com/office/drawing/2015/10/21/chartex" xmlns:cx3="http://schemas.microsoft.com/office/drawing/2016/5/9/chartex" xmlns:cx4="http://schemas.microsoft.com/office/drawing/2016/5/10/chartex" xmlns:cx5="http://schemas.microsoft.com/office/drawing/2016/5/11/chartex" xmlns:cx6="http://schemas.microsoft.com/office/drawing/2016/5/12/chartex" xmlns:cx7="http://schemas.microsoft.com/office/drawing/2016/5/13/chartex" xmlns:cx8="http://schemas.microsoft.com/office/drawing/2016/5/14/chartex" xmlns:mc="http://schemas.openxmlformats.org/markup-compatibility/2006" xmlns:aink="http://schemas.microsoft.com/office/drawing/2016/ink" xmlns:am3d="http://schemas.microsoft.com/office/drawing/2017/model3d" xmlns:o="urn:schemas-microsoft-com:office:office" xmlns:oel="http://schemas.microsoft.com/office/2019/extlst" xmlns:r="http://schemas.openxmlformats.org/officeDocument/2006/relationships" xmlns:m="http://schemas.openxmlformats.org/officeDocument/2006/math" xmlns:v="urn:schemas-microsoft-com:vml" xmlns:wp14="http://schemas.microsoft.com/office/word/2010/wordprocessingDrawing" xmlns:wp="http://schemas.openxmlformats.org/drawingml/2006/wordprocessingDrawing" xmlns:w10="urn:schemas-microsoft-com:office:word" xmlns:w="http://schemas.openxmlformats.org/wordprocessingml/2006/main" xmlns:w14="http://schemas.microsoft.com/office/word/2010/wordml" xmlns:w15="http://schemas.microsoft.com/office/word/2012/wordml" xmlns:w16cex="http://schemas.microsoft.com/office/word/2018/wordml/cex" xmlns:w16cid="http://schemas.microsoft.com/office/word/2016/wordml/cid" xmlns:w16="http://schemas.microsoft.com/office/word/2018/wordml" xmlns:w16du="http://schemas.microsoft.com/office/word/2023/wordml/word16du" xmlns:w16sdtdh="http://schemas.microsoft.com/office/word/2020/wordml/sdtdatahash" xmlns:w16sdtfl="http://schemas.microsoft.com/office/word/2024/wordml/sdtformatlock" xmlns:w16se="http://schemas.microsoft.com/office/word/2015/wordml/symex" xmlns:wpg="http://schemas.microsoft.com/office/word/2010/wordprocessingGroup" xmlns:wpi="http://schemas.microsoft.com/office/word/2010/wordprocessingInk" xmlns:wne="http://schemas.microsoft.com/office/word/2006/wordml" xmlns:wps="http://schemas.microsoft.com/office/word/2010/wordprocessingShape" mc:Ignorable="w14 w15 w16se w16cid w16 w16cex w16sdtdh w16sdtfl w16du wp14">
+<w:numbering xmlns:wpc="http://schemas.microsoft.com/office/word/2010/wordprocessingCanvas" xmlns:cx="http://schemas.microsoft.com/office/drawing/2014/chartex" xmlns:cx1="http://schemas.microsoft.com/office/drawing/2015/9/8/chartex" xmlns:cx2="http://schemas.microsoft.com/office/drawing/2015/10/21/chartex" xmlns:cx3="http://schemas.microsoft.com/office/drawing/2016/5/9/chartex" xmlns:cx4="http://schemas.microsoft.com/office/drawing/2016/5/10/chartex" xmlns:cx5="http://schemas.microsoft.com/office/drawing/2016/5/11/chartex" xmlns:cx6="http://schemas.microsoft.com/office/drawing/2016/5/12/chartex" xmlns:cx7="http://schemas.microsoft.com/office/drawing/2016/5/13/chartex" xmlns:cx8="http://schemas.microsoft.com/office/drawing/2016/5/14/chartex" xmlns:mc="http://schemas.openxmlformats.org/markup-compatibility/2006" xmlns:m="http://schemas.openxmlformats.org/officeDocument/2006/math" xmlns:aink="http://schemas.microsoft.com/office/drawing/2016/ink" xmlns:am3d="http://schemas.microsoft.com/office/drawing/2017/model3d" xmlns:oel="http://schemas.microsoft.com/office/2019/extlst" xmlns:r="http://schemas.openxmlformats.org/officeDocument/2006/relationships" xmlns:wp14="http://schemas.microsoft.com/office/word/2010/wordprocessingDrawing" xmlns:wp="http://schemas.openxmlformats.org/drawingml/2006/wordprocessingDrawing" xmlns:wpg="http://schemas.microsoft.com/office/word/2010/wordprocessingGroup" xmlns:wpi="http://schemas.microsoft.com/office/word/2010/wordprocessingInk" xmlns:wps="http://schemas.microsoft.com/office/word/2010/wordprocessingShape" xmlns:o="urn:schemas-microsoft-com:office:office" xmlns:v="urn:schemas-microsoft-com:vml" xmlns:w10="urn:schemas-microsoft-com:office:word" xmlns:w="http://schemas.openxmlformats.org/wordprocessingml/2006/main" xmlns:w14="http://schemas.microsoft.com/office/word/2010/wordml" xmlns:w15="http://schemas.microsoft.com/office/word/2012/wordml" xmlns:w16cei="http://schemas.microsoft.com/office/word/2026/wordml/cei" xmlns:w16cex="http://schemas.microsoft.com/office/word/2018/wordml/cex" xmlns:w16cid="http://schemas.microsoft.com/office/word/2016/wordml/cid" xmlns:w16="http://schemas.microsoft.com/office/word/2018/wordml" xmlns:w16sdtdh="http://schemas.microsoft.com/office/word/2020/wordml/sdtdatahash" xmlns:w16sdtfl="http://schemas.microsoft.com/office/word/2024/wordml/sdtformatlock" xmlns:w16se="http://schemas.microsoft.com/office/word/2015/wordml/symex" xmlns:w16du="http://schemas.microsoft.com/office/word/2023/wordml/word16du" xmlns:wne="http://schemas.microsoft.com/office/word/2006/wordml" mc:Ignorable="w14 w15 w16se w16cid w16 w16cex w16sdtdh w16sdtfl w16du wp14">
   <w:abstractNum w:abstractNumId="0" w15:restartNumberingAfterBreak="0">
     <w:nsid w:val="017E69C7"/>
     <w:multiLevelType w:val="hybridMultilevel"/>
@@ -18784,7 +18853,7 @@
 </file>
 
 <file path=word/people.xml><?xml version="1.0" encoding="utf-8"?>
-<w15:people xmlns:wpc="http://schemas.microsoft.com/office/word/2010/wordprocessingCanvas" xmlns:cx="http://schemas.microsoft.com/office/drawing/2014/chartex" xmlns:cx1="http://schemas.microsoft.com/office/drawing/2015/9/8/chartex" xmlns:cx2="http://schemas.microsoft.com/office/drawing/2015/10/21/chartex" xmlns:cx3="http://schemas.microsoft.com/office/drawing/2016/5/9/chartex" xmlns:cx4="http://schemas.microsoft.com/office/drawing/2016/5/10/chartex" xmlns:cx5="http://schemas.microsoft.com/office/drawing/2016/5/11/chartex" xmlns:cx6="http://schemas.microsoft.com/office/drawing/2016/5/12/chartex" xmlns:cx7="http://schemas.microsoft.com/office/drawing/2016/5/13/chartex" xmlns:cx8="http://schemas.microsoft.com/office/drawing/2016/5/14/chartex" xmlns:mc="http://schemas.openxmlformats.org/markup-compatibility/2006" xmlns:aink="http://schemas.microsoft.com/office/drawing/2016/ink" xmlns:am3d="http://schemas.microsoft.com/office/drawing/2017/model3d" xmlns:o="urn:schemas-microsoft-com:office:office" xmlns:oel="http://schemas.microsoft.com/office/2019/extlst" xmlns:r="http://schemas.openxmlformats.org/officeDocument/2006/relationships" xmlns:m="http://schemas.openxmlformats.org/officeDocument/2006/math" xmlns:v="urn:schemas-microsoft-com:vml" xmlns:wp14="http://schemas.microsoft.com/office/word/2010/wordprocessingDrawing" xmlns:wp="http://schemas.openxmlformats.org/drawingml/2006/wordprocessingDrawing" xmlns:w10="urn:schemas-microsoft-com:office:word" xmlns:w="http://schemas.openxmlformats.org/wordprocessingml/2006/main" xmlns:w14="http://schemas.microsoft.com/office/word/2010/wordml" xmlns:w15="http://schemas.microsoft.com/office/word/2012/wordml" xmlns:w16cex="http://schemas.microsoft.com/office/word/2018/wordml/cex" xmlns:w16cid="http://schemas.microsoft.com/office/word/2016/wordml/cid" xmlns:w16="http://schemas.microsoft.com/office/word/2018/wordml" xmlns:w16du="http://schemas.microsoft.com/office/word/2023/wordml/word16du" xmlns:w16sdtdh="http://schemas.microsoft.com/office/word/2020/wordml/sdtdatahash" xmlns:w16sdtfl="http://schemas.microsoft.com/office/word/2024/wordml/sdtformatlock" xmlns:w16se="http://schemas.microsoft.com/office/word/2015/wordml/symex" xmlns:wpg="http://schemas.microsoft.com/office/word/2010/wordprocessingGroup" xmlns:wpi="http://schemas.microsoft.com/office/word/2010/wordprocessingInk" xmlns:wne="http://schemas.microsoft.com/office/word/2006/wordml" xmlns:wps="http://schemas.microsoft.com/office/word/2010/wordprocessingShape" mc:Ignorable="w14 w15 w16se w16cid w16 w16cex w16sdtdh w16sdtfl w16du wp14">
+<w15:people xmlns:wpc="http://schemas.microsoft.com/office/word/2010/wordprocessingCanvas" xmlns:cx="http://schemas.microsoft.com/office/drawing/2014/chartex" xmlns:cx1="http://schemas.microsoft.com/office/drawing/2015/9/8/chartex" xmlns:cx2="http://schemas.microsoft.com/office/drawing/2015/10/21/chartex" xmlns:cx3="http://schemas.microsoft.com/office/drawing/2016/5/9/chartex" xmlns:cx4="http://schemas.microsoft.com/office/drawing/2016/5/10/chartex" xmlns:cx5="http://schemas.microsoft.com/office/drawing/2016/5/11/chartex" xmlns:cx6="http://schemas.microsoft.com/office/drawing/2016/5/12/chartex" xmlns:cx7="http://schemas.microsoft.com/office/drawing/2016/5/13/chartex" xmlns:cx8="http://schemas.microsoft.com/office/drawing/2016/5/14/chartex" xmlns:mc="http://schemas.openxmlformats.org/markup-compatibility/2006" xmlns:m="http://schemas.openxmlformats.org/officeDocument/2006/math" xmlns:aink="http://schemas.microsoft.com/office/drawing/2016/ink" xmlns:am3d="http://schemas.microsoft.com/office/drawing/2017/model3d" xmlns:oel="http://schemas.microsoft.com/office/2019/extlst" xmlns:r="http://schemas.openxmlformats.org/officeDocument/2006/relationships" xmlns:wp14="http://schemas.microsoft.com/office/word/2010/wordprocessingDrawing" xmlns:wp="http://schemas.openxmlformats.org/drawingml/2006/wordprocessingDrawing" xmlns:wpg="http://schemas.microsoft.com/office/word/2010/wordprocessingGroup" xmlns:wpi="http://schemas.microsoft.com/office/word/2010/wordprocessingInk" xmlns:wps="http://schemas.microsoft.com/office/word/2010/wordprocessingShape" xmlns:o="urn:schemas-microsoft-com:office:office" xmlns:v="urn:schemas-microsoft-com:vml" xmlns:w10="urn:schemas-microsoft-com:office:word" xmlns:w="http://schemas.openxmlformats.org/wordprocessingml/2006/main" xmlns:w14="http://schemas.microsoft.com/office/word/2010/wordml" xmlns:w15="http://schemas.microsoft.com/office/word/2012/wordml" xmlns:w16cei="http://schemas.microsoft.com/office/word/2026/wordml/cei" xmlns:w16cex="http://schemas.microsoft.com/office/word/2018/wordml/cex" xmlns:w16cid="http://schemas.microsoft.com/office/word/2016/wordml/cid" xmlns:w16="http://schemas.microsoft.com/office/word/2018/wordml" xmlns:w16sdtdh="http://schemas.microsoft.com/office/word/2020/wordml/sdtdatahash" xmlns:w16sdtfl="http://schemas.microsoft.com/office/word/2024/wordml/sdtformatlock" xmlns:w16se="http://schemas.microsoft.com/office/word/2015/wordml/symex" xmlns:w16du="http://schemas.microsoft.com/office/word/2023/wordml/word16du" xmlns:wne="http://schemas.microsoft.com/office/word/2006/wordml" mc:Ignorable="w14 w15 w16se w16cid w16 w16cex w16sdtdh w16sdtfl w16du wp14">
   <w15:person w15:author="Braden Limb">
     <w15:presenceInfo w15:providerId="Windows Live" w15:userId="e37597ec4f9891ff"/>
   </w15:person>
@@ -18792,7 +18861,7 @@
 </file>
 
 <file path=word/styles.xml><?xml version="1.0" encoding="utf-8"?>
-<w:styles xmlns:mc="http://schemas.openxmlformats.org/markup-compatibility/2006" xmlns:r="http://schemas.openxmlformats.org/officeDocument/2006/relationships" xmlns:w="http://schemas.openxmlformats.org/wordprocessingml/2006/main" xmlns:w14="http://schemas.microsoft.com/office/word/2010/wordml" xmlns:w15="http://schemas.microsoft.com/office/word/2012/wordml" xmlns:w16cex="http://schemas.microsoft.com/office/word/2018/wordml/cex" xmlns:w16cid="http://schemas.microsoft.com/office/word/2016/wordml/cid" xmlns:w16="http://schemas.microsoft.com/office/word/2018/wordml" xmlns:w16du="http://schemas.microsoft.com/office/word/2023/wordml/word16du" xmlns:w16sdtdh="http://schemas.microsoft.com/office/word/2020/wordml/sdtdatahash" xmlns:w16sdtfl="http://schemas.microsoft.com/office/word/2024/wordml/sdtformatlock" xmlns:w16se="http://schemas.microsoft.com/office/word/2015/wordml/symex" mc:Ignorable="w14 w15 w16se w16cid w16 w16cex w16sdtdh w16sdtfl w16du">
+<w:styles xmlns:mc="http://schemas.openxmlformats.org/markup-compatibility/2006" xmlns:r="http://schemas.openxmlformats.org/officeDocument/2006/relationships" xmlns:w="http://schemas.openxmlformats.org/wordprocessingml/2006/main" xmlns:w14="http://schemas.microsoft.com/office/word/2010/wordml" xmlns:w15="http://schemas.microsoft.com/office/word/2012/wordml" xmlns:w16cex="http://schemas.microsoft.com/office/word/2018/wordml/cex" xmlns:w16cid="http://schemas.microsoft.com/office/word/2016/wordml/cid" xmlns:w16="http://schemas.microsoft.com/office/word/2018/wordml" xmlns:w16sdtdh="http://schemas.microsoft.com/office/word/2020/wordml/sdtdatahash" xmlns:w16sdtfl="http://schemas.microsoft.com/office/word/2024/wordml/sdtformatlock" xmlns:w16se="http://schemas.microsoft.com/office/word/2015/wordml/symex" xmlns:w16du="http://schemas.microsoft.com/office/word/2023/wordml/word16du" mc:Ignorable="w14 w15 w16se w16cid w16 w16cex w16sdtdh w16sdtfl w16du">
   <w:docDefaults>
     <w:rPrDefault>
       <w:rPr>
@@ -19185,7 +19254,7 @@
   <w:style w:type="paragraph" w:default="1" w:styleId="Normal">
     <w:name w:val="Normal"/>
     <w:qFormat/>
-    <w:rsid w:val="00992883"/>
+    <w:rsid w:val="005802FB"/>
     <w:pPr>
       <w:spacing w:after="160" w:line="278" w:lineRule="auto"/>
     </w:pPr>
@@ -19199,7 +19268,7 @@
     <w:uiPriority w:val="1"/>
     <w:semiHidden/>
     <w:unhideWhenUsed/>
-    <w:rsid w:val="00992883"/>
+    <w:rsid w:val="005802FB"/>
   </w:style>
   <w:style w:type="table" w:default="1" w:styleId="TableNormal">
     <w:name w:val="Normal Table"/>
@@ -19221,7 +19290,7 @@
     <w:uiPriority w:val="99"/>
     <w:semiHidden/>
     <w:unhideWhenUsed/>
-    <w:rsid w:val="00992883"/>
+    <w:rsid w:val="005802FB"/>
   </w:style>
   <w:style w:type="character" w:styleId="Hyperlink">
     <w:name w:val="Hyperlink"/>

</xml_diff>